<commit_message>
Sync remaining experiment updates
</commit_message>
<xml_diff>
--- a/EXP3/EXP3 (Data Exploration).docx
+++ b/EXP3/EXP3 (Data Exploration).docx
@@ -6,43 +6,1879 @@
       <w:pPr>
         <w:jc w:val="center"/>
         <w:rPr>
+          <w:rFonts w:asciiTheme="majorBidi" w:hAnsiTheme="majorBidi" w:cstheme="majorBidi"/>
           <w:b/>
           <w:bCs/>
-          <w:u w:val="single"/>
-        </w:rPr>
-      </w:pPr>
-      <w:r>
-        <w:rPr>
+        </w:rPr>
+      </w:pPr>
+      <w:r>
+        <w:rPr>
+          <w:rFonts w:asciiTheme="majorBidi" w:hAnsiTheme="majorBidi" w:cstheme="majorBidi"/>
           <w:b/>
           <w:bCs/>
-          <w:sz w:val="36"/>
-          <w:szCs w:val="36"/>
-          <w:u w:val="single"/>
-        </w:rPr>
-        <w:t>Experiment no. 3</w:t>
-      </w:r>
-    </w:p>
-    <w:p>
-      <w:r>
-        <w:rPr>
+          <w:sz w:val="32"/>
+          <w:szCs w:val="32"/>
+        </w:rPr>
+        <w:t>Experiment 3 — Correlation Analysis (Pearson Coefficient)</w:t>
+      </w:r>
+    </w:p>
+    <w:p>
+      <w:pPr>
+        <w:spacing w:line="240" w:lineRule="auto"/>
+        <w:rPr>
+          <w:rFonts w:asciiTheme="majorBidi" w:hAnsiTheme="majorBidi" w:cstheme="majorBidi"/>
           <w:b/>
           <w:bCs/>
         </w:rPr>
-        <w:t>All Operations Completed:</w:t>
-      </w:r>
-    </w:p>
-    <w:p>
-      <w:r>
-        <w:rPr>
-          <w:rFonts w:ascii="Segoe UI Emoji" w:hAnsi="Segoe UI Emoji" w:cs="Segoe UI Emoji"/>
-        </w:rPr>
-        <w:t>✅</w:t>
-      </w:r>
-      <w:r>
-        <w:t> </w:t>
-      </w:r>
-      <w:r>
-        <w:rPr>
+      </w:pPr>
+    </w:p>
+    <w:p>
+      <w:pPr>
+        <w:spacing w:line="240" w:lineRule="auto"/>
+        <w:rPr>
+          <w:rFonts w:asciiTheme="majorBidi" w:hAnsiTheme="majorBidi" w:cstheme="majorBidi"/>
+          <w:b/>
+          <w:bCs/>
+        </w:rPr>
+      </w:pPr>
+      <w:r>
+        <w:rPr>
+          <w:rFonts w:asciiTheme="majorBidi" w:hAnsiTheme="majorBidi" w:cstheme="majorBidi"/>
+          <w:b/>
+          <w:bCs/>
+        </w:rPr>
+        <w:t xml:space="preserve">Name : Prem Vijay Hanchate </w:t>
+      </w:r>
+      <w:r>
+        <w:rPr>
+          <w:rFonts w:asciiTheme="majorBidi" w:hAnsiTheme="majorBidi" w:cstheme="majorBidi"/>
+          <w:b/>
+          <w:bCs/>
+        </w:rPr>
+        <w:br/>
+        <w:t>Roll no : 68    Class : TE/IT</w:t>
+      </w:r>
+    </w:p>
+    <w:p>
+      <w:pPr>
+        <w:rPr>
+          <w:rFonts w:asciiTheme="majorBidi" w:hAnsiTheme="majorBidi" w:cstheme="majorBidi"/>
+          <w:b/>
+          <w:bCs/>
+        </w:rPr>
+      </w:pPr>
+    </w:p>
+    <w:p>
+      <w:pPr>
+        <w:rPr>
+          <w:rFonts w:asciiTheme="majorBidi" w:hAnsiTheme="majorBidi" w:cstheme="majorBidi"/>
+          <w:b/>
+          <w:bCs/>
+        </w:rPr>
+      </w:pPr>
+      <w:r>
+        <w:rPr>
+          <w:rFonts w:asciiTheme="majorBidi" w:hAnsiTheme="majorBidi" w:cstheme="majorBidi"/>
+          <w:b/>
+          <w:bCs/>
+        </w:rPr>
+        <w:t>Aim</w:t>
+      </w:r>
+    </w:p>
+    <w:p>
+      <w:pPr>
+        <w:rPr>
+          <w:rFonts w:asciiTheme="majorBidi" w:hAnsiTheme="majorBidi" w:cstheme="majorBidi"/>
+        </w:rPr>
+      </w:pPr>
+      <w:r>
+        <w:rPr>
+          <w:rFonts w:asciiTheme="majorBidi" w:hAnsiTheme="majorBidi" w:cstheme="majorBidi"/>
+        </w:rPr>
+        <w:t>To perform data wrangling and preprocessing operations on the Aadhar Enrollment dataset using the Pandas library, including handling missing values, removing duplicates, replacing values, applying custom functions, sorting, pivoting, and grouping, in order to prepare the dataset for further analysis.</w:t>
+      </w:r>
+    </w:p>
+    <w:p>
+      <w:pPr>
+        <w:rPr>
+          <w:rFonts w:asciiTheme="majorBidi" w:hAnsiTheme="majorBidi" w:cstheme="majorBidi"/>
+        </w:rPr>
+      </w:pPr>
+      <w:r>
+        <w:rPr>
+          <w:rFonts w:asciiTheme="majorBidi" w:hAnsiTheme="majorBidi" w:cstheme="majorBidi"/>
+        </w:rPr>
+        <w:pict w14:anchorId="176F532F">
+          <v:rect id="_x0000_i1025" style="width:0;height:1.5pt" o:hralign="center" o:hrstd="t" o:hr="t" fillcolor="#a0a0a0" stroked="f"/>
+        </w:pict>
+      </w:r>
+    </w:p>
+    <w:p>
+      <w:pPr>
+        <w:rPr>
+          <w:rFonts w:asciiTheme="majorBidi" w:hAnsiTheme="majorBidi" w:cstheme="majorBidi"/>
+          <w:b/>
+          <w:bCs/>
+        </w:rPr>
+      </w:pPr>
+      <w:r>
+        <w:rPr>
+          <w:rFonts w:asciiTheme="majorBidi" w:hAnsiTheme="majorBidi" w:cstheme="majorBidi"/>
+          <w:b/>
+          <w:bCs/>
+        </w:rPr>
+        <w:t>Theory</w:t>
+      </w:r>
+    </w:p>
+    <w:p>
+      <w:pPr>
+        <w:rPr>
+          <w:rFonts w:asciiTheme="majorBidi" w:hAnsiTheme="majorBidi" w:cstheme="majorBidi"/>
+        </w:rPr>
+      </w:pPr>
+      <w:r>
+        <w:rPr>
+          <w:rFonts w:asciiTheme="majorBidi" w:hAnsiTheme="majorBidi" w:cstheme="majorBidi"/>
+          <w:b/>
+          <w:bCs/>
+        </w:rPr>
+        <w:t xml:space="preserve">1. Pandas and </w:t>
+      </w:r>
+      <w:proofErr w:type="spellStart"/>
+      <w:r>
+        <w:rPr>
+          <w:rFonts w:asciiTheme="majorBidi" w:hAnsiTheme="majorBidi" w:cstheme="majorBidi"/>
+          <w:b/>
+          <w:bCs/>
+        </w:rPr>
+        <w:t>DataFrames</w:t>
+      </w:r>
+      <w:proofErr w:type="spellEnd"/>
+      <w:r>
+        <w:rPr>
+          <w:rFonts w:asciiTheme="majorBidi" w:hAnsiTheme="majorBidi" w:cstheme="majorBidi"/>
+          <w:b/>
+          <w:bCs/>
+        </w:rPr>
+        <w:t>:</w:t>
+      </w:r>
+      <w:r>
+        <w:rPr>
+          <w:rFonts w:asciiTheme="majorBidi" w:hAnsiTheme="majorBidi" w:cstheme="majorBidi"/>
+        </w:rPr>
+        <w:t xml:space="preserve"> Pandas is an open-source Python library built on top of NumPy, designed for data manipulation and analysis. Its primary data structure, the </w:t>
+      </w:r>
+      <w:proofErr w:type="spellStart"/>
+      <w:r>
+        <w:rPr>
+          <w:rFonts w:asciiTheme="majorBidi" w:hAnsiTheme="majorBidi" w:cstheme="majorBidi"/>
+        </w:rPr>
+        <w:t>DataFrame</w:t>
+      </w:r>
+      <w:proofErr w:type="spellEnd"/>
+      <w:r>
+        <w:rPr>
+          <w:rFonts w:asciiTheme="majorBidi" w:hAnsiTheme="majorBidi" w:cstheme="majorBidi"/>
+        </w:rPr>
+        <w:t>, is a two-dimensional, tabular, labeled structure that can hold columns of different data types. It is the most widely used tool for structured data wrangling in Python.</w:t>
+      </w:r>
+    </w:p>
+    <w:p>
+      <w:pPr>
+        <w:rPr>
+          <w:rFonts w:asciiTheme="majorBidi" w:hAnsiTheme="majorBidi" w:cstheme="majorBidi"/>
+        </w:rPr>
+      </w:pPr>
+      <w:r>
+        <w:rPr>
+          <w:rFonts w:asciiTheme="majorBidi" w:hAnsiTheme="majorBidi" w:cstheme="majorBidi"/>
+          <w:b/>
+          <w:bCs/>
+        </w:rPr>
+        <w:t>2. Data Inspection:</w:t>
+      </w:r>
+      <w:r>
+        <w:rPr>
+          <w:rFonts w:asciiTheme="majorBidi" w:hAnsiTheme="majorBidi" w:cstheme="majorBidi"/>
+        </w:rPr>
+        <w:t xml:space="preserve"> Before any manipulation, it is essential to understand the dataset. Key inspection functions include:</w:t>
+      </w:r>
+    </w:p>
+    <w:p>
+      <w:pPr>
+        <w:numPr>
+          <w:ilvl w:val="0"/>
+          <w:numId w:val="6"/>
+        </w:numPr>
+        <w:rPr>
+          <w:rFonts w:asciiTheme="majorBidi" w:hAnsiTheme="majorBidi" w:cstheme="majorBidi"/>
+        </w:rPr>
+      </w:pPr>
+      <w:r>
+        <w:rPr>
+          <w:rFonts w:asciiTheme="majorBidi" w:hAnsiTheme="majorBidi" w:cstheme="majorBidi"/>
+        </w:rPr>
+        <w:t>head() / tail() — View first and last N rows.</w:t>
+      </w:r>
+    </w:p>
+    <w:p>
+      <w:pPr>
+        <w:numPr>
+          <w:ilvl w:val="0"/>
+          <w:numId w:val="6"/>
+        </w:numPr>
+        <w:rPr>
+          <w:rFonts w:asciiTheme="majorBidi" w:hAnsiTheme="majorBidi" w:cstheme="majorBidi"/>
+        </w:rPr>
+      </w:pPr>
+      <w:r>
+        <w:rPr>
+          <w:rFonts w:asciiTheme="majorBidi" w:hAnsiTheme="majorBidi" w:cstheme="majorBidi"/>
+        </w:rPr>
+        <w:t>info() — Column names, data types, and non-null counts.</w:t>
+      </w:r>
+    </w:p>
+    <w:p>
+      <w:pPr>
+        <w:numPr>
+          <w:ilvl w:val="0"/>
+          <w:numId w:val="6"/>
+        </w:numPr>
+        <w:rPr>
+          <w:rFonts w:asciiTheme="majorBidi" w:hAnsiTheme="majorBidi" w:cstheme="majorBidi"/>
+        </w:rPr>
+      </w:pPr>
+      <w:r>
+        <w:rPr>
+          <w:rFonts w:asciiTheme="majorBidi" w:hAnsiTheme="majorBidi" w:cstheme="majorBidi"/>
+        </w:rPr>
+        <w:t>describe() — Summary statistics for numeric columns.</w:t>
+      </w:r>
+    </w:p>
+    <w:p>
+      <w:pPr>
+        <w:numPr>
+          <w:ilvl w:val="0"/>
+          <w:numId w:val="6"/>
+        </w:numPr>
+        <w:rPr>
+          <w:rFonts w:asciiTheme="majorBidi" w:hAnsiTheme="majorBidi" w:cstheme="majorBidi"/>
+        </w:rPr>
+      </w:pPr>
+      <w:r>
+        <w:rPr>
+          <w:rFonts w:asciiTheme="majorBidi" w:hAnsiTheme="majorBidi" w:cstheme="majorBidi"/>
+        </w:rPr>
+        <w:t>shape — Dimensions (rows, columns).</w:t>
+      </w:r>
+    </w:p>
+    <w:p>
+      <w:pPr>
+        <w:numPr>
+          <w:ilvl w:val="0"/>
+          <w:numId w:val="6"/>
+        </w:numPr>
+        <w:rPr>
+          <w:rFonts w:asciiTheme="majorBidi" w:hAnsiTheme="majorBidi" w:cstheme="majorBidi"/>
+        </w:rPr>
+      </w:pPr>
+      <w:r>
+        <w:rPr>
+          <w:rFonts w:asciiTheme="majorBidi" w:hAnsiTheme="majorBidi" w:cstheme="majorBidi"/>
+        </w:rPr>
+        <w:t>columns — List of all column names.</w:t>
+      </w:r>
+    </w:p>
+    <w:p>
+      <w:pPr>
+        <w:rPr>
+          <w:rFonts w:asciiTheme="majorBidi" w:hAnsiTheme="majorBidi" w:cstheme="majorBidi"/>
+        </w:rPr>
+      </w:pPr>
+      <w:r>
+        <w:rPr>
+          <w:rFonts w:asciiTheme="majorBidi" w:hAnsiTheme="majorBidi" w:cstheme="majorBidi"/>
+          <w:b/>
+          <w:bCs/>
+        </w:rPr>
+        <w:t>3. Missing Value Treatment:</w:t>
+      </w:r>
+      <w:r>
+        <w:rPr>
+          <w:rFonts w:asciiTheme="majorBidi" w:hAnsiTheme="majorBidi" w:cstheme="majorBidi"/>
+        </w:rPr>
+        <w:t xml:space="preserve"> Real-world datasets often contain null or </w:t>
+      </w:r>
+      <w:proofErr w:type="spellStart"/>
+      <w:r>
+        <w:rPr>
+          <w:rFonts w:asciiTheme="majorBidi" w:hAnsiTheme="majorBidi" w:cstheme="majorBidi"/>
+        </w:rPr>
+        <w:t>NaN</w:t>
+      </w:r>
+      <w:proofErr w:type="spellEnd"/>
+      <w:r>
+        <w:rPr>
+          <w:rFonts w:asciiTheme="majorBidi" w:hAnsiTheme="majorBidi" w:cstheme="majorBidi"/>
+        </w:rPr>
+        <w:t xml:space="preserve"> values. The </w:t>
+      </w:r>
+      <w:proofErr w:type="spellStart"/>
+      <w:r>
+        <w:rPr>
+          <w:rFonts w:asciiTheme="majorBidi" w:hAnsiTheme="majorBidi" w:cstheme="majorBidi"/>
+        </w:rPr>
+        <w:t>isnull</w:t>
+      </w:r>
+      <w:proofErr w:type="spellEnd"/>
+      <w:r>
+        <w:rPr>
+          <w:rFonts w:asciiTheme="majorBidi" w:hAnsiTheme="majorBidi" w:cstheme="majorBidi"/>
+        </w:rPr>
+        <w:t>().sum() function identifies the count of missing values per column. Treatment strategies include:</w:t>
+      </w:r>
+    </w:p>
+    <w:p>
+      <w:pPr>
+        <w:numPr>
+          <w:ilvl w:val="0"/>
+          <w:numId w:val="7"/>
+        </w:numPr>
+        <w:rPr>
+          <w:rFonts w:asciiTheme="majorBidi" w:hAnsiTheme="majorBidi" w:cstheme="majorBidi"/>
+        </w:rPr>
+      </w:pPr>
+      <w:r>
+        <w:rPr>
+          <w:rFonts w:asciiTheme="majorBidi" w:hAnsiTheme="majorBidi" w:cstheme="majorBidi"/>
+          <w:b/>
+          <w:bCs/>
+        </w:rPr>
+        <w:t>Numeric columns</w:t>
+      </w:r>
+      <w:r>
+        <w:rPr>
+          <w:rFonts w:asciiTheme="majorBidi" w:hAnsiTheme="majorBidi" w:cstheme="majorBidi"/>
+        </w:rPr>
+        <w:t xml:space="preserve"> — Filling with the column mean using </w:t>
+      </w:r>
+      <w:proofErr w:type="spellStart"/>
+      <w:r>
+        <w:rPr>
+          <w:rFonts w:asciiTheme="majorBidi" w:hAnsiTheme="majorBidi" w:cstheme="majorBidi"/>
+        </w:rPr>
+        <w:t>fillna</w:t>
+      </w:r>
+      <w:proofErr w:type="spellEnd"/>
+      <w:r>
+        <w:rPr>
+          <w:rFonts w:asciiTheme="majorBidi" w:hAnsiTheme="majorBidi" w:cstheme="majorBidi"/>
+        </w:rPr>
+        <w:t>(mean) preserves the overall distribution.</w:t>
+      </w:r>
+    </w:p>
+    <w:p>
+      <w:pPr>
+        <w:numPr>
+          <w:ilvl w:val="0"/>
+          <w:numId w:val="7"/>
+        </w:numPr>
+        <w:rPr>
+          <w:rFonts w:asciiTheme="majorBidi" w:hAnsiTheme="majorBidi" w:cstheme="majorBidi"/>
+        </w:rPr>
+      </w:pPr>
+      <w:r>
+        <w:rPr>
+          <w:rFonts w:asciiTheme="majorBidi" w:hAnsiTheme="majorBidi" w:cstheme="majorBidi"/>
+          <w:b/>
+          <w:bCs/>
+        </w:rPr>
+        <w:t>Categorical/text columns</w:t>
+      </w:r>
+      <w:r>
+        <w:rPr>
+          <w:rFonts w:asciiTheme="majorBidi" w:hAnsiTheme="majorBidi" w:cstheme="majorBidi"/>
+        </w:rPr>
+        <w:t xml:space="preserve"> — Filling with a placeholder such as "Not Provided" avoids data loss while flagging incomplete records.</w:t>
+      </w:r>
+    </w:p>
+    <w:p>
+      <w:pPr>
+        <w:rPr>
+          <w:rFonts w:asciiTheme="majorBidi" w:hAnsiTheme="majorBidi" w:cstheme="majorBidi"/>
+        </w:rPr>
+      </w:pPr>
+      <w:r>
+        <w:rPr>
+          <w:rFonts w:asciiTheme="majorBidi" w:hAnsiTheme="majorBidi" w:cstheme="majorBidi"/>
+        </w:rPr>
+        <w:lastRenderedPageBreak/>
+        <w:t xml:space="preserve">In this dataset, missing values were found in State (1), district (5), </w:t>
+      </w:r>
+      <w:proofErr w:type="spellStart"/>
+      <w:r>
+        <w:rPr>
+          <w:rFonts w:asciiTheme="majorBidi" w:hAnsiTheme="majorBidi" w:cstheme="majorBidi"/>
+        </w:rPr>
+        <w:t>pincode</w:t>
+      </w:r>
+      <w:proofErr w:type="spellEnd"/>
+      <w:r>
+        <w:rPr>
+          <w:rFonts w:asciiTheme="majorBidi" w:hAnsiTheme="majorBidi" w:cstheme="majorBidi"/>
+        </w:rPr>
+        <w:t xml:space="preserve"> (14), age_0_5 (5), age_5_17 (5), and age_18_greater (4), all of which were handled by filling with the mean or a placeholder.</w:t>
+      </w:r>
+    </w:p>
+    <w:p>
+      <w:pPr>
+        <w:rPr>
+          <w:rFonts w:asciiTheme="majorBidi" w:hAnsiTheme="majorBidi" w:cstheme="majorBidi"/>
+        </w:rPr>
+      </w:pPr>
+      <w:r>
+        <w:rPr>
+          <w:rFonts w:asciiTheme="majorBidi" w:hAnsiTheme="majorBidi" w:cstheme="majorBidi"/>
+          <w:b/>
+          <w:bCs/>
+        </w:rPr>
+        <w:t>4. Duplicate Detection and Removal:</w:t>
+      </w:r>
+      <w:r>
+        <w:rPr>
+          <w:rFonts w:asciiTheme="majorBidi" w:hAnsiTheme="majorBidi" w:cstheme="majorBidi"/>
+        </w:rPr>
+        <w:t xml:space="preserve"> Duplicate rows can skew analysis results. The duplicated() function identifies repeated rows, and </w:t>
+      </w:r>
+      <w:proofErr w:type="spellStart"/>
+      <w:r>
+        <w:rPr>
+          <w:rFonts w:asciiTheme="majorBidi" w:hAnsiTheme="majorBidi" w:cstheme="majorBidi"/>
+        </w:rPr>
+        <w:t>drop_duplicates</w:t>
+      </w:r>
+      <w:proofErr w:type="spellEnd"/>
+      <w:r>
+        <w:rPr>
+          <w:rFonts w:asciiTheme="majorBidi" w:hAnsiTheme="majorBidi" w:cstheme="majorBidi"/>
+        </w:rPr>
+        <w:t xml:space="preserve">() removes them. In this experiment, a test set of 101 rows (with 2 intentional duplicates added) was reduced back to 99 unique records after applying </w:t>
+      </w:r>
+      <w:proofErr w:type="spellStart"/>
+      <w:r>
+        <w:rPr>
+          <w:rFonts w:asciiTheme="majorBidi" w:hAnsiTheme="majorBidi" w:cstheme="majorBidi"/>
+        </w:rPr>
+        <w:t>drop_duplicates</w:t>
+      </w:r>
+      <w:proofErr w:type="spellEnd"/>
+      <w:r>
+        <w:rPr>
+          <w:rFonts w:asciiTheme="majorBidi" w:hAnsiTheme="majorBidi" w:cstheme="majorBidi"/>
+        </w:rPr>
+        <w:t>().</w:t>
+      </w:r>
+    </w:p>
+    <w:p>
+      <w:pPr>
+        <w:rPr>
+          <w:rFonts w:asciiTheme="majorBidi" w:hAnsiTheme="majorBidi" w:cstheme="majorBidi"/>
+        </w:rPr>
+      </w:pPr>
+      <w:r>
+        <w:rPr>
+          <w:rFonts w:asciiTheme="majorBidi" w:hAnsiTheme="majorBidi" w:cstheme="majorBidi"/>
+          <w:b/>
+          <w:bCs/>
+        </w:rPr>
+        <w:t>5. Value Replacement:</w:t>
+      </w:r>
+      <w:r>
+        <w:rPr>
+          <w:rFonts w:asciiTheme="majorBidi" w:hAnsiTheme="majorBidi" w:cstheme="majorBidi"/>
+        </w:rPr>
+        <w:t xml:space="preserve"> The replace() function is used to substitute existing values with new ones. This is useful for standardizing inconsistent labels, correcting data entry errors, or recoding categorical variables.</w:t>
+      </w:r>
+    </w:p>
+    <w:p>
+      <w:pPr>
+        <w:rPr>
+          <w:rFonts w:asciiTheme="majorBidi" w:hAnsiTheme="majorBidi" w:cstheme="majorBidi"/>
+        </w:rPr>
+      </w:pPr>
+      <w:r>
+        <w:rPr>
+          <w:rFonts w:asciiTheme="majorBidi" w:hAnsiTheme="majorBidi" w:cstheme="majorBidi"/>
+          <w:b/>
+          <w:bCs/>
+        </w:rPr>
+        <w:t>6. Derived Columns and Custom Functions:</w:t>
+      </w:r>
+      <w:r>
+        <w:rPr>
+          <w:rFonts w:asciiTheme="majorBidi" w:hAnsiTheme="majorBidi" w:cstheme="majorBidi"/>
+        </w:rPr>
+        <w:t xml:space="preserve"> New columns can be engineered from existing ones using:</w:t>
+      </w:r>
+    </w:p>
+    <w:p>
+      <w:pPr>
+        <w:numPr>
+          <w:ilvl w:val="0"/>
+          <w:numId w:val="8"/>
+        </w:numPr>
+        <w:rPr>
+          <w:rFonts w:asciiTheme="majorBidi" w:hAnsiTheme="majorBidi" w:cstheme="majorBidi"/>
+        </w:rPr>
+      </w:pPr>
+      <w:r>
+        <w:rPr>
+          <w:rFonts w:asciiTheme="majorBidi" w:hAnsiTheme="majorBidi" w:cstheme="majorBidi"/>
+        </w:rPr>
+        <w:t>apply() — Applies a custom function row-wise or column-wise.</w:t>
+      </w:r>
+    </w:p>
+    <w:p>
+      <w:pPr>
+        <w:numPr>
+          <w:ilvl w:val="0"/>
+          <w:numId w:val="8"/>
+        </w:numPr>
+        <w:rPr>
+          <w:rFonts w:asciiTheme="majorBidi" w:hAnsiTheme="majorBidi" w:cstheme="majorBidi"/>
+        </w:rPr>
+      </w:pPr>
+      <w:r>
+        <w:rPr>
+          <w:rFonts w:asciiTheme="majorBidi" w:hAnsiTheme="majorBidi" w:cstheme="majorBidi"/>
+        </w:rPr>
+        <w:t>Direct assignment — Creating new columns using arithmetic or string operations.</w:t>
+      </w:r>
+    </w:p>
+    <w:p>
+      <w:pPr>
+        <w:rPr>
+          <w:rFonts w:asciiTheme="majorBidi" w:hAnsiTheme="majorBidi" w:cstheme="majorBidi"/>
+        </w:rPr>
+      </w:pPr>
+      <w:r>
+        <w:rPr>
+          <w:rFonts w:asciiTheme="majorBidi" w:hAnsiTheme="majorBidi" w:cstheme="majorBidi"/>
+        </w:rPr>
+        <w:t xml:space="preserve">In this experiment, two derived columns were created — a category label based on </w:t>
+      </w:r>
+      <w:proofErr w:type="spellStart"/>
+      <w:r>
+        <w:rPr>
+          <w:rFonts w:asciiTheme="majorBidi" w:hAnsiTheme="majorBidi" w:cstheme="majorBidi"/>
+        </w:rPr>
+        <w:t>pincode</w:t>
+      </w:r>
+      <w:proofErr w:type="spellEnd"/>
+      <w:r>
+        <w:rPr>
+          <w:rFonts w:asciiTheme="majorBidi" w:hAnsiTheme="majorBidi" w:cstheme="majorBidi"/>
+        </w:rPr>
+        <w:t xml:space="preserve"> range, and a short code extracted from the State name — demonstrating how domain knowledge can be embedded into the dataset.</w:t>
+      </w:r>
+    </w:p>
+    <w:p>
+      <w:pPr>
+        <w:rPr>
+          <w:rFonts w:asciiTheme="majorBidi" w:hAnsiTheme="majorBidi" w:cstheme="majorBidi"/>
+        </w:rPr>
+      </w:pPr>
+      <w:r>
+        <w:rPr>
+          <w:rFonts w:asciiTheme="majorBidi" w:hAnsiTheme="majorBidi" w:cstheme="majorBidi"/>
+          <w:b/>
+          <w:bCs/>
+        </w:rPr>
+        <w:t>7. Sorting:</w:t>
+      </w:r>
+      <w:r>
+        <w:rPr>
+          <w:rFonts w:asciiTheme="majorBidi" w:hAnsiTheme="majorBidi" w:cstheme="majorBidi"/>
+        </w:rPr>
+        <w:t xml:space="preserve"> The </w:t>
+      </w:r>
+      <w:proofErr w:type="spellStart"/>
+      <w:r>
+        <w:rPr>
+          <w:rFonts w:asciiTheme="majorBidi" w:hAnsiTheme="majorBidi" w:cstheme="majorBidi"/>
+        </w:rPr>
+        <w:t>sort_values</w:t>
+      </w:r>
+      <w:proofErr w:type="spellEnd"/>
+      <w:r>
+        <w:rPr>
+          <w:rFonts w:asciiTheme="majorBidi" w:hAnsiTheme="majorBidi" w:cstheme="majorBidi"/>
+        </w:rPr>
+        <w:t>() function arranges rows based on one or more columns in ascending or descending order. Sorting is useful for ranking records, identifying top/bottom entries, and preparing data for display.</w:t>
+      </w:r>
+    </w:p>
+    <w:p>
+      <w:pPr>
+        <w:rPr>
+          <w:rFonts w:asciiTheme="majorBidi" w:hAnsiTheme="majorBidi" w:cstheme="majorBidi"/>
+        </w:rPr>
+      </w:pPr>
+      <w:r>
+        <w:rPr>
+          <w:rFonts w:asciiTheme="majorBidi" w:hAnsiTheme="majorBidi" w:cstheme="majorBidi"/>
+          <w:b/>
+          <w:bCs/>
+        </w:rPr>
+        <w:t>8. Pivot Table:</w:t>
+      </w:r>
+      <w:r>
+        <w:rPr>
+          <w:rFonts w:asciiTheme="majorBidi" w:hAnsiTheme="majorBidi" w:cstheme="majorBidi"/>
+        </w:rPr>
+        <w:t xml:space="preserve"> A pivot table reorganizes data by aggregating values across two dimensions. Pandas </w:t>
+      </w:r>
+      <w:proofErr w:type="spellStart"/>
+      <w:r>
+        <w:rPr>
+          <w:rFonts w:asciiTheme="majorBidi" w:hAnsiTheme="majorBidi" w:cstheme="majorBidi"/>
+        </w:rPr>
+        <w:t>pivot_table</w:t>
+      </w:r>
+      <w:proofErr w:type="spellEnd"/>
+      <w:r>
+        <w:rPr>
+          <w:rFonts w:asciiTheme="majorBidi" w:hAnsiTheme="majorBidi" w:cstheme="majorBidi"/>
+        </w:rPr>
+        <w:t>() function works similarly to Excel pivot tables, allowing grouping by rows and columns with an aggregate function (sum, mean, count). In this experiment, enrollment data was pivoted by Date and State.</w:t>
+      </w:r>
+    </w:p>
+    <w:p>
+      <w:pPr>
+        <w:rPr>
+          <w:rFonts w:asciiTheme="majorBidi" w:hAnsiTheme="majorBidi" w:cstheme="majorBidi"/>
+        </w:rPr>
+      </w:pPr>
+      <w:r>
+        <w:rPr>
+          <w:rFonts w:asciiTheme="majorBidi" w:hAnsiTheme="majorBidi" w:cstheme="majorBidi"/>
+          <w:b/>
+          <w:bCs/>
+        </w:rPr>
+        <w:t>9. Group-By Aggregation:</w:t>
+      </w:r>
+      <w:r>
+        <w:rPr>
+          <w:rFonts w:asciiTheme="majorBidi" w:hAnsiTheme="majorBidi" w:cstheme="majorBidi"/>
+        </w:rPr>
+        <w:t xml:space="preserve"> The </w:t>
+      </w:r>
+      <w:proofErr w:type="spellStart"/>
+      <w:r>
+        <w:rPr>
+          <w:rFonts w:asciiTheme="majorBidi" w:hAnsiTheme="majorBidi" w:cstheme="majorBidi"/>
+        </w:rPr>
+        <w:t>groupby</w:t>
+      </w:r>
+      <w:proofErr w:type="spellEnd"/>
+      <w:r>
+        <w:rPr>
+          <w:rFonts w:asciiTheme="majorBidi" w:hAnsiTheme="majorBidi" w:cstheme="majorBidi"/>
+        </w:rPr>
+        <w:t>() function splits the dataset into groups based on a column, applies an aggregation function (sum, mean, count), and combines the results. It is one of the most powerful tools in Pandas for deriving insights at a categorical level. Here, data was grouped by both Date and State to compute aggregate enrollment summaries.</w:t>
+      </w:r>
+    </w:p>
+    <w:p>
+      <w:pPr>
+        <w:rPr>
+          <w:rFonts w:asciiTheme="majorBidi" w:hAnsiTheme="majorBidi" w:cstheme="majorBidi"/>
+        </w:rPr>
+      </w:pPr>
+      <w:r>
+        <w:rPr>
+          <w:rFonts w:asciiTheme="majorBidi" w:hAnsiTheme="majorBidi" w:cstheme="majorBidi"/>
+          <w:b/>
+          <w:bCs/>
+        </w:rPr>
+        <w:t>10. File I/O Operations:</w:t>
+      </w:r>
+      <w:r>
+        <w:rPr>
+          <w:rFonts w:asciiTheme="majorBidi" w:hAnsiTheme="majorBidi" w:cstheme="majorBidi"/>
+        </w:rPr>
+        <w:t xml:space="preserve"> Pandas supports reading and writing multiple file formats:</w:t>
+      </w:r>
+    </w:p>
+    <w:p>
+      <w:pPr>
+        <w:numPr>
+          <w:ilvl w:val="0"/>
+          <w:numId w:val="9"/>
+        </w:numPr>
+        <w:rPr>
+          <w:rFonts w:asciiTheme="majorBidi" w:hAnsiTheme="majorBidi" w:cstheme="majorBidi"/>
+        </w:rPr>
+      </w:pPr>
+      <w:proofErr w:type="spellStart"/>
+      <w:r>
+        <w:rPr>
+          <w:rFonts w:asciiTheme="majorBidi" w:hAnsiTheme="majorBidi" w:cstheme="majorBidi"/>
+        </w:rPr>
+        <w:t>read_excel</w:t>
+      </w:r>
+      <w:proofErr w:type="spellEnd"/>
+      <w:r>
+        <w:rPr>
+          <w:rFonts w:asciiTheme="majorBidi" w:hAnsiTheme="majorBidi" w:cstheme="majorBidi"/>
+        </w:rPr>
+        <w:t xml:space="preserve">() / </w:t>
+      </w:r>
+      <w:proofErr w:type="spellStart"/>
+      <w:r>
+        <w:rPr>
+          <w:rFonts w:asciiTheme="majorBidi" w:hAnsiTheme="majorBidi" w:cstheme="majorBidi"/>
+        </w:rPr>
+        <w:t>to_excel</w:t>
+      </w:r>
+      <w:proofErr w:type="spellEnd"/>
+      <w:r>
+        <w:rPr>
+          <w:rFonts w:asciiTheme="majorBidi" w:hAnsiTheme="majorBidi" w:cstheme="majorBidi"/>
+        </w:rPr>
+        <w:t>() — For .xlsx files.</w:t>
+      </w:r>
+    </w:p>
+    <w:p>
+      <w:pPr>
+        <w:numPr>
+          <w:ilvl w:val="0"/>
+          <w:numId w:val="9"/>
+        </w:numPr>
+        <w:rPr>
+          <w:rFonts w:asciiTheme="majorBidi" w:hAnsiTheme="majorBidi" w:cstheme="majorBidi"/>
+        </w:rPr>
+      </w:pPr>
+      <w:proofErr w:type="spellStart"/>
+      <w:r>
+        <w:rPr>
+          <w:rFonts w:asciiTheme="majorBidi" w:hAnsiTheme="majorBidi" w:cstheme="majorBidi"/>
+        </w:rPr>
+        <w:t>read_csv</w:t>
+      </w:r>
+      <w:proofErr w:type="spellEnd"/>
+      <w:r>
+        <w:rPr>
+          <w:rFonts w:asciiTheme="majorBidi" w:hAnsiTheme="majorBidi" w:cstheme="majorBidi"/>
+        </w:rPr>
+        <w:t xml:space="preserve">() / </w:t>
+      </w:r>
+      <w:proofErr w:type="spellStart"/>
+      <w:r>
+        <w:rPr>
+          <w:rFonts w:asciiTheme="majorBidi" w:hAnsiTheme="majorBidi" w:cstheme="majorBidi"/>
+        </w:rPr>
+        <w:t>to_csv</w:t>
+      </w:r>
+      <w:proofErr w:type="spellEnd"/>
+      <w:r>
+        <w:rPr>
+          <w:rFonts w:asciiTheme="majorBidi" w:hAnsiTheme="majorBidi" w:cstheme="majorBidi"/>
+        </w:rPr>
+        <w:t>() — For .csv files.</w:t>
+      </w:r>
+    </w:p>
+    <w:p>
+      <w:pPr>
+        <w:rPr>
+          <w:rFonts w:asciiTheme="majorBidi" w:hAnsiTheme="majorBidi" w:cstheme="majorBidi"/>
+        </w:rPr>
+      </w:pPr>
+      <w:r>
+        <w:rPr>
+          <w:rFonts w:asciiTheme="majorBidi" w:hAnsiTheme="majorBidi" w:cstheme="majorBidi"/>
+        </w:rPr>
+        <w:pict w14:anchorId="6370610C">
+          <v:rect id="_x0000_i1026" style="width:0;height:1.5pt" o:hralign="center" o:hrstd="t" o:hr="t" fillcolor="#a0a0a0" stroked="f"/>
+        </w:pict>
+      </w:r>
+    </w:p>
+    <w:p>
+      <w:pPr>
+        <w:rPr>
+          <w:rFonts w:asciiTheme="majorBidi" w:hAnsiTheme="majorBidi" w:cstheme="majorBidi"/>
+          <w:b/>
+          <w:bCs/>
+          <w:sz w:val="28"/>
+          <w:szCs w:val="28"/>
+        </w:rPr>
+      </w:pPr>
+    </w:p>
+    <w:p>
+      <w:pPr>
+        <w:rPr>
+          <w:rFonts w:asciiTheme="majorBidi" w:hAnsiTheme="majorBidi" w:cstheme="majorBidi"/>
+          <w:b/>
+          <w:bCs/>
+          <w:sz w:val="28"/>
+          <w:szCs w:val="28"/>
+          <w:u w:val="single"/>
+        </w:rPr>
+      </w:pPr>
+      <w:r>
+        <w:rPr>
+          <w:rFonts w:asciiTheme="majorBidi" w:hAnsiTheme="majorBidi" w:cstheme="majorBidi"/>
+          <w:b/>
+          <w:bCs/>
+          <w:sz w:val="28"/>
+          <w:szCs w:val="28"/>
+          <w:u w:val="single"/>
+        </w:rPr>
+        <w:t>Execution</w:t>
+      </w:r>
+    </w:p>
+    <w:p>
+      <w:pPr>
+        <w:rPr>
+          <w:rFonts w:asciiTheme="majorBidi" w:hAnsiTheme="majorBidi" w:cstheme="majorBidi"/>
+        </w:rPr>
+      </w:pPr>
+      <w:r>
+        <w:rPr>
+          <w:rFonts w:asciiTheme="majorBidi" w:hAnsiTheme="majorBidi" w:cstheme="majorBidi"/>
+        </w:rPr>
+        <w:t>The following operations were performed step-by-step on the Aadhar Enrollment dataset:</w:t>
+      </w:r>
+    </w:p>
+    <w:p>
+      <w:pPr>
+        <w:rPr>
+          <w:rFonts w:asciiTheme="majorBidi" w:hAnsiTheme="majorBidi" w:cstheme="majorBidi"/>
+        </w:rPr>
+      </w:pPr>
+      <w:r>
+        <w:rPr>
+          <w:rFonts w:asciiTheme="majorBidi" w:hAnsiTheme="majorBidi" w:cstheme="majorBidi"/>
+          <w:b/>
+          <w:bCs/>
+        </w:rPr>
+        <w:t>Step 1 — Load Data:</w:t>
+      </w:r>
+      <w:r>
+        <w:rPr>
+          <w:rFonts w:asciiTheme="majorBidi" w:hAnsiTheme="majorBidi" w:cstheme="majorBidi"/>
+        </w:rPr>
+        <w:t xml:space="preserve"> The Excel file Sample_Aadhar_Enrollment_Dataset.xlsx was loaded into a Pandas </w:t>
+      </w:r>
+      <w:proofErr w:type="spellStart"/>
+      <w:r>
+        <w:rPr>
+          <w:rFonts w:asciiTheme="majorBidi" w:hAnsiTheme="majorBidi" w:cstheme="majorBidi"/>
+        </w:rPr>
+        <w:t>DataFrame</w:t>
+      </w:r>
+      <w:proofErr w:type="spellEnd"/>
+      <w:r>
+        <w:rPr>
+          <w:rFonts w:asciiTheme="majorBidi" w:hAnsiTheme="majorBidi" w:cstheme="majorBidi"/>
+        </w:rPr>
+        <w:t xml:space="preserve"> using </w:t>
+      </w:r>
+      <w:proofErr w:type="spellStart"/>
+      <w:r>
+        <w:rPr>
+          <w:rFonts w:asciiTheme="majorBidi" w:hAnsiTheme="majorBidi" w:cstheme="majorBidi"/>
+        </w:rPr>
+        <w:t>read_excel</w:t>
+      </w:r>
+      <w:proofErr w:type="spellEnd"/>
+      <w:r>
+        <w:rPr>
+          <w:rFonts w:asciiTheme="majorBidi" w:hAnsiTheme="majorBidi" w:cstheme="majorBidi"/>
+        </w:rPr>
+        <w:t xml:space="preserve">(). The dataset contained 99 rows and 7 columns: Date, State, district, </w:t>
+      </w:r>
+      <w:proofErr w:type="spellStart"/>
+      <w:r>
+        <w:rPr>
+          <w:rFonts w:asciiTheme="majorBidi" w:hAnsiTheme="majorBidi" w:cstheme="majorBidi"/>
+        </w:rPr>
+        <w:t>pincode</w:t>
+      </w:r>
+      <w:proofErr w:type="spellEnd"/>
+      <w:r>
+        <w:rPr>
+          <w:rFonts w:asciiTheme="majorBidi" w:hAnsiTheme="majorBidi" w:cstheme="majorBidi"/>
+        </w:rPr>
+        <w:t>, age_0_5, age_5_17, and age_18_greater.</w:t>
+      </w:r>
+    </w:p>
+    <w:p>
+      <w:pPr>
+        <w:rPr>
+          <w:rFonts w:asciiTheme="majorBidi" w:hAnsiTheme="majorBidi" w:cstheme="majorBidi"/>
+        </w:rPr>
+      </w:pPr>
+      <w:r>
+        <w:rPr>
+          <w:rFonts w:asciiTheme="majorBidi" w:hAnsiTheme="majorBidi" w:cstheme="majorBidi"/>
+          <w:b/>
+          <w:bCs/>
+        </w:rPr>
+        <w:t>Step 2 — Inspect Data:</w:t>
+      </w:r>
+      <w:r>
+        <w:rPr>
+          <w:rFonts w:asciiTheme="majorBidi" w:hAnsiTheme="majorBidi" w:cstheme="majorBidi"/>
+        </w:rPr>
+        <w:t xml:space="preserve"> Basic inspection was performed using head(), tail(), info(), describe(), shape, and columns to understand the structure, data types, and statistical properties of the dataset.</w:t>
+      </w:r>
+    </w:p>
+    <w:p>
+      <w:pPr>
+        <w:rPr>
+          <w:rFonts w:asciiTheme="majorBidi" w:hAnsiTheme="majorBidi" w:cstheme="majorBidi"/>
+        </w:rPr>
+      </w:pPr>
+      <w:r>
+        <w:rPr>
+          <w:rFonts w:asciiTheme="majorBidi" w:hAnsiTheme="majorBidi" w:cstheme="majorBidi"/>
+          <w:b/>
+          <w:bCs/>
+        </w:rPr>
+        <w:t>Step 3 — Detect Missing Values:</w:t>
+      </w:r>
+      <w:r>
+        <w:rPr>
+          <w:rFonts w:asciiTheme="majorBidi" w:hAnsiTheme="majorBidi" w:cstheme="majorBidi"/>
+        </w:rPr>
+        <w:t xml:space="preserve"> </w:t>
+      </w:r>
+      <w:proofErr w:type="spellStart"/>
+      <w:r>
+        <w:rPr>
+          <w:rFonts w:asciiTheme="majorBidi" w:hAnsiTheme="majorBidi" w:cstheme="majorBidi"/>
+        </w:rPr>
+        <w:t>isnull</w:t>
+      </w:r>
+      <w:proofErr w:type="spellEnd"/>
+      <w:r>
+        <w:rPr>
+          <w:rFonts w:asciiTheme="majorBidi" w:hAnsiTheme="majorBidi" w:cstheme="majorBidi"/>
+        </w:rPr>
+        <w:t>().sum() was used to identify missing values. The following nulls were found before cleaning:</w:t>
+      </w:r>
+    </w:p>
+    <w:p>
+      <w:pPr>
+        <w:rPr>
+          <w:rFonts w:asciiTheme="majorBidi" w:hAnsiTheme="majorBidi" w:cstheme="majorBidi"/>
+        </w:rPr>
+      </w:pPr>
+      <w:r>
+        <w:rPr>
+          <w:rFonts w:asciiTheme="majorBidi" w:hAnsiTheme="majorBidi" w:cstheme="majorBidi"/>
+          <w:b/>
+          <w:bCs/>
+        </w:rPr>
+        <w:t>Step 4 — Handle Missing Values:</w:t>
+      </w:r>
+      <w:r>
+        <w:rPr>
+          <w:rFonts w:asciiTheme="majorBidi" w:hAnsiTheme="majorBidi" w:cstheme="majorBidi"/>
+        </w:rPr>
+        <w:t xml:space="preserve"> Numeric columns were filled with their respective column means using </w:t>
+      </w:r>
+      <w:proofErr w:type="spellStart"/>
+      <w:r>
+        <w:rPr>
+          <w:rFonts w:asciiTheme="majorBidi" w:hAnsiTheme="majorBidi" w:cstheme="majorBidi"/>
+        </w:rPr>
+        <w:t>fillna</w:t>
+      </w:r>
+      <w:proofErr w:type="spellEnd"/>
+      <w:r>
+        <w:rPr>
+          <w:rFonts w:asciiTheme="majorBidi" w:hAnsiTheme="majorBidi" w:cstheme="majorBidi"/>
+        </w:rPr>
+        <w:t>(). Text columns (State, district) were filled with "Not Provided". After treatment, all missing value counts became 0.</w:t>
+      </w:r>
+    </w:p>
+    <w:p>
+      <w:pPr>
+        <w:rPr>
+          <w:rFonts w:asciiTheme="majorBidi" w:hAnsiTheme="majorBidi" w:cstheme="majorBidi"/>
+        </w:rPr>
+      </w:pPr>
+      <w:r>
+        <w:rPr>
+          <w:rFonts w:asciiTheme="majorBidi" w:hAnsiTheme="majorBidi" w:cstheme="majorBidi"/>
+          <w:b/>
+          <w:bCs/>
+        </w:rPr>
+        <w:t>Step 5 — Duplicate Handling:</w:t>
+      </w:r>
+      <w:r>
+        <w:rPr>
+          <w:rFonts w:asciiTheme="majorBidi" w:hAnsiTheme="majorBidi" w:cstheme="majorBidi"/>
+        </w:rPr>
+        <w:t xml:space="preserve"> Two duplicate rows were intentionally added to create a 101-row test set. </w:t>
+      </w:r>
+      <w:proofErr w:type="spellStart"/>
+      <w:r>
+        <w:rPr>
+          <w:rFonts w:asciiTheme="majorBidi" w:hAnsiTheme="majorBidi" w:cstheme="majorBidi"/>
+        </w:rPr>
+        <w:t>drop_duplicates</w:t>
+      </w:r>
+      <w:proofErr w:type="spellEnd"/>
+      <w:r>
+        <w:rPr>
+          <w:rFonts w:asciiTheme="majorBidi" w:hAnsiTheme="majorBidi" w:cstheme="majorBidi"/>
+        </w:rPr>
+        <w:t>() was applied, successfully reducing the dataset back to 99 unique records.</w:t>
+      </w:r>
+    </w:p>
+    <w:p>
+      <w:pPr>
+        <w:rPr>
+          <w:rFonts w:asciiTheme="majorBidi" w:hAnsiTheme="majorBidi" w:cstheme="majorBidi"/>
+        </w:rPr>
+      </w:pPr>
+      <w:r>
+        <w:rPr>
+          <w:rFonts w:asciiTheme="majorBidi" w:hAnsiTheme="majorBidi" w:cstheme="majorBidi"/>
+          <w:b/>
+          <w:bCs/>
+        </w:rPr>
+        <w:t>Step 6 — Value Replacement:</w:t>
+      </w:r>
+      <w:r>
+        <w:rPr>
+          <w:rFonts w:asciiTheme="majorBidi" w:hAnsiTheme="majorBidi" w:cstheme="majorBidi"/>
+        </w:rPr>
+        <w:t xml:space="preserve"> replace() was used to substitute specific values in the dataset, demonstrating how inconsistent entries can be standardized programmatically.</w:t>
+      </w:r>
+    </w:p>
+    <w:p>
+      <w:pPr>
+        <w:rPr>
+          <w:rFonts w:asciiTheme="majorBidi" w:hAnsiTheme="majorBidi" w:cstheme="majorBidi"/>
+        </w:rPr>
+      </w:pPr>
+      <w:r>
+        <w:rPr>
+          <w:rFonts w:asciiTheme="majorBidi" w:hAnsiTheme="majorBidi" w:cstheme="majorBidi"/>
+          <w:b/>
+          <w:bCs/>
+        </w:rPr>
+        <w:t>Step 7 — Derived Columns:</w:t>
+      </w:r>
+      <w:r>
+        <w:rPr>
+          <w:rFonts w:asciiTheme="majorBidi" w:hAnsiTheme="majorBidi" w:cstheme="majorBidi"/>
+        </w:rPr>
+        <w:t xml:space="preserve"> A </w:t>
+      </w:r>
+      <w:proofErr w:type="spellStart"/>
+      <w:r>
+        <w:rPr>
+          <w:rFonts w:asciiTheme="majorBidi" w:hAnsiTheme="majorBidi" w:cstheme="majorBidi"/>
+        </w:rPr>
+        <w:t>pincode_category</w:t>
+      </w:r>
+      <w:proofErr w:type="spellEnd"/>
+      <w:r>
+        <w:rPr>
+          <w:rFonts w:asciiTheme="majorBidi" w:hAnsiTheme="majorBidi" w:cstheme="majorBidi"/>
+        </w:rPr>
+        <w:t xml:space="preserve"> column was created to classify </w:t>
+      </w:r>
+      <w:proofErr w:type="spellStart"/>
+      <w:r>
+        <w:rPr>
+          <w:rFonts w:asciiTheme="majorBidi" w:hAnsiTheme="majorBidi" w:cstheme="majorBidi"/>
+        </w:rPr>
+        <w:t>pincodes</w:t>
+      </w:r>
+      <w:proofErr w:type="spellEnd"/>
+      <w:r>
+        <w:rPr>
+          <w:rFonts w:asciiTheme="majorBidi" w:hAnsiTheme="majorBidi" w:cstheme="majorBidi"/>
+        </w:rPr>
+        <w:t xml:space="preserve"> into ranges. A </w:t>
+      </w:r>
+      <w:proofErr w:type="spellStart"/>
+      <w:r>
+        <w:rPr>
+          <w:rFonts w:asciiTheme="majorBidi" w:hAnsiTheme="majorBidi" w:cstheme="majorBidi"/>
+        </w:rPr>
+        <w:t>state_code</w:t>
+      </w:r>
+      <w:proofErr w:type="spellEnd"/>
+      <w:r>
+        <w:rPr>
+          <w:rFonts w:asciiTheme="majorBidi" w:hAnsiTheme="majorBidi" w:cstheme="majorBidi"/>
+        </w:rPr>
+        <w:t xml:space="preserve"> column was derived by extracting a short identifier from the State name using apply() with a custom function.</w:t>
+      </w:r>
+    </w:p>
+    <w:p>
+      <w:pPr>
+        <w:rPr>
+          <w:rFonts w:asciiTheme="majorBidi" w:hAnsiTheme="majorBidi" w:cstheme="majorBidi"/>
+        </w:rPr>
+      </w:pPr>
+      <w:r>
+        <w:rPr>
+          <w:rFonts w:asciiTheme="majorBidi" w:hAnsiTheme="majorBidi" w:cstheme="majorBidi"/>
+          <w:b/>
+          <w:bCs/>
+        </w:rPr>
+        <w:t>Step 8 — Sorting:</w:t>
+      </w:r>
+      <w:r>
+        <w:rPr>
+          <w:rFonts w:asciiTheme="majorBidi" w:hAnsiTheme="majorBidi" w:cstheme="majorBidi"/>
+        </w:rPr>
+        <w:t xml:space="preserve"> The dataset was sorted by enrollment columns to rank records from highest to lowest enrollment counts.</w:t>
+      </w:r>
+    </w:p>
+    <w:p>
+      <w:pPr>
+        <w:rPr>
+          <w:rFonts w:asciiTheme="majorBidi" w:hAnsiTheme="majorBidi" w:cstheme="majorBidi"/>
+        </w:rPr>
+      </w:pPr>
+      <w:r>
+        <w:rPr>
+          <w:rFonts w:asciiTheme="majorBidi" w:hAnsiTheme="majorBidi" w:cstheme="majorBidi"/>
+          <w:b/>
+          <w:bCs/>
+        </w:rPr>
+        <w:t>Step 9 — Pivot Table:</w:t>
+      </w:r>
+      <w:r>
+        <w:rPr>
+          <w:rFonts w:asciiTheme="majorBidi" w:hAnsiTheme="majorBidi" w:cstheme="majorBidi"/>
+        </w:rPr>
+        <w:t xml:space="preserve"> A pivot table was created using Date and State as axes, with enrollment columns as values, summarizing enrollment totals across time and geography.</w:t>
+      </w:r>
+    </w:p>
+    <w:p>
+      <w:pPr>
+        <w:rPr>
+          <w:rFonts w:asciiTheme="majorBidi" w:hAnsiTheme="majorBidi" w:cstheme="majorBidi"/>
+        </w:rPr>
+      </w:pPr>
+      <w:r>
+        <w:rPr>
+          <w:rFonts w:asciiTheme="majorBidi" w:hAnsiTheme="majorBidi" w:cstheme="majorBidi"/>
+          <w:b/>
+          <w:bCs/>
+        </w:rPr>
+        <w:t>Step 10 — Group-By Summaries:</w:t>
+      </w:r>
+      <w:r>
+        <w:rPr>
+          <w:rFonts w:asciiTheme="majorBidi" w:hAnsiTheme="majorBidi" w:cstheme="majorBidi"/>
+        </w:rPr>
+        <w:t xml:space="preserve"> </w:t>
+      </w:r>
+      <w:proofErr w:type="spellStart"/>
+      <w:r>
+        <w:rPr>
+          <w:rFonts w:asciiTheme="majorBidi" w:hAnsiTheme="majorBidi" w:cstheme="majorBidi"/>
+        </w:rPr>
+        <w:t>groupby</w:t>
+      </w:r>
+      <w:proofErr w:type="spellEnd"/>
+      <w:r>
+        <w:rPr>
+          <w:rFonts w:asciiTheme="majorBidi" w:hAnsiTheme="majorBidi" w:cstheme="majorBidi"/>
+        </w:rPr>
+        <w:t>() was applied on Date and State separately to generate aggregate enrollment summaries per group.</w:t>
+      </w:r>
+    </w:p>
+    <w:p>
+      <w:pPr>
+        <w:rPr>
+          <w:rFonts w:asciiTheme="majorBidi" w:hAnsiTheme="majorBidi" w:cstheme="majorBidi"/>
+        </w:rPr>
+      </w:pPr>
+      <w:r>
+        <w:rPr>
+          <w:rFonts w:asciiTheme="majorBidi" w:hAnsiTheme="majorBidi" w:cstheme="majorBidi"/>
+          <w:b/>
+          <w:bCs/>
+        </w:rPr>
+        <w:t>Step 11 — File Export:</w:t>
+      </w:r>
+      <w:r>
+        <w:rPr>
+          <w:rFonts w:asciiTheme="majorBidi" w:hAnsiTheme="majorBidi" w:cstheme="majorBidi"/>
+        </w:rPr>
+        <w:t xml:space="preserve"> The cleaned dataset was saved as Aadhar_Enrollment_Data.csv using </w:t>
+      </w:r>
+      <w:proofErr w:type="spellStart"/>
+      <w:r>
+        <w:rPr>
+          <w:rFonts w:asciiTheme="majorBidi" w:hAnsiTheme="majorBidi" w:cstheme="majorBidi"/>
+        </w:rPr>
+        <w:t>to_csv</w:t>
+      </w:r>
+      <w:proofErr w:type="spellEnd"/>
+      <w:r>
+        <w:rPr>
+          <w:rFonts w:asciiTheme="majorBidi" w:hAnsiTheme="majorBidi" w:cstheme="majorBidi"/>
+        </w:rPr>
+        <w:t xml:space="preserve">() and as Aadhar_Enrollment_Output.xlsx using </w:t>
+      </w:r>
+      <w:proofErr w:type="spellStart"/>
+      <w:r>
+        <w:rPr>
+          <w:rFonts w:asciiTheme="majorBidi" w:hAnsiTheme="majorBidi" w:cstheme="majorBidi"/>
+        </w:rPr>
+        <w:t>to_excel</w:t>
+      </w:r>
+      <w:proofErr w:type="spellEnd"/>
+      <w:r>
+        <w:rPr>
+          <w:rFonts w:asciiTheme="majorBidi" w:hAnsiTheme="majorBidi" w:cstheme="majorBidi"/>
+        </w:rPr>
+        <w:t>().</w:t>
+      </w:r>
+    </w:p>
+    <w:p>
+      <w:pPr>
+        <w:rPr>
+          <w:rFonts w:asciiTheme="majorBidi" w:hAnsiTheme="majorBidi" w:cstheme="majorBidi"/>
+        </w:rPr>
+      </w:pPr>
+    </w:p>
+    <w:p>
+      <w:pPr>
+        <w:rPr>
+          <w:rFonts w:asciiTheme="majorBidi" w:hAnsiTheme="majorBidi" w:cstheme="majorBidi"/>
+          <w:b/>
+          <w:bCs/>
+        </w:rPr>
+      </w:pPr>
+      <w:r>
+        <w:rPr>
+          <w:rFonts w:asciiTheme="majorBidi" w:hAnsiTheme="majorBidi" w:cstheme="majorBidi"/>
+          <w:b/>
+          <w:bCs/>
+          <w:noProof/>
+        </w:rPr>
+        <w:drawing>
+          <wp:anchor distT="0" distB="0" distL="114300" distR="114300" simplePos="0" relativeHeight="251677696" behindDoc="1" locked="0" layoutInCell="1" allowOverlap="1" wp14:anchorId="422839DE" wp14:editId="1C40DB48">
+            <wp:simplePos x="0" y="0"/>
+            <wp:positionH relativeFrom="column">
+              <wp:posOffset>-791393</wp:posOffset>
+            </wp:positionH>
+            <wp:positionV relativeFrom="paragraph">
+              <wp:posOffset>55308</wp:posOffset>
+            </wp:positionV>
+            <wp:extent cx="3265535" cy="3695574"/>
+            <wp:effectExtent l="0" t="0" r="0" b="635"/>
+            <wp:wrapTight wrapText="bothSides">
+              <wp:wrapPolygon edited="0">
+                <wp:start x="0" y="0"/>
+                <wp:lineTo x="0" y="21492"/>
+                <wp:lineTo x="21424" y="21492"/>
+                <wp:lineTo x="21424" y="0"/>
+                <wp:lineTo x="0" y="0"/>
+              </wp:wrapPolygon>
+            </wp:wrapTight>
+            <wp:docPr id="707849875" name="Picture 1"/>
+            <wp:cNvGraphicFramePr>
+              <a:graphicFrameLocks xmlns:a="http://schemas.openxmlformats.org/drawingml/2006/main" noChangeAspect="1"/>
+            </wp:cNvGraphicFramePr>
+            <a:graphic xmlns:a="http://schemas.openxmlformats.org/drawingml/2006/main">
+              <a:graphicData uri="http://schemas.openxmlformats.org/drawingml/2006/picture">
+                <pic:pic xmlns:pic="http://schemas.openxmlformats.org/drawingml/2006/picture">
+                  <pic:nvPicPr>
+                    <pic:cNvPr id="707849875" name=""/>
+                    <pic:cNvPicPr/>
+                  </pic:nvPicPr>
+                  <pic:blipFill>
+                    <a:blip r:embed="rId7">
+                      <a:extLst>
+                        <a:ext uri="{28A0092B-C50C-407E-A947-70E740481C1C}">
+                          <a14:useLocalDpi xmlns:a14="http://schemas.microsoft.com/office/drawing/2010/main" val="0"/>
+                        </a:ext>
+                      </a:extLst>
+                    </a:blip>
+                    <a:stretch>
+                      <a:fillRect/>
+                    </a:stretch>
+                  </pic:blipFill>
+                  <pic:spPr>
+                    <a:xfrm>
+                      <a:off x="0" y="0"/>
+                      <a:ext cx="3265535" cy="3695574"/>
+                    </a:xfrm>
+                    <a:prstGeom prst="rect">
+                      <a:avLst/>
+                    </a:prstGeom>
+                  </pic:spPr>
+                </pic:pic>
+              </a:graphicData>
+            </a:graphic>
+            <wp14:sizeRelH relativeFrom="margin">
+              <wp14:pctWidth>0</wp14:pctWidth>
+            </wp14:sizeRelH>
+            <wp14:sizeRelV relativeFrom="margin">
+              <wp14:pctHeight>0</wp14:pctHeight>
+            </wp14:sizeRelV>
+          </wp:anchor>
+        </w:drawing>
+      </w:r>
+      <w:r>
+        <w:rPr>
+          <w:rFonts w:asciiTheme="majorBidi" w:hAnsiTheme="majorBidi" w:cstheme="majorBidi"/>
+          <w:b/>
+          <w:bCs/>
+          <w:noProof/>
+        </w:rPr>
+        <w:drawing>
+          <wp:anchor distT="0" distB="0" distL="114300" distR="114300" simplePos="0" relativeHeight="251679744" behindDoc="1" locked="0" layoutInCell="1" allowOverlap="1" wp14:anchorId="7F2926A1" wp14:editId="68BBE7A5">
+            <wp:simplePos x="0" y="0"/>
+            <wp:positionH relativeFrom="page">
+              <wp:posOffset>45720</wp:posOffset>
+            </wp:positionH>
+            <wp:positionV relativeFrom="paragraph">
+              <wp:posOffset>3909060</wp:posOffset>
+            </wp:positionV>
+            <wp:extent cx="3741420" cy="3939540"/>
+            <wp:effectExtent l="0" t="0" r="0" b="3810"/>
+            <wp:wrapTight wrapText="bothSides">
+              <wp:wrapPolygon edited="0">
+                <wp:start x="0" y="0"/>
+                <wp:lineTo x="0" y="21516"/>
+                <wp:lineTo x="21446" y="21516"/>
+                <wp:lineTo x="21446" y="0"/>
+                <wp:lineTo x="0" y="0"/>
+              </wp:wrapPolygon>
+            </wp:wrapTight>
+            <wp:docPr id="1181685341" name="Picture 1"/>
+            <wp:cNvGraphicFramePr>
+              <a:graphicFrameLocks xmlns:a="http://schemas.openxmlformats.org/drawingml/2006/main" noChangeAspect="1"/>
+            </wp:cNvGraphicFramePr>
+            <a:graphic xmlns:a="http://schemas.openxmlformats.org/drawingml/2006/main">
+              <a:graphicData uri="http://schemas.openxmlformats.org/drawingml/2006/picture">
+                <pic:pic xmlns:pic="http://schemas.openxmlformats.org/drawingml/2006/picture">
+                  <pic:nvPicPr>
+                    <pic:cNvPr id="1181685341" name=""/>
+                    <pic:cNvPicPr/>
+                  </pic:nvPicPr>
+                  <pic:blipFill rotWithShape="1">
+                    <a:blip r:embed="rId8">
+                      <a:extLst>
+                        <a:ext uri="{28A0092B-C50C-407E-A947-70E740481C1C}">
+                          <a14:useLocalDpi xmlns:a14="http://schemas.microsoft.com/office/drawing/2010/main" val="0"/>
+                        </a:ext>
+                      </a:extLst>
+                    </a:blip>
+                    <a:srcRect r="7213"/>
+                    <a:stretch>
+                      <a:fillRect/>
+                    </a:stretch>
+                  </pic:blipFill>
+                  <pic:spPr bwMode="auto">
+                    <a:xfrm>
+                      <a:off x="0" y="0"/>
+                      <a:ext cx="3741420" cy="3939540"/>
+                    </a:xfrm>
+                    <a:prstGeom prst="rect">
+                      <a:avLst/>
+                    </a:prstGeom>
+                    <a:ln>
+                      <a:noFill/>
+                    </a:ln>
+                    <a:extLst>
+                      <a:ext uri="{53640926-AAD7-44D8-BBD7-CCE9431645EC}">
+                        <a14:shadowObscured xmlns:a14="http://schemas.microsoft.com/office/drawing/2010/main"/>
+                      </a:ext>
+                    </a:extLst>
+                  </pic:spPr>
+                </pic:pic>
+              </a:graphicData>
+            </a:graphic>
+            <wp14:sizeRelH relativeFrom="margin">
+              <wp14:pctWidth>0</wp14:pctWidth>
+            </wp14:sizeRelH>
+            <wp14:sizeRelV relativeFrom="margin">
+              <wp14:pctHeight>0</wp14:pctHeight>
+            </wp14:sizeRelV>
+          </wp:anchor>
+        </w:drawing>
+      </w:r>
+      <w:r>
+        <w:rPr>
+          <w:rFonts w:asciiTheme="majorBidi" w:hAnsiTheme="majorBidi" w:cstheme="majorBidi"/>
+          <w:b/>
+          <w:bCs/>
+          <w:noProof/>
+        </w:rPr>
+        <w:drawing>
+          <wp:anchor distT="0" distB="0" distL="114300" distR="114300" simplePos="0" relativeHeight="251680768" behindDoc="1" locked="0" layoutInCell="1" allowOverlap="1" wp14:anchorId="0BB29A35" wp14:editId="5DD2A0FE">
+            <wp:simplePos x="0" y="0"/>
+            <wp:positionH relativeFrom="page">
+              <wp:align>right</wp:align>
+            </wp:positionH>
+            <wp:positionV relativeFrom="paragraph">
+              <wp:posOffset>3692525</wp:posOffset>
+            </wp:positionV>
+            <wp:extent cx="3947160" cy="4530800"/>
+            <wp:effectExtent l="0" t="0" r="0" b="3175"/>
+            <wp:wrapTight wrapText="bothSides">
+              <wp:wrapPolygon edited="0">
+                <wp:start x="0" y="0"/>
+                <wp:lineTo x="0" y="21524"/>
+                <wp:lineTo x="21475" y="21524"/>
+                <wp:lineTo x="21475" y="0"/>
+                <wp:lineTo x="0" y="0"/>
+              </wp:wrapPolygon>
+            </wp:wrapTight>
+            <wp:docPr id="249915936" name="Picture 1"/>
+            <wp:cNvGraphicFramePr>
+              <a:graphicFrameLocks xmlns:a="http://schemas.openxmlformats.org/drawingml/2006/main" noChangeAspect="1"/>
+            </wp:cNvGraphicFramePr>
+            <a:graphic xmlns:a="http://schemas.openxmlformats.org/drawingml/2006/main">
+              <a:graphicData uri="http://schemas.openxmlformats.org/drawingml/2006/picture">
+                <pic:pic xmlns:pic="http://schemas.openxmlformats.org/drawingml/2006/picture">
+                  <pic:nvPicPr>
+                    <pic:cNvPr id="249915936" name=""/>
+                    <pic:cNvPicPr/>
+                  </pic:nvPicPr>
+                  <pic:blipFill>
+                    <a:blip r:embed="rId9">
+                      <a:extLst>
+                        <a:ext uri="{28A0092B-C50C-407E-A947-70E740481C1C}">
+                          <a14:useLocalDpi xmlns:a14="http://schemas.microsoft.com/office/drawing/2010/main" val="0"/>
+                        </a:ext>
+                      </a:extLst>
+                    </a:blip>
+                    <a:stretch>
+                      <a:fillRect/>
+                    </a:stretch>
+                  </pic:blipFill>
+                  <pic:spPr>
+                    <a:xfrm>
+                      <a:off x="0" y="0"/>
+                      <a:ext cx="3947160" cy="4530800"/>
+                    </a:xfrm>
+                    <a:prstGeom prst="rect">
+                      <a:avLst/>
+                    </a:prstGeom>
+                  </pic:spPr>
+                </pic:pic>
+              </a:graphicData>
+            </a:graphic>
+          </wp:anchor>
+        </w:drawing>
+      </w:r>
+      <w:r>
+        <w:rPr>
+          <w:rFonts w:asciiTheme="majorBidi" w:hAnsiTheme="majorBidi" w:cstheme="majorBidi"/>
+          <w:b/>
+          <w:bCs/>
+          <w:noProof/>
+        </w:rPr>
+        <w:drawing>
+          <wp:anchor distT="0" distB="0" distL="114300" distR="114300" simplePos="0" relativeHeight="251678720" behindDoc="1" locked="0" layoutInCell="1" allowOverlap="1" wp14:anchorId="747723E3" wp14:editId="19A89FB9">
+            <wp:simplePos x="0" y="0"/>
+            <wp:positionH relativeFrom="page">
+              <wp:align>right</wp:align>
+            </wp:positionH>
+            <wp:positionV relativeFrom="paragraph">
+              <wp:posOffset>0</wp:posOffset>
+            </wp:positionV>
+            <wp:extent cx="4196715" cy="3606800"/>
+            <wp:effectExtent l="0" t="0" r="0" b="0"/>
+            <wp:wrapTight wrapText="bothSides">
+              <wp:wrapPolygon edited="0">
+                <wp:start x="0" y="0"/>
+                <wp:lineTo x="0" y="21448"/>
+                <wp:lineTo x="21473" y="21448"/>
+                <wp:lineTo x="21473" y="0"/>
+                <wp:lineTo x="0" y="0"/>
+              </wp:wrapPolygon>
+            </wp:wrapTight>
+            <wp:docPr id="879635022" name="Picture 1"/>
+            <wp:cNvGraphicFramePr>
+              <a:graphicFrameLocks xmlns:a="http://schemas.openxmlformats.org/drawingml/2006/main" noChangeAspect="1"/>
+            </wp:cNvGraphicFramePr>
+            <a:graphic xmlns:a="http://schemas.openxmlformats.org/drawingml/2006/main">
+              <a:graphicData uri="http://schemas.openxmlformats.org/drawingml/2006/picture">
+                <pic:pic xmlns:pic="http://schemas.openxmlformats.org/drawingml/2006/picture">
+                  <pic:nvPicPr>
+                    <pic:cNvPr id="879635022" name=""/>
+                    <pic:cNvPicPr/>
+                  </pic:nvPicPr>
+                  <pic:blipFill>
+                    <a:blip r:embed="rId10">
+                      <a:extLst>
+                        <a:ext uri="{28A0092B-C50C-407E-A947-70E740481C1C}">
+                          <a14:useLocalDpi xmlns:a14="http://schemas.microsoft.com/office/drawing/2010/main" val="0"/>
+                        </a:ext>
+                      </a:extLst>
+                    </a:blip>
+                    <a:stretch>
+                      <a:fillRect/>
+                    </a:stretch>
+                  </pic:blipFill>
+                  <pic:spPr>
+                    <a:xfrm>
+                      <a:off x="0" y="0"/>
+                      <a:ext cx="4196715" cy="3606800"/>
+                    </a:xfrm>
+                    <a:prstGeom prst="rect">
+                      <a:avLst/>
+                    </a:prstGeom>
+                  </pic:spPr>
+                </pic:pic>
+              </a:graphicData>
+            </a:graphic>
+            <wp14:sizeRelH relativeFrom="margin">
+              <wp14:pctWidth>0</wp14:pctWidth>
+            </wp14:sizeRelH>
+            <wp14:sizeRelV relativeFrom="margin">
+              <wp14:pctHeight>0</wp14:pctHeight>
+            </wp14:sizeRelV>
+          </wp:anchor>
+        </w:drawing>
+      </w:r>
+    </w:p>
+    <w:p>
+      <w:pPr>
+        <w:rPr>
+          <w:rFonts w:asciiTheme="majorBidi" w:hAnsiTheme="majorBidi" w:cstheme="majorBidi"/>
+        </w:rPr>
+      </w:pPr>
+      <w:r>
+        <w:rPr>
+          <w:rFonts w:asciiTheme="majorBidi" w:hAnsiTheme="majorBidi" w:cstheme="majorBidi"/>
+          <w:b/>
+          <w:bCs/>
+          <w:noProof/>
+        </w:rPr>
+        <w:drawing>
+          <wp:anchor distT="0" distB="0" distL="114300" distR="114300" simplePos="0" relativeHeight="251665408" behindDoc="1" locked="0" layoutInCell="1" allowOverlap="1" wp14:anchorId="40CA04CA" wp14:editId="2D7165BC">
+            <wp:simplePos x="0" y="0"/>
+            <wp:positionH relativeFrom="page">
+              <wp:align>right</wp:align>
+            </wp:positionH>
+            <wp:positionV relativeFrom="paragraph">
+              <wp:posOffset>0</wp:posOffset>
+            </wp:positionV>
+            <wp:extent cx="3641090" cy="4688205"/>
+            <wp:effectExtent l="0" t="0" r="0" b="0"/>
+            <wp:wrapTight wrapText="bothSides">
+              <wp:wrapPolygon edited="0">
+                <wp:start x="0" y="0"/>
+                <wp:lineTo x="0" y="21503"/>
+                <wp:lineTo x="21472" y="21503"/>
+                <wp:lineTo x="21472" y="0"/>
+                <wp:lineTo x="0" y="0"/>
+              </wp:wrapPolygon>
+            </wp:wrapTight>
+            <wp:docPr id="1594397755" name="Picture 1"/>
+            <wp:cNvGraphicFramePr>
+              <a:graphicFrameLocks xmlns:a="http://schemas.openxmlformats.org/drawingml/2006/main" noChangeAspect="1"/>
+            </wp:cNvGraphicFramePr>
+            <a:graphic xmlns:a="http://schemas.openxmlformats.org/drawingml/2006/main">
+              <a:graphicData uri="http://schemas.openxmlformats.org/drawingml/2006/picture">
+                <pic:pic xmlns:pic="http://schemas.openxmlformats.org/drawingml/2006/picture">
+                  <pic:nvPicPr>
+                    <pic:cNvPr id="1594397755" name=""/>
+                    <pic:cNvPicPr/>
+                  </pic:nvPicPr>
+                  <pic:blipFill>
+                    <a:blip r:embed="rId11">
+                      <a:extLst>
+                        <a:ext uri="{28A0092B-C50C-407E-A947-70E740481C1C}">
+                          <a14:useLocalDpi xmlns:a14="http://schemas.microsoft.com/office/drawing/2010/main" val="0"/>
+                        </a:ext>
+                      </a:extLst>
+                    </a:blip>
+                    <a:stretch>
+                      <a:fillRect/>
+                    </a:stretch>
+                  </pic:blipFill>
+                  <pic:spPr>
+                    <a:xfrm>
+                      <a:off x="0" y="0"/>
+                      <a:ext cx="3641090" cy="4688205"/>
+                    </a:xfrm>
+                    <a:prstGeom prst="rect">
+                      <a:avLst/>
+                    </a:prstGeom>
+                  </pic:spPr>
+                </pic:pic>
+              </a:graphicData>
+            </a:graphic>
+            <wp14:sizeRelH relativeFrom="margin">
+              <wp14:pctWidth>0</wp14:pctWidth>
+            </wp14:sizeRelH>
+            <wp14:sizeRelV relativeFrom="margin">
+              <wp14:pctHeight>0</wp14:pctHeight>
+            </wp14:sizeRelV>
+          </wp:anchor>
+        </w:drawing>
+      </w:r>
+      <w:r>
+        <w:rPr>
+          <w:rFonts w:asciiTheme="majorBidi" w:hAnsiTheme="majorBidi" w:cstheme="majorBidi"/>
+          <w:b/>
+          <w:bCs/>
+          <w:noProof/>
+        </w:rPr>
+        <w:drawing>
+          <wp:anchor distT="0" distB="0" distL="114300" distR="114300" simplePos="0" relativeHeight="251664384" behindDoc="1" locked="0" layoutInCell="1" allowOverlap="1" wp14:anchorId="60CAF94A" wp14:editId="39A1ACC9">
+            <wp:simplePos x="0" y="0"/>
+            <wp:positionH relativeFrom="column">
+              <wp:posOffset>-820420</wp:posOffset>
+            </wp:positionH>
+            <wp:positionV relativeFrom="paragraph">
+              <wp:posOffset>0</wp:posOffset>
+            </wp:positionV>
+            <wp:extent cx="3839845" cy="4290060"/>
+            <wp:effectExtent l="0" t="0" r="8255" b="0"/>
+            <wp:wrapTight wrapText="bothSides">
+              <wp:wrapPolygon edited="0">
+                <wp:start x="0" y="0"/>
+                <wp:lineTo x="0" y="21485"/>
+                <wp:lineTo x="21539" y="21485"/>
+                <wp:lineTo x="21539" y="0"/>
+                <wp:lineTo x="0" y="0"/>
+              </wp:wrapPolygon>
+            </wp:wrapTight>
+            <wp:docPr id="2025287305" name="Picture 1"/>
+            <wp:cNvGraphicFramePr>
+              <a:graphicFrameLocks xmlns:a="http://schemas.openxmlformats.org/drawingml/2006/main" noChangeAspect="1"/>
+            </wp:cNvGraphicFramePr>
+            <a:graphic xmlns:a="http://schemas.openxmlformats.org/drawingml/2006/main">
+              <a:graphicData uri="http://schemas.openxmlformats.org/drawingml/2006/picture">
+                <pic:pic xmlns:pic="http://schemas.openxmlformats.org/drawingml/2006/picture">
+                  <pic:nvPicPr>
+                    <pic:cNvPr id="2025287305" name=""/>
+                    <pic:cNvPicPr/>
+                  </pic:nvPicPr>
+                  <pic:blipFill>
+                    <a:blip r:embed="rId12">
+                      <a:extLst>
+                        <a:ext uri="{28A0092B-C50C-407E-A947-70E740481C1C}">
+                          <a14:useLocalDpi xmlns:a14="http://schemas.microsoft.com/office/drawing/2010/main" val="0"/>
+                        </a:ext>
+                      </a:extLst>
+                    </a:blip>
+                    <a:stretch>
+                      <a:fillRect/>
+                    </a:stretch>
+                  </pic:blipFill>
+                  <pic:spPr>
+                    <a:xfrm>
+                      <a:off x="0" y="0"/>
+                      <a:ext cx="3839845" cy="4290060"/>
+                    </a:xfrm>
+                    <a:prstGeom prst="rect">
+                      <a:avLst/>
+                    </a:prstGeom>
+                  </pic:spPr>
+                </pic:pic>
+              </a:graphicData>
+            </a:graphic>
+          </wp:anchor>
+        </w:drawing>
+      </w:r>
+    </w:p>
+    <w:p>
+      <w:pPr>
+        <w:rPr>
+          <w:rFonts w:asciiTheme="majorBidi" w:hAnsiTheme="majorBidi" w:cstheme="majorBidi"/>
+          <w:b/>
+          <w:bCs/>
+        </w:rPr>
+      </w:pPr>
+    </w:p>
+    <w:p>
+      <w:pPr>
+        <w:rPr>
+          <w:rFonts w:asciiTheme="majorBidi" w:hAnsiTheme="majorBidi" w:cstheme="majorBidi"/>
+          <w:b/>
+          <w:bCs/>
+        </w:rPr>
+      </w:pPr>
+    </w:p>
+    <w:p>
+      <w:pPr>
+        <w:rPr>
+          <w:rFonts w:asciiTheme="majorBidi" w:hAnsiTheme="majorBidi" w:cstheme="majorBidi"/>
+          <w:b/>
+          <w:bCs/>
+        </w:rPr>
+      </w:pPr>
+      <w:r>
+        <w:rPr>
+          <w:rFonts w:asciiTheme="majorBidi" w:hAnsiTheme="majorBidi" w:cstheme="majorBidi"/>
+          <w:b/>
+          <w:bCs/>
+          <w:noProof/>
+        </w:rPr>
+        <w:drawing>
+          <wp:anchor distT="0" distB="0" distL="114300" distR="114300" simplePos="0" relativeHeight="251666432" behindDoc="1" locked="0" layoutInCell="1" allowOverlap="1" wp14:anchorId="242E1388" wp14:editId="0D4961F0">
+            <wp:simplePos x="0" y="0"/>
+            <wp:positionH relativeFrom="page">
+              <wp:posOffset>1016000</wp:posOffset>
+            </wp:positionH>
+            <wp:positionV relativeFrom="paragraph">
+              <wp:posOffset>-467995</wp:posOffset>
+            </wp:positionV>
+            <wp:extent cx="4114800" cy="3298825"/>
+            <wp:effectExtent l="0" t="0" r="0" b="0"/>
+            <wp:wrapTight wrapText="bothSides">
+              <wp:wrapPolygon edited="0">
+                <wp:start x="0" y="0"/>
+                <wp:lineTo x="0" y="21454"/>
+                <wp:lineTo x="21500" y="21454"/>
+                <wp:lineTo x="21500" y="0"/>
+                <wp:lineTo x="0" y="0"/>
+              </wp:wrapPolygon>
+            </wp:wrapTight>
+            <wp:docPr id="357160952" name="Picture 1"/>
+            <wp:cNvGraphicFramePr>
+              <a:graphicFrameLocks xmlns:a="http://schemas.openxmlformats.org/drawingml/2006/main" noChangeAspect="1"/>
+            </wp:cNvGraphicFramePr>
+            <a:graphic xmlns:a="http://schemas.openxmlformats.org/drawingml/2006/main">
+              <a:graphicData uri="http://schemas.openxmlformats.org/drawingml/2006/picture">
+                <pic:pic xmlns:pic="http://schemas.openxmlformats.org/drawingml/2006/picture">
+                  <pic:nvPicPr>
+                    <pic:cNvPr id="357160952" name=""/>
+                    <pic:cNvPicPr/>
+                  </pic:nvPicPr>
+                  <pic:blipFill>
+                    <a:blip r:embed="rId13">
+                      <a:extLst>
+                        <a:ext uri="{28A0092B-C50C-407E-A947-70E740481C1C}">
+                          <a14:useLocalDpi xmlns:a14="http://schemas.microsoft.com/office/drawing/2010/main" val="0"/>
+                        </a:ext>
+                      </a:extLst>
+                    </a:blip>
+                    <a:stretch>
+                      <a:fillRect/>
+                    </a:stretch>
+                  </pic:blipFill>
+                  <pic:spPr>
+                    <a:xfrm>
+                      <a:off x="0" y="0"/>
+                      <a:ext cx="4114800" cy="3298825"/>
+                    </a:xfrm>
+                    <a:prstGeom prst="rect">
+                      <a:avLst/>
+                    </a:prstGeom>
+                  </pic:spPr>
+                </pic:pic>
+              </a:graphicData>
+            </a:graphic>
+            <wp14:sizeRelH relativeFrom="margin">
+              <wp14:pctWidth>0</wp14:pctWidth>
+            </wp14:sizeRelH>
+            <wp14:sizeRelV relativeFrom="margin">
+              <wp14:pctHeight>0</wp14:pctHeight>
+            </wp14:sizeRelV>
+          </wp:anchor>
+        </w:drawing>
+      </w:r>
+    </w:p>
+    <w:p>
+      <w:pPr>
+        <w:rPr>
+          <w:rFonts w:asciiTheme="majorBidi" w:hAnsiTheme="majorBidi" w:cstheme="majorBidi"/>
+          <w:b/>
+          <w:bCs/>
+        </w:rPr>
+      </w:pPr>
+    </w:p>
+    <w:p>
+      <w:pPr>
+        <w:rPr>
+          <w:rFonts w:asciiTheme="majorBidi" w:hAnsiTheme="majorBidi" w:cstheme="majorBidi"/>
+          <w:b/>
+          <w:bCs/>
+        </w:rPr>
+      </w:pPr>
+    </w:p>
+    <w:p>
+      <w:pPr>
+        <w:rPr>
+          <w:rFonts w:asciiTheme="majorBidi" w:hAnsiTheme="majorBidi" w:cstheme="majorBidi"/>
+          <w:b/>
+          <w:bCs/>
+        </w:rPr>
+      </w:pPr>
+    </w:p>
+    <w:p>
+      <w:pPr>
+        <w:rPr>
+          <w:rFonts w:asciiTheme="majorBidi" w:hAnsiTheme="majorBidi" w:cstheme="majorBidi"/>
+        </w:rPr>
+      </w:pPr>
+    </w:p>
+    <w:p>
+      <w:pPr>
+        <w:rPr>
+          <w:rFonts w:asciiTheme="majorBidi" w:hAnsiTheme="majorBidi" w:cstheme="majorBidi"/>
+        </w:rPr>
+      </w:pPr>
+    </w:p>
+    <w:p>
+      <w:pPr>
+        <w:rPr>
+          <w:rFonts w:asciiTheme="majorBidi" w:hAnsiTheme="majorBidi" w:cstheme="majorBidi"/>
+        </w:rPr>
+      </w:pPr>
+    </w:p>
+    <w:p>
+      <w:pPr>
+        <w:rPr>
+          <w:rFonts w:asciiTheme="majorBidi" w:hAnsiTheme="majorBidi" w:cstheme="majorBidi"/>
+        </w:rPr>
+      </w:pPr>
+    </w:p>
+    <w:p>
+      <w:pPr>
+        <w:rPr>
+          <w:rFonts w:asciiTheme="majorBidi" w:hAnsiTheme="majorBidi" w:cstheme="majorBidi"/>
+        </w:rPr>
+      </w:pPr>
+    </w:p>
+    <w:p>
+      <w:pPr>
+        <w:rPr>
+          <w:rFonts w:asciiTheme="majorBidi" w:hAnsiTheme="majorBidi" w:cstheme="majorBidi"/>
+          <w:b/>
+          <w:bCs/>
+        </w:rPr>
+      </w:pPr>
+      <w:r>
+        <w:rPr>
+          <w:rFonts w:asciiTheme="majorBidi" w:hAnsiTheme="majorBidi" w:cstheme="majorBidi"/>
+          <w:b/>
+          <w:bCs/>
+        </w:rPr>
+        <w:t>Output</w:t>
+      </w:r>
+    </w:p>
+    <w:p>
+      <w:pPr>
+        <w:rPr>
+          <w:rFonts w:asciiTheme="majorBidi" w:hAnsiTheme="majorBidi" w:cstheme="majorBidi"/>
+        </w:rPr>
+      </w:pPr>
+      <w:r>
+        <w:rPr>
+          <w:rFonts w:asciiTheme="majorBidi" w:hAnsiTheme="majorBidi" w:cstheme="majorBidi"/>
           <w:b/>
           <w:bCs/>
         </w:rPr>
@@ -55,8 +1891,15 @@
           <w:ilvl w:val="0"/>
           <w:numId w:val="1"/>
         </w:numPr>
-      </w:pPr>
-      <w:r>
+        <w:spacing w:after="0"/>
+        <w:rPr>
+          <w:rFonts w:asciiTheme="majorBidi" w:hAnsiTheme="majorBidi" w:cstheme="majorBidi"/>
+        </w:rPr>
+      </w:pPr>
+      <w:r>
+        <w:rPr>
+          <w:rFonts w:asciiTheme="majorBidi" w:hAnsiTheme="majorBidi" w:cstheme="majorBidi"/>
+        </w:rPr>
         <w:t>Read from Excel file</w:t>
       </w:r>
     </w:p>
@@ -66,22 +1909,34 @@
           <w:ilvl w:val="0"/>
           <w:numId w:val="1"/>
         </w:numPr>
-      </w:pPr>
-      <w:r>
+        <w:spacing w:after="0"/>
+        <w:rPr>
+          <w:rFonts w:asciiTheme="majorBidi" w:hAnsiTheme="majorBidi" w:cstheme="majorBidi"/>
+        </w:rPr>
+      </w:pPr>
+      <w:r>
+        <w:rPr>
+          <w:rFonts w:asciiTheme="majorBidi" w:hAnsiTheme="majorBidi" w:cstheme="majorBidi"/>
+        </w:rPr>
         <w:t>Saved to CSV and Excel formats</w:t>
       </w:r>
     </w:p>
-    <w:p/>
-    <w:p/>
-    <w:p>
-      <w:r>
-        <w:rPr>
+    <w:p>
+      <w:pPr>
+        <w:jc w:val="center"/>
+        <w:rPr>
+          <w:rFonts w:asciiTheme="majorBidi" w:hAnsiTheme="majorBidi" w:cstheme="majorBidi"/>
+        </w:rPr>
+      </w:pPr>
+      <w:r>
+        <w:rPr>
+          <w:rFonts w:asciiTheme="majorBidi" w:hAnsiTheme="majorBidi" w:cstheme="majorBidi"/>
           <w:noProof/>
         </w:rPr>
         <w:drawing>
-          <wp:inline distT="0" distB="0" distL="0" distR="0" wp14:anchorId="1EA6595E" wp14:editId="4FFEC285">
-            <wp:extent cx="5943600" cy="3906520"/>
-            <wp:effectExtent l="0" t="0" r="0" b="0"/>
+          <wp:inline distT="0" distB="0" distL="0" distR="0" wp14:anchorId="30B7087C" wp14:editId="2AC70188">
+            <wp:extent cx="4396740" cy="2889823"/>
+            <wp:effectExtent l="0" t="0" r="3810" b="6350"/>
             <wp:docPr id="927787241" name="Picture 1"/>
             <wp:cNvGraphicFramePr>
               <a:graphicFrameLocks xmlns:a="http://schemas.openxmlformats.org/drawingml/2006/main" noChangeAspect="1"/>
@@ -94,7 +1949,7 @@
                     <pic:cNvPicPr/>
                   </pic:nvPicPr>
                   <pic:blipFill>
-                    <a:blip r:embed="rId5"/>
+                    <a:blip r:embed="rId14"/>
                     <a:stretch>
                       <a:fillRect/>
                     </a:stretch>
@@ -102,7 +1957,7 @@
                   <pic:spPr>
                     <a:xfrm>
                       <a:off x="0" y="0"/>
-                      <a:ext cx="5943600" cy="3906520"/>
+                      <a:ext cx="4403465" cy="2894243"/>
                     </a:xfrm>
                     <a:prstGeom prst="rect">
                       <a:avLst/>
@@ -118,51 +1973,12 @@
     <w:p>
       <w:pPr>
         <w:rPr>
-          <w:rFonts w:ascii="Segoe UI Emoji" w:hAnsi="Segoe UI Emoji" w:cs="Segoe UI Emoji"/>
-        </w:rPr>
-      </w:pPr>
-    </w:p>
-    <w:p>
-      <w:pPr>
-        <w:rPr>
-          <w:rFonts w:ascii="Segoe UI Emoji" w:hAnsi="Segoe UI Emoji" w:cs="Segoe UI Emoji"/>
-        </w:rPr>
-      </w:pPr>
-    </w:p>
-    <w:p>
-      <w:pPr>
-        <w:rPr>
-          <w:rFonts w:ascii="Segoe UI Emoji" w:hAnsi="Segoe UI Emoji" w:cs="Segoe UI Emoji"/>
-        </w:rPr>
-      </w:pPr>
-    </w:p>
-    <w:p>
-      <w:pPr>
-        <w:rPr>
-          <w:rFonts w:ascii="Segoe UI Emoji" w:hAnsi="Segoe UI Emoji" w:cs="Segoe UI Emoji"/>
-        </w:rPr>
-      </w:pPr>
-    </w:p>
-    <w:p>
-      <w:pPr>
-        <w:rPr>
-          <w:rFonts w:ascii="Segoe UI Emoji" w:hAnsi="Segoe UI Emoji" w:cs="Segoe UI Emoji"/>
-        </w:rPr>
-      </w:pPr>
-    </w:p>
-    <w:p>
-      <w:r>
-        <w:rPr>
-          <w:rFonts w:ascii="Segoe UI Emoji" w:hAnsi="Segoe UI Emoji" w:cs="Segoe UI Emoji"/>
-        </w:rPr>
-        <w:lastRenderedPageBreak/>
-        <w:t>✅</w:t>
-      </w:r>
-      <w:r>
-        <w:t> </w:t>
-      </w:r>
-      <w:r>
-        <w:rPr>
+          <w:rFonts w:asciiTheme="majorBidi" w:hAnsiTheme="majorBidi" w:cstheme="majorBidi"/>
+        </w:rPr>
+      </w:pPr>
+      <w:r>
+        <w:rPr>
+          <w:rFonts w:asciiTheme="majorBidi" w:hAnsiTheme="majorBidi" w:cstheme="majorBidi"/>
           <w:b/>
           <w:bCs/>
         </w:rPr>
@@ -175,8 +1991,14 @@
           <w:ilvl w:val="0"/>
           <w:numId w:val="2"/>
         </w:numPr>
-      </w:pPr>
-      <w:r>
+        <w:rPr>
+          <w:rFonts w:asciiTheme="majorBidi" w:hAnsiTheme="majorBidi" w:cstheme="majorBidi"/>
+        </w:rPr>
+      </w:pPr>
+      <w:r>
+        <w:rPr>
+          <w:rFonts w:asciiTheme="majorBidi" w:hAnsiTheme="majorBidi" w:cstheme="majorBidi"/>
+        </w:rPr>
         <w:t>Displayed first/last rows, info, statistics</w:t>
       </w:r>
     </w:p>
@@ -186,20 +2008,35 @@
           <w:ilvl w:val="0"/>
           <w:numId w:val="2"/>
         </w:numPr>
-      </w:pPr>
-      <w:r>
-        <w:t>Showed unique values and distributions</w:t>
-      </w:r>
-    </w:p>
-    <w:p>
-      <w:r>
-        <w:rPr>
+        <w:rPr>
+          <w:rFonts w:asciiTheme="majorBidi" w:hAnsiTheme="majorBidi" w:cstheme="majorBidi"/>
+        </w:rPr>
+      </w:pPr>
+      <w:r>
+        <w:rPr>
+          <w:rFonts w:asciiTheme="majorBidi" w:hAnsiTheme="majorBidi" w:cstheme="majorBidi"/>
           <w:noProof/>
         </w:rPr>
         <w:drawing>
-          <wp:inline distT="0" distB="0" distL="0" distR="0" wp14:anchorId="4F58307D" wp14:editId="1622A317">
-            <wp:extent cx="5334000" cy="4268338"/>
+          <wp:anchor distT="0" distB="0" distL="114300" distR="114300" simplePos="0" relativeHeight="251682816" behindDoc="1" locked="0" layoutInCell="1" allowOverlap="1" wp14:anchorId="7C2BA981" wp14:editId="33EC0C32">
+            <wp:simplePos x="0" y="0"/>
+            <wp:positionH relativeFrom="column">
+              <wp:posOffset>-647700</wp:posOffset>
+            </wp:positionH>
+            <wp:positionV relativeFrom="paragraph">
+              <wp:posOffset>367665</wp:posOffset>
+            </wp:positionV>
+            <wp:extent cx="3506470" cy="2806700"/>
             <wp:effectExtent l="0" t="0" r="0" b="0"/>
+            <wp:wrapTight wrapText="bothSides">
+              <wp:wrapPolygon edited="0">
+                <wp:start x="0" y="0"/>
+                <wp:lineTo x="0" y="21405"/>
+                <wp:lineTo x="21475" y="21405"/>
+                <wp:lineTo x="21475" y="0"/>
+                <wp:lineTo x="0" y="0"/>
+              </wp:wrapPolygon>
+            </wp:wrapTight>
             <wp:docPr id="1905130818" name="Picture 1"/>
             <wp:cNvGraphicFramePr>
               <a:graphicFrameLocks xmlns:a="http://schemas.openxmlformats.org/drawingml/2006/main" noChangeAspect="1"/>
@@ -212,7 +2049,13 @@
                     <pic:cNvPicPr/>
                   </pic:nvPicPr>
                   <pic:blipFill>
-                    <a:blip r:embed="rId6"/>
+                    <a:blip r:embed="rId15" cstate="print">
+                      <a:extLst>
+                        <a:ext uri="{28A0092B-C50C-407E-A947-70E740481C1C}">
+                          <a14:useLocalDpi xmlns:a14="http://schemas.microsoft.com/office/drawing/2010/main" val="0"/>
+                        </a:ext>
+                      </a:extLst>
+                    </a:blip>
                     <a:stretch>
                       <a:fillRect/>
                     </a:stretch>
@@ -220,7 +2063,7 @@
                   <pic:spPr>
                     <a:xfrm>
                       <a:off x="0" y="0"/>
-                      <a:ext cx="5374436" cy="4300696"/>
+                      <a:ext cx="3506470" cy="2806700"/>
                     </a:xfrm>
                     <a:prstGeom prst="rect">
                       <a:avLst/>
@@ -229,19 +2072,54 @@
                 </pic:pic>
               </a:graphicData>
             </a:graphic>
-          </wp:inline>
+            <wp14:sizeRelH relativeFrom="margin">
+              <wp14:pctWidth>0</wp14:pctWidth>
+            </wp14:sizeRelH>
+            <wp14:sizeRelV relativeFrom="margin">
+              <wp14:pctHeight>0</wp14:pctHeight>
+            </wp14:sizeRelV>
+          </wp:anchor>
         </w:drawing>
       </w:r>
-    </w:p>
-    <w:p>
-      <w:r>
-        <w:rPr>
+      <w:r>
+        <w:rPr>
+          <w:rFonts w:asciiTheme="majorBidi" w:hAnsiTheme="majorBidi" w:cstheme="majorBidi"/>
+        </w:rPr>
+        <w:t>Showed unique values and distributions</w:t>
+      </w:r>
+    </w:p>
+    <w:p>
+      <w:pPr>
+        <w:ind w:left="720"/>
+        <w:rPr>
+          <w:rFonts w:asciiTheme="majorBidi" w:hAnsiTheme="majorBidi" w:cstheme="majorBidi"/>
+        </w:rPr>
+      </w:pPr>
+      <w:r>
+        <w:rPr>
+          <w:rFonts w:asciiTheme="majorBidi" w:hAnsiTheme="majorBidi" w:cstheme="majorBidi"/>
           <w:noProof/>
         </w:rPr>
         <w:drawing>
-          <wp:inline distT="0" distB="0" distL="0" distR="0" wp14:anchorId="7EFAA2AE" wp14:editId="14D2043F">
-            <wp:extent cx="5410200" cy="2401067"/>
+          <wp:anchor distT="0" distB="0" distL="114300" distR="114300" simplePos="0" relativeHeight="251684864" behindDoc="1" locked="0" layoutInCell="1" allowOverlap="1" wp14:anchorId="4690D4EC" wp14:editId="409875CD">
+            <wp:simplePos x="0" y="0"/>
+            <wp:positionH relativeFrom="page">
+              <wp:align>right</wp:align>
+            </wp:positionH>
+            <wp:positionV relativeFrom="paragraph">
+              <wp:posOffset>506730</wp:posOffset>
+            </wp:positionV>
+            <wp:extent cx="3797300" cy="1890395"/>
             <wp:effectExtent l="0" t="0" r="0" b="0"/>
+            <wp:wrapTight wrapText="bothSides">
+              <wp:wrapPolygon edited="0">
+                <wp:start x="0" y="0"/>
+                <wp:lineTo x="0" y="21332"/>
+                <wp:lineTo x="21456" y="21332"/>
+                <wp:lineTo x="21456" y="0"/>
+                <wp:lineTo x="0" y="0"/>
+              </wp:wrapPolygon>
+            </wp:wrapTight>
             <wp:docPr id="514827467" name="Picture 1"/>
             <wp:cNvGraphicFramePr>
               <a:graphicFrameLocks xmlns:a="http://schemas.openxmlformats.org/drawingml/2006/main" noChangeAspect="1"/>
@@ -253,47 +2131,86 @@
                     <pic:cNvPr id="514827467" name=""/>
                     <pic:cNvPicPr/>
                   </pic:nvPicPr>
-                  <pic:blipFill>
-                    <a:blip r:embed="rId7"/>
+                  <pic:blipFill rotWithShape="1">
+                    <a:blip r:embed="rId16">
+                      <a:extLst>
+                        <a:ext uri="{28A0092B-C50C-407E-A947-70E740481C1C}">
+                          <a14:useLocalDpi xmlns:a14="http://schemas.microsoft.com/office/drawing/2010/main" val="0"/>
+                        </a:ext>
+                      </a:extLst>
+                    </a:blip>
+                    <a:srcRect r="10840"/>
                     <a:stretch>
                       <a:fillRect/>
                     </a:stretch>
                   </pic:blipFill>
-                  <pic:spPr>
+                  <pic:spPr bwMode="auto">
                     <a:xfrm>
                       <a:off x="0" y="0"/>
-                      <a:ext cx="5437666" cy="2413257"/>
+                      <a:ext cx="3797300" cy="1890395"/>
                     </a:xfrm>
                     <a:prstGeom prst="rect">
                       <a:avLst/>
                     </a:prstGeom>
+                    <a:ln>
+                      <a:noFill/>
+                    </a:ln>
+                    <a:extLst>
+                      <a:ext uri="{53640926-AAD7-44D8-BBD7-CCE9431645EC}">
+                        <a14:shadowObscured xmlns:a14="http://schemas.microsoft.com/office/drawing/2010/main"/>
+                      </a:ext>
+                    </a:extLst>
                   </pic:spPr>
                 </pic:pic>
               </a:graphicData>
             </a:graphic>
-          </wp:inline>
+            <wp14:sizeRelH relativeFrom="margin">
+              <wp14:pctWidth>0</wp14:pctWidth>
+            </wp14:sizeRelH>
+            <wp14:sizeRelV relativeFrom="margin">
+              <wp14:pctHeight>0</wp14:pctHeight>
+            </wp14:sizeRelV>
+          </wp:anchor>
         </w:drawing>
       </w:r>
     </w:p>
     <w:p>
       <w:pPr>
         <w:rPr>
-          <w:rFonts w:ascii="Segoe UI Emoji" w:hAnsi="Segoe UI Emoji" w:cs="Segoe UI Emoji"/>
-        </w:rPr>
-      </w:pPr>
-    </w:p>
-    <w:p>
-      <w:r>
-        <w:rPr>
-          <w:rFonts w:ascii="Segoe UI Emoji" w:hAnsi="Segoe UI Emoji" w:cs="Segoe UI Emoji"/>
-        </w:rPr>
-        <w:t>✅</w:t>
-      </w:r>
-      <w:r>
+          <w:rFonts w:asciiTheme="majorBidi" w:hAnsiTheme="majorBidi" w:cstheme="majorBidi"/>
+        </w:rPr>
+      </w:pPr>
+    </w:p>
+    <w:p>
+      <w:pPr>
+        <w:rPr>
+          <w:rFonts w:asciiTheme="majorBidi" w:hAnsiTheme="majorBidi" w:cstheme="majorBidi"/>
+        </w:rPr>
+      </w:pPr>
+    </w:p>
+    <w:p>
+      <w:pPr>
+        <w:rPr>
+          <w:rFonts w:asciiTheme="majorBidi" w:hAnsiTheme="majorBidi" w:cstheme="majorBidi"/>
+        </w:rPr>
+      </w:pPr>
+    </w:p>
+    <w:p>
+      <w:pPr>
+        <w:spacing w:after="0"/>
+        <w:rPr>
+          <w:rFonts w:asciiTheme="majorBidi" w:hAnsiTheme="majorBidi" w:cstheme="majorBidi"/>
+        </w:rPr>
+      </w:pPr>
+      <w:r>
+        <w:rPr>
+          <w:rFonts w:asciiTheme="majorBidi" w:hAnsiTheme="majorBidi" w:cstheme="majorBidi"/>
+        </w:rPr>
         <w:t> </w:t>
       </w:r>
       <w:r>
         <w:rPr>
+          <w:rFonts w:asciiTheme="majorBidi" w:hAnsiTheme="majorBidi" w:cstheme="majorBidi"/>
           <w:b/>
           <w:bCs/>
         </w:rPr>
@@ -306,8 +2223,15 @@
           <w:ilvl w:val="0"/>
           <w:numId w:val="3"/>
         </w:numPr>
-      </w:pPr>
-      <w:r>
+        <w:spacing w:after="0"/>
+        <w:rPr>
+          <w:rFonts w:asciiTheme="majorBidi" w:hAnsiTheme="majorBidi" w:cstheme="majorBidi"/>
+        </w:rPr>
+      </w:pPr>
+      <w:r>
+        <w:rPr>
+          <w:rFonts w:asciiTheme="majorBidi" w:hAnsiTheme="majorBidi" w:cstheme="majorBidi"/>
+        </w:rPr>
         <w:t>Detected 27 rows with missing values</w:t>
       </w:r>
     </w:p>
@@ -317,8 +2241,15 @@
           <w:ilvl w:val="0"/>
           <w:numId w:val="3"/>
         </w:numPr>
-      </w:pPr>
-      <w:r>
+        <w:spacing w:after="0"/>
+        <w:rPr>
+          <w:rFonts w:asciiTheme="majorBidi" w:hAnsiTheme="majorBidi" w:cstheme="majorBidi"/>
+        </w:rPr>
+      </w:pPr>
+      <w:r>
+        <w:rPr>
+          <w:rFonts w:asciiTheme="majorBidi" w:hAnsiTheme="majorBidi" w:cstheme="majorBidi"/>
+        </w:rPr>
         <w:t>Filled missing numeric values with mean</w:t>
       </w:r>
     </w:p>
@@ -328,8 +2259,15 @@
           <w:ilvl w:val="0"/>
           <w:numId w:val="3"/>
         </w:numPr>
-      </w:pPr>
-      <w:r>
+        <w:spacing w:after="0"/>
+        <w:rPr>
+          <w:rFonts w:asciiTheme="majorBidi" w:hAnsiTheme="majorBidi" w:cstheme="majorBidi"/>
+        </w:rPr>
+      </w:pPr>
+      <w:r>
+        <w:rPr>
+          <w:rFonts w:asciiTheme="majorBidi" w:hAnsiTheme="majorBidi" w:cstheme="majorBidi"/>
+        </w:rPr>
         <w:t>Filled missing text with "Not Provided"</w:t>
       </w:r>
     </w:p>
@@ -339,21 +2277,41 @@
           <w:ilvl w:val="0"/>
           <w:numId w:val="3"/>
         </w:numPr>
-      </w:pPr>
-      <w:r>
+        <w:spacing w:after="0"/>
+        <w:rPr>
+          <w:rFonts w:asciiTheme="majorBidi" w:hAnsiTheme="majorBidi" w:cstheme="majorBidi"/>
+        </w:rPr>
+      </w:pPr>
+      <w:r>
+        <w:rPr>
+          <w:rFonts w:asciiTheme="majorBidi" w:hAnsiTheme="majorBidi" w:cstheme="majorBidi"/>
+        </w:rPr>
         <w:t>Removed duplicate rows</w:t>
       </w:r>
     </w:p>
     <w:p>
       <w:pPr>
+        <w:spacing w:after="0"/>
+        <w:ind w:left="720"/>
+        <w:rPr>
+          <w:rFonts w:asciiTheme="majorBidi" w:hAnsiTheme="majorBidi" w:cstheme="majorBidi"/>
+        </w:rPr>
+      </w:pPr>
+    </w:p>
+    <w:p>
+      <w:pPr>
         <w:ind w:left="360"/>
-      </w:pPr>
-      <w:r>
-        <w:rPr>
+        <w:rPr>
+          <w:rFonts w:asciiTheme="majorBidi" w:hAnsiTheme="majorBidi" w:cstheme="majorBidi"/>
+        </w:rPr>
+      </w:pPr>
+      <w:r>
+        <w:rPr>
+          <w:rFonts w:asciiTheme="majorBidi" w:hAnsiTheme="majorBidi" w:cstheme="majorBidi"/>
           <w:noProof/>
         </w:rPr>
         <w:drawing>
-          <wp:inline distT="0" distB="0" distL="0" distR="0" wp14:anchorId="2F748C64" wp14:editId="5B2A3638">
+          <wp:inline distT="0" distB="0" distL="0" distR="0" wp14:anchorId="146C2BBE" wp14:editId="14D6C6C8">
             <wp:extent cx="5703597" cy="6156960"/>
             <wp:effectExtent l="0" t="0" r="0" b="0"/>
             <wp:docPr id="54555525" name="Picture 1"/>
@@ -368,7 +2326,7 @@
                     <pic:cNvPicPr/>
                   </pic:nvPicPr>
                   <pic:blipFill>
-                    <a:blip r:embed="rId8"/>
+                    <a:blip r:embed="rId17"/>
                     <a:stretch>
                       <a:fillRect/>
                     </a:stretch>
@@ -392,15 +2350,19 @@
     <w:p>
       <w:pPr>
         <w:ind w:left="360"/>
-      </w:pPr>
-      <w:r>
-        <w:rPr>
+        <w:rPr>
+          <w:rFonts w:asciiTheme="majorBidi" w:hAnsiTheme="majorBidi" w:cstheme="majorBidi"/>
+        </w:rPr>
+      </w:pPr>
+      <w:r>
+        <w:rPr>
+          <w:rFonts w:asciiTheme="majorBidi" w:hAnsiTheme="majorBidi" w:cstheme="majorBidi"/>
           <w:noProof/>
         </w:rPr>
         <w:drawing>
-          <wp:inline distT="0" distB="0" distL="0" distR="0" wp14:anchorId="78305480" wp14:editId="0A7430A7">
-            <wp:extent cx="5943600" cy="4130675"/>
-            <wp:effectExtent l="0" t="0" r="0" b="3175"/>
+          <wp:inline distT="0" distB="0" distL="0" distR="0" wp14:anchorId="0E94A753" wp14:editId="683565E3">
+            <wp:extent cx="5397500" cy="3751147"/>
+            <wp:effectExtent l="0" t="0" r="0" b="1905"/>
             <wp:docPr id="407489723" name="Picture 1"/>
             <wp:cNvGraphicFramePr>
               <a:graphicFrameLocks xmlns:a="http://schemas.openxmlformats.org/drawingml/2006/main" noChangeAspect="1"/>
@@ -413,7 +2375,7 @@
                     <pic:cNvPicPr/>
                   </pic:nvPicPr>
                   <pic:blipFill>
-                    <a:blip r:embed="rId9"/>
+                    <a:blip r:embed="rId18"/>
                     <a:stretch>
                       <a:fillRect/>
                     </a:stretch>
@@ -421,7 +2383,7 @@
                   <pic:spPr>
                     <a:xfrm>
                       <a:off x="0" y="0"/>
-                      <a:ext cx="5943600" cy="4130675"/>
+                      <a:ext cx="5401505" cy="3753930"/>
                     </a:xfrm>
                     <a:prstGeom prst="rect">
                       <a:avLst/>
@@ -437,99 +2399,12 @@
     <w:p>
       <w:pPr>
         <w:rPr>
-          <w:rFonts w:ascii="Segoe UI Emoji" w:hAnsi="Segoe UI Emoji" w:cs="Segoe UI Emoji"/>
-        </w:rPr>
-      </w:pPr>
-    </w:p>
-    <w:p>
-      <w:pPr>
-        <w:rPr>
-          <w:rFonts w:ascii="Segoe UI Emoji" w:hAnsi="Segoe UI Emoji" w:cs="Segoe UI Emoji"/>
-        </w:rPr>
-      </w:pPr>
-    </w:p>
-    <w:p>
-      <w:pPr>
-        <w:rPr>
-          <w:rFonts w:ascii="Segoe UI Emoji" w:hAnsi="Segoe UI Emoji" w:cs="Segoe UI Emoji"/>
-        </w:rPr>
-      </w:pPr>
-    </w:p>
-    <w:p>
-      <w:pPr>
-        <w:rPr>
-          <w:rFonts w:ascii="Segoe UI Emoji" w:hAnsi="Segoe UI Emoji" w:cs="Segoe UI Emoji"/>
-        </w:rPr>
-      </w:pPr>
-    </w:p>
-    <w:p>
-      <w:pPr>
-        <w:rPr>
-          <w:rFonts w:ascii="Segoe UI Emoji" w:hAnsi="Segoe UI Emoji" w:cs="Segoe UI Emoji"/>
-        </w:rPr>
-      </w:pPr>
-    </w:p>
-    <w:p>
-      <w:pPr>
-        <w:rPr>
-          <w:rFonts w:ascii="Segoe UI Emoji" w:hAnsi="Segoe UI Emoji" w:cs="Segoe UI Emoji"/>
-        </w:rPr>
-      </w:pPr>
-    </w:p>
-    <w:p>
-      <w:pPr>
-        <w:rPr>
-          <w:rFonts w:ascii="Segoe UI Emoji" w:hAnsi="Segoe UI Emoji" w:cs="Segoe UI Emoji"/>
-        </w:rPr>
-      </w:pPr>
-    </w:p>
-    <w:p>
-      <w:pPr>
-        <w:rPr>
-          <w:rFonts w:ascii="Segoe UI Emoji" w:hAnsi="Segoe UI Emoji" w:cs="Segoe UI Emoji"/>
-        </w:rPr>
-      </w:pPr>
-    </w:p>
-    <w:p>
-      <w:pPr>
-        <w:rPr>
-          <w:rFonts w:ascii="Segoe UI Emoji" w:hAnsi="Segoe UI Emoji" w:cs="Segoe UI Emoji"/>
-        </w:rPr>
-      </w:pPr>
-    </w:p>
-    <w:p>
-      <w:pPr>
-        <w:rPr>
-          <w:rFonts w:ascii="Segoe UI Emoji" w:hAnsi="Segoe UI Emoji" w:cs="Segoe UI Emoji"/>
-        </w:rPr>
-      </w:pPr>
-    </w:p>
-    <w:p>
-      <w:pPr>
-        <w:rPr>
-          <w:rFonts w:ascii="Segoe UI Emoji" w:hAnsi="Segoe UI Emoji" w:cs="Segoe UI Emoji"/>
-        </w:rPr>
-      </w:pPr>
-    </w:p>
-    <w:p>
-      <w:pPr>
-        <w:rPr>
-          <w:rFonts w:ascii="Segoe UI Emoji" w:hAnsi="Segoe UI Emoji" w:cs="Segoe UI Emoji"/>
-        </w:rPr>
-      </w:pPr>
-    </w:p>
-    <w:p>
-      <w:r>
-        <w:rPr>
-          <w:rFonts w:ascii="Segoe UI Emoji" w:hAnsi="Segoe UI Emoji" w:cs="Segoe UI Emoji"/>
-        </w:rPr>
-        <w:t>✅</w:t>
-      </w:r>
-      <w:r>
-        <w:t> </w:t>
-      </w:r>
-      <w:r>
-        <w:rPr>
+          <w:rFonts w:asciiTheme="majorBidi" w:hAnsiTheme="majorBidi" w:cstheme="majorBidi"/>
+        </w:rPr>
+      </w:pPr>
+      <w:r>
+        <w:rPr>
+          <w:rFonts w:asciiTheme="majorBidi" w:hAnsiTheme="majorBidi" w:cstheme="majorBidi"/>
           <w:b/>
           <w:bCs/>
         </w:rPr>
@@ -542,9 +2417,38 @@
           <w:ilvl w:val="0"/>
           <w:numId w:val="4"/>
         </w:numPr>
-      </w:pPr>
-      <w:r>
-        <w:t>categorize_numeric() - Categorized pincode into Low/Medium/High</w:t>
+        <w:spacing w:after="0"/>
+        <w:rPr>
+          <w:rFonts w:asciiTheme="majorBidi" w:hAnsiTheme="majorBidi" w:cstheme="majorBidi"/>
+        </w:rPr>
+      </w:pPr>
+      <w:proofErr w:type="spellStart"/>
+      <w:r>
+        <w:rPr>
+          <w:rFonts w:asciiTheme="majorBidi" w:hAnsiTheme="majorBidi" w:cstheme="majorBidi"/>
+        </w:rPr>
+        <w:t>categorize_numeric</w:t>
+      </w:r>
+      <w:proofErr w:type="spellEnd"/>
+      <w:r>
+        <w:rPr>
+          <w:rFonts w:asciiTheme="majorBidi" w:hAnsiTheme="majorBidi" w:cstheme="majorBidi"/>
+        </w:rPr>
+        <w:t xml:space="preserve">() - Categorized </w:t>
+      </w:r>
+      <w:proofErr w:type="spellStart"/>
+      <w:r>
+        <w:rPr>
+          <w:rFonts w:asciiTheme="majorBidi" w:hAnsiTheme="majorBidi" w:cstheme="majorBidi"/>
+        </w:rPr>
+        <w:t>pincode</w:t>
+      </w:r>
+      <w:proofErr w:type="spellEnd"/>
+      <w:r>
+        <w:rPr>
+          <w:rFonts w:asciiTheme="majorBidi" w:hAnsiTheme="majorBidi" w:cstheme="majorBidi"/>
+        </w:rPr>
+        <w:t xml:space="preserve"> into Low/Medium/High</w:t>
       </w:r>
     </w:p>
     <w:p>
@@ -553,20 +2457,71 @@
           <w:ilvl w:val="0"/>
           <w:numId w:val="4"/>
         </w:numPr>
-      </w:pPr>
-      <w:r>
-        <w:t>generate_code() - Generated state codes (MEG, KAR, UTT, etc.)</w:t>
-      </w:r>
-    </w:p>
-    <w:p>
-      <w:r>
-        <w:rPr>
+        <w:spacing w:after="0"/>
+        <w:rPr>
+          <w:rFonts w:asciiTheme="majorBidi" w:hAnsiTheme="majorBidi" w:cstheme="majorBidi"/>
+        </w:rPr>
+      </w:pPr>
+      <w:proofErr w:type="spellStart"/>
+      <w:r>
+        <w:rPr>
+          <w:rFonts w:asciiTheme="majorBidi" w:hAnsiTheme="majorBidi" w:cstheme="majorBidi"/>
+        </w:rPr>
+        <w:t>generate_code</w:t>
+      </w:r>
+      <w:proofErr w:type="spellEnd"/>
+      <w:r>
+        <w:rPr>
+          <w:rFonts w:asciiTheme="majorBidi" w:hAnsiTheme="majorBidi" w:cstheme="majorBidi"/>
+        </w:rPr>
+        <w:t>() - Generated state codes (MEG, KAR, UTT, etc.)</w:t>
+      </w:r>
+    </w:p>
+    <w:p>
+      <w:pPr>
+        <w:rPr>
+          <w:rFonts w:asciiTheme="majorBidi" w:hAnsiTheme="majorBidi" w:cstheme="majorBidi"/>
+        </w:rPr>
+      </w:pPr>
+    </w:p>
+    <w:p>
+      <w:pPr>
+        <w:rPr>
+          <w:rFonts w:asciiTheme="majorBidi" w:hAnsiTheme="majorBidi" w:cstheme="majorBidi"/>
+        </w:rPr>
+      </w:pPr>
+    </w:p>
+    <w:p>
+      <w:pPr>
+        <w:rPr>
+          <w:rFonts w:asciiTheme="majorBidi" w:hAnsiTheme="majorBidi" w:cstheme="majorBidi"/>
+        </w:rPr>
+      </w:pPr>
+      <w:r>
+        <w:rPr>
+          <w:rFonts w:asciiTheme="majorBidi" w:hAnsiTheme="majorBidi" w:cstheme="majorBidi"/>
           <w:noProof/>
         </w:rPr>
         <w:drawing>
-          <wp:inline distT="0" distB="0" distL="0" distR="0" wp14:anchorId="273E3C3E" wp14:editId="11F5C71E">
-            <wp:extent cx="5573486" cy="5074493"/>
-            <wp:effectExtent l="0" t="0" r="8255" b="0"/>
+          <wp:anchor distT="0" distB="0" distL="114300" distR="114300" simplePos="0" relativeHeight="251672576" behindDoc="1" locked="0" layoutInCell="1" allowOverlap="1" wp14:anchorId="2C34843C" wp14:editId="2454D656">
+            <wp:simplePos x="0" y="0"/>
+            <wp:positionH relativeFrom="column">
+              <wp:posOffset>-480060</wp:posOffset>
+            </wp:positionH>
+            <wp:positionV relativeFrom="paragraph">
+              <wp:posOffset>-287655</wp:posOffset>
+            </wp:positionV>
+            <wp:extent cx="2575560" cy="3147060"/>
+            <wp:effectExtent l="0" t="0" r="0" b="0"/>
+            <wp:wrapTight wrapText="bothSides">
+              <wp:wrapPolygon edited="0">
+                <wp:start x="0" y="0"/>
+                <wp:lineTo x="0" y="21443"/>
+                <wp:lineTo x="21408" y="21443"/>
+                <wp:lineTo x="21408" y="0"/>
+                <wp:lineTo x="0" y="0"/>
+              </wp:wrapPolygon>
+            </wp:wrapTight>
             <wp:docPr id="1594676899" name="Picture 1"/>
             <wp:cNvGraphicFramePr>
               <a:graphicFrameLocks xmlns:a="http://schemas.openxmlformats.org/drawingml/2006/main" noChangeAspect="1"/>
@@ -578,37 +2533,73 @@
                     <pic:cNvPr id="1594676899" name=""/>
                     <pic:cNvPicPr/>
                   </pic:nvPicPr>
-                  <pic:blipFill>
-                    <a:blip r:embed="rId10"/>
+                  <pic:blipFill rotWithShape="1">
+                    <a:blip r:embed="rId19">
+                      <a:extLst>
+                        <a:ext uri="{28A0092B-C50C-407E-A947-70E740481C1C}">
+                          <a14:useLocalDpi xmlns:a14="http://schemas.microsoft.com/office/drawing/2010/main" val="0"/>
+                        </a:ext>
+                      </a:extLst>
+                    </a:blip>
+                    <a:srcRect r="25485"/>
                     <a:stretch>
                       <a:fillRect/>
                     </a:stretch>
                   </pic:blipFill>
-                  <pic:spPr>
+                  <pic:spPr bwMode="auto">
                     <a:xfrm>
                       <a:off x="0" y="0"/>
-                      <a:ext cx="5595914" cy="5094913"/>
+                      <a:ext cx="2575560" cy="3147060"/>
                     </a:xfrm>
                     <a:prstGeom prst="rect">
                       <a:avLst/>
                     </a:prstGeom>
+                    <a:ln>
+                      <a:noFill/>
+                    </a:ln>
+                    <a:extLst>
+                      <a:ext uri="{53640926-AAD7-44D8-BBD7-CCE9431645EC}">
+                        <a14:shadowObscured xmlns:a14="http://schemas.microsoft.com/office/drawing/2010/main"/>
+                      </a:ext>
+                    </a:extLst>
                   </pic:spPr>
                 </pic:pic>
               </a:graphicData>
             </a:graphic>
-          </wp:inline>
+            <wp14:sizeRelH relativeFrom="margin">
+              <wp14:pctWidth>0</wp14:pctWidth>
+            </wp14:sizeRelH>
+            <wp14:sizeRelV relativeFrom="margin">
+              <wp14:pctHeight>0</wp14:pctHeight>
+            </wp14:sizeRelV>
+          </wp:anchor>
         </w:drawing>
       </w:r>
-    </w:p>
-    <w:p>
-      <w:r>
-        <w:rPr>
+      <w:r>
+        <w:rPr>
+          <w:rFonts w:asciiTheme="majorBidi" w:hAnsiTheme="majorBidi" w:cstheme="majorBidi"/>
           <w:noProof/>
         </w:rPr>
         <w:drawing>
-          <wp:inline distT="0" distB="0" distL="0" distR="0" wp14:anchorId="7C64273A" wp14:editId="64CA2B0B">
-            <wp:extent cx="5414459" cy="2035628"/>
-            <wp:effectExtent l="0" t="0" r="0" b="3175"/>
+          <wp:anchor distT="0" distB="0" distL="114300" distR="114300" simplePos="0" relativeHeight="251674624" behindDoc="1" locked="0" layoutInCell="1" allowOverlap="1" wp14:anchorId="6663C3D2" wp14:editId="0341201E">
+            <wp:simplePos x="0" y="0"/>
+            <wp:positionH relativeFrom="page">
+              <wp:posOffset>3268980</wp:posOffset>
+            </wp:positionH>
+            <wp:positionV relativeFrom="paragraph">
+              <wp:posOffset>197485</wp:posOffset>
+            </wp:positionV>
+            <wp:extent cx="4418430" cy="1661160"/>
+            <wp:effectExtent l="0" t="0" r="1270" b="0"/>
+            <wp:wrapTight wrapText="bothSides">
+              <wp:wrapPolygon edited="0">
+                <wp:start x="0" y="0"/>
+                <wp:lineTo x="0" y="21303"/>
+                <wp:lineTo x="21513" y="21303"/>
+                <wp:lineTo x="21513" y="0"/>
+                <wp:lineTo x="0" y="0"/>
+              </wp:wrapPolygon>
+            </wp:wrapTight>
             <wp:docPr id="1543284002" name="Picture 1"/>
             <wp:cNvGraphicFramePr>
               <a:graphicFrameLocks xmlns:a="http://schemas.openxmlformats.org/drawingml/2006/main" noChangeAspect="1"/>
@@ -621,7 +2612,13 @@
                     <pic:cNvPicPr/>
                   </pic:nvPicPr>
                   <pic:blipFill>
-                    <a:blip r:embed="rId11"/>
+                    <a:blip r:embed="rId20" cstate="print">
+                      <a:extLst>
+                        <a:ext uri="{28A0092B-C50C-407E-A947-70E740481C1C}">
+                          <a14:useLocalDpi xmlns:a14="http://schemas.microsoft.com/office/drawing/2010/main" val="0"/>
+                        </a:ext>
+                      </a:extLst>
+                    </a:blip>
                     <a:stretch>
                       <a:fillRect/>
                     </a:stretch>
@@ -629,7 +2626,7 @@
                   <pic:spPr>
                     <a:xfrm>
                       <a:off x="0" y="0"/>
-                      <a:ext cx="5444932" cy="2047085"/>
+                      <a:ext cx="4418430" cy="1661160"/>
                     </a:xfrm>
                     <a:prstGeom prst="rect">
                       <a:avLst/>
@@ -638,22 +2635,53 @@
                 </pic:pic>
               </a:graphicData>
             </a:graphic>
-          </wp:inline>
+            <wp14:sizeRelH relativeFrom="margin">
+              <wp14:pctWidth>0</wp14:pctWidth>
+            </wp14:sizeRelH>
+            <wp14:sizeRelV relativeFrom="margin">
+              <wp14:pctHeight>0</wp14:pctHeight>
+            </wp14:sizeRelV>
+          </wp:anchor>
         </w:drawing>
       </w:r>
     </w:p>
     <w:p>
-      <w:r>
-        <w:rPr>
-          <w:rFonts w:ascii="Segoe UI Emoji" w:hAnsi="Segoe UI Emoji" w:cs="Segoe UI Emoji"/>
-        </w:rPr>
-        <w:t>✅</w:t>
-      </w:r>
-      <w:r>
+      <w:pPr>
+        <w:rPr>
+          <w:rFonts w:asciiTheme="majorBidi" w:hAnsiTheme="majorBidi" w:cstheme="majorBidi"/>
+        </w:rPr>
+      </w:pPr>
+    </w:p>
+    <w:p>
+      <w:pPr>
+        <w:rPr>
+          <w:rFonts w:asciiTheme="majorBidi" w:hAnsiTheme="majorBidi" w:cstheme="majorBidi"/>
+        </w:rPr>
+      </w:pPr>
+    </w:p>
+    <w:p>
+      <w:pPr>
+        <w:rPr>
+          <w:rFonts w:asciiTheme="majorBidi" w:hAnsiTheme="majorBidi" w:cstheme="majorBidi"/>
+        </w:rPr>
+      </w:pPr>
+    </w:p>
+    <w:p>
+      <w:pPr>
+        <w:spacing w:after="0"/>
+        <w:rPr>
+          <w:rFonts w:asciiTheme="majorBidi" w:hAnsiTheme="majorBidi" w:cstheme="majorBidi"/>
+        </w:rPr>
+      </w:pPr>
+      <w:r>
+        <w:rPr>
+          <w:rFonts w:asciiTheme="majorBidi" w:hAnsiTheme="majorBidi" w:cstheme="majorBidi"/>
+        </w:rPr>
         <w:t> </w:t>
       </w:r>
       <w:r>
         <w:rPr>
+          <w:rFonts w:asciiTheme="majorBidi" w:hAnsiTheme="majorBidi" w:cstheme="majorBidi"/>
           <w:b/>
           <w:bCs/>
         </w:rPr>
@@ -666,8 +2694,15 @@
           <w:ilvl w:val="0"/>
           <w:numId w:val="5"/>
         </w:numPr>
-      </w:pPr>
-      <w:r>
+        <w:spacing w:after="0"/>
+        <w:rPr>
+          <w:rFonts w:asciiTheme="majorBidi" w:hAnsiTheme="majorBidi" w:cstheme="majorBidi"/>
+        </w:rPr>
+      </w:pPr>
+      <w:r>
+        <w:rPr>
+          <w:rFonts w:asciiTheme="majorBidi" w:hAnsiTheme="majorBidi" w:cstheme="majorBidi"/>
+        </w:rPr>
         <w:t>Grouped by Date, State, and multiple columns</w:t>
       </w:r>
     </w:p>
@@ -677,8 +2712,15 @@
           <w:ilvl w:val="0"/>
           <w:numId w:val="5"/>
         </w:numPr>
-      </w:pPr>
-      <w:r>
+        <w:spacing w:after="0"/>
+        <w:rPr>
+          <w:rFonts w:asciiTheme="majorBidi" w:hAnsiTheme="majorBidi" w:cstheme="majorBidi"/>
+        </w:rPr>
+      </w:pPr>
+      <w:r>
+        <w:rPr>
+          <w:rFonts w:asciiTheme="majorBidi" w:hAnsiTheme="majorBidi" w:cstheme="majorBidi"/>
+        </w:rPr>
         <w:t>Calculated mean, sum, count</w:t>
       </w:r>
     </w:p>
@@ -688,33 +2730,46 @@
           <w:ilvl w:val="0"/>
           <w:numId w:val="5"/>
         </w:numPr>
-      </w:pPr>
-      <w:r>
+        <w:spacing w:after="0"/>
+        <w:rPr>
+          <w:rFonts w:asciiTheme="majorBidi" w:hAnsiTheme="majorBidi" w:cstheme="majorBidi"/>
+        </w:rPr>
+      </w:pPr>
+      <w:r>
+        <w:rPr>
+          <w:rFonts w:asciiTheme="majorBidi" w:hAnsiTheme="majorBidi" w:cstheme="majorBidi"/>
+        </w:rPr>
         <w:t>Created pivot tables</w:t>
       </w:r>
     </w:p>
     <w:p>
-      <w:r>
-        <w:rPr>
+      <w:pPr>
+        <w:rPr>
+          <w:rFonts w:asciiTheme="majorBidi" w:hAnsiTheme="majorBidi" w:cstheme="majorBidi"/>
+        </w:rPr>
+      </w:pPr>
+      <w:r>
+        <w:rPr>
+          <w:rFonts w:asciiTheme="majorBidi" w:hAnsiTheme="majorBidi" w:cstheme="majorBidi"/>
           <w:noProof/>
         </w:rPr>
         <w:drawing>
-          <wp:anchor distT="0" distB="0" distL="114300" distR="114300" simplePos="0" relativeHeight="251658240" behindDoc="1" locked="0" layoutInCell="1" allowOverlap="1" wp14:anchorId="7FF635E3" wp14:editId="44ACD7AC">
+          <wp:anchor distT="0" distB="0" distL="114300" distR="114300" simplePos="0" relativeHeight="251668480" behindDoc="1" locked="0" layoutInCell="1" allowOverlap="1" wp14:anchorId="11128AD9" wp14:editId="2048566F">
             <wp:simplePos x="0" y="0"/>
             <wp:positionH relativeFrom="margin">
-              <wp:align>center</wp:align>
+              <wp:posOffset>137160</wp:posOffset>
             </wp:positionH>
             <wp:positionV relativeFrom="paragraph">
-              <wp:posOffset>300990</wp:posOffset>
+              <wp:posOffset>80010</wp:posOffset>
             </wp:positionV>
-            <wp:extent cx="7254468" cy="5301342"/>
-            <wp:effectExtent l="0" t="0" r="3810" b="0"/>
+            <wp:extent cx="5433060" cy="3970020"/>
+            <wp:effectExtent l="0" t="0" r="0" b="0"/>
             <wp:wrapTight wrapText="bothSides">
               <wp:wrapPolygon edited="0">
                 <wp:start x="0" y="0"/>
-                <wp:lineTo x="0" y="21502"/>
-                <wp:lineTo x="21555" y="21502"/>
-                <wp:lineTo x="21555" y="0"/>
+                <wp:lineTo x="0" y="21455"/>
+                <wp:lineTo x="21509" y="21455"/>
+                <wp:lineTo x="21509" y="0"/>
                 <wp:lineTo x="0" y="0"/>
               </wp:wrapPolygon>
             </wp:wrapTight>
@@ -730,7 +2785,7 @@
                     <pic:cNvPicPr/>
                   </pic:nvPicPr>
                   <pic:blipFill>
-                    <a:blip r:embed="rId12">
+                    <a:blip r:embed="rId21">
                       <a:extLst>
                         <a:ext uri="{28A0092B-C50C-407E-A947-70E740481C1C}">
                           <a14:useLocalDpi xmlns:a14="http://schemas.microsoft.com/office/drawing/2010/main" val="0"/>
@@ -744,7 +2799,7 @@
                   <pic:spPr>
                     <a:xfrm>
                       <a:off x="0" y="0"/>
-                      <a:ext cx="7254468" cy="5301342"/>
+                      <a:ext cx="5433060" cy="3970020"/>
                     </a:xfrm>
                     <a:prstGeom prst="rect">
                       <a:avLst/>
@@ -753,19 +2808,54 @@
                 </pic:pic>
               </a:graphicData>
             </a:graphic>
+            <wp14:sizeRelH relativeFrom="margin">
+              <wp14:pctWidth>0</wp14:pctWidth>
+            </wp14:sizeRelH>
+            <wp14:sizeRelV relativeFrom="margin">
+              <wp14:pctHeight>0</wp14:pctHeight>
+            </wp14:sizeRelV>
           </wp:anchor>
         </w:drawing>
       </w:r>
     </w:p>
     <w:p>
-      <w:r>
-        <w:rPr>
+      <w:pPr>
+        <w:rPr>
+          <w:rFonts w:asciiTheme="majorBidi" w:hAnsiTheme="majorBidi" w:cstheme="majorBidi"/>
+        </w:rPr>
+      </w:pPr>
+    </w:p>
+    <w:p>
+      <w:pPr>
+        <w:rPr>
+          <w:rFonts w:asciiTheme="majorBidi" w:hAnsiTheme="majorBidi" w:cstheme="majorBidi"/>
+        </w:rPr>
+      </w:pPr>
+      <w:r>
+        <w:rPr>
+          <w:rFonts w:asciiTheme="majorBidi" w:hAnsiTheme="majorBidi" w:cstheme="majorBidi"/>
           <w:noProof/>
         </w:rPr>
         <w:drawing>
-          <wp:inline distT="0" distB="0" distL="0" distR="0" wp14:anchorId="7387CA74" wp14:editId="2A3CBEE6">
-            <wp:extent cx="5486400" cy="8876996"/>
-            <wp:effectExtent l="0" t="0" r="0" b="635"/>
+          <wp:anchor distT="0" distB="0" distL="114300" distR="114300" simplePos="0" relativeHeight="251675648" behindDoc="1" locked="0" layoutInCell="1" allowOverlap="1" wp14:anchorId="3E437A80" wp14:editId="4710145A">
+            <wp:simplePos x="0" y="0"/>
+            <wp:positionH relativeFrom="margin">
+              <wp:posOffset>114300</wp:posOffset>
+            </wp:positionH>
+            <wp:positionV relativeFrom="paragraph">
+              <wp:posOffset>3594100</wp:posOffset>
+            </wp:positionV>
+            <wp:extent cx="5425440" cy="3133090"/>
+            <wp:effectExtent l="0" t="0" r="3810" b="0"/>
+            <wp:wrapTight wrapText="bothSides">
+              <wp:wrapPolygon edited="0">
+                <wp:start x="0" y="0"/>
+                <wp:lineTo x="0" y="21407"/>
+                <wp:lineTo x="21539" y="21407"/>
+                <wp:lineTo x="21539" y="0"/>
+                <wp:lineTo x="0" y="0"/>
+              </wp:wrapPolygon>
+            </wp:wrapTight>
             <wp:docPr id="717779598" name="Picture 1"/>
             <wp:cNvGraphicFramePr>
               <a:graphicFrameLocks xmlns:a="http://schemas.openxmlformats.org/drawingml/2006/main" noChangeAspect="1"/>
@@ -777,62 +2867,65 @@
                     <pic:cNvPr id="717779598" name=""/>
                     <pic:cNvPicPr/>
                   </pic:nvPicPr>
-                  <pic:blipFill>
-                    <a:blip r:embed="rId13"/>
+                  <pic:blipFill rotWithShape="1">
+                    <a:blip r:embed="rId22">
+                      <a:extLst>
+                        <a:ext uri="{28A0092B-C50C-407E-A947-70E740481C1C}">
+                          <a14:useLocalDpi xmlns:a14="http://schemas.microsoft.com/office/drawing/2010/main" val="0"/>
+                        </a:ext>
+                      </a:extLst>
+                    </a:blip>
+                    <a:srcRect b="61196"/>
                     <a:stretch>
                       <a:fillRect/>
                     </a:stretch>
                   </pic:blipFill>
-                  <pic:spPr>
+                  <pic:spPr bwMode="auto">
                     <a:xfrm>
                       <a:off x="0" y="0"/>
-                      <a:ext cx="5490890" cy="8884261"/>
+                      <a:ext cx="5425440" cy="3133090"/>
                     </a:xfrm>
                     <a:prstGeom prst="rect">
                       <a:avLst/>
                     </a:prstGeom>
+                    <a:ln>
+                      <a:noFill/>
+                    </a:ln>
+                    <a:extLst>
+                      <a:ext uri="{53640926-AAD7-44D8-BBD7-CCE9431645EC}">
+                        <a14:shadowObscured xmlns:a14="http://schemas.microsoft.com/office/drawing/2010/main"/>
+                      </a:ext>
+                    </a:extLst>
                   </pic:spPr>
                 </pic:pic>
               </a:graphicData>
             </a:graphic>
-          </wp:inline>
+            <wp14:sizeRelH relativeFrom="margin">
+              <wp14:pctWidth>0</wp14:pctWidth>
+            </wp14:sizeRelH>
+            <wp14:sizeRelV relativeFrom="margin">
+              <wp14:pctHeight>0</wp14:pctHeight>
+            </wp14:sizeRelV>
+          </wp:anchor>
         </w:drawing>
       </w:r>
     </w:p>
-    <w:p/>
-    <w:p>
-      <w:pPr>
-        <w:rPr>
-          <w:b/>
-          <w:bCs/>
-        </w:rPr>
-      </w:pPr>
-      <w:r>
-        <w:rPr>
-          <w:b/>
-          <w:bCs/>
-        </w:rPr>
-        <w:t>Summary :-</w:t>
-      </w:r>
-    </w:p>
-    <w:p>
-      <w:pPr>
-        <w:rPr>
-          <w:b/>
-          <w:bCs/>
-        </w:rPr>
-      </w:pPr>
-      <w:r>
-        <w:rPr>
-          <w:b/>
-          <w:bCs/>
+    <w:p>
+      <w:pPr>
+        <w:rPr>
+          <w:rFonts w:asciiTheme="majorBidi" w:hAnsiTheme="majorBidi" w:cstheme="majorBidi"/>
+        </w:rPr>
+      </w:pPr>
+      <w:r>
+        <w:rPr>
+          <w:rFonts w:asciiTheme="majorBidi" w:hAnsiTheme="majorBidi" w:cstheme="majorBidi"/>
           <w:noProof/>
         </w:rPr>
         <w:drawing>
-          <wp:inline distT="0" distB="0" distL="0" distR="0" wp14:anchorId="09AA08FA" wp14:editId="7D1713C1">
-            <wp:extent cx="6297367" cy="7445829"/>
-            <wp:effectExtent l="0" t="0" r="8255" b="3175"/>
-            <wp:docPr id="659264605" name="Picture 1"/>
+          <wp:inline distT="0" distB="0" distL="0" distR="0" wp14:anchorId="183EDB27" wp14:editId="64ED2BA4">
+            <wp:extent cx="5486195" cy="5493385"/>
+            <wp:effectExtent l="0" t="0" r="635" b="0"/>
+            <wp:docPr id="1768242056" name="Picture 1"/>
             <wp:cNvGraphicFramePr>
               <a:graphicFrameLocks xmlns:a="http://schemas.openxmlformats.org/drawingml/2006/main" noChangeAspect="1"/>
             </wp:cNvGraphicFramePr>
@@ -840,23 +2933,32 @@
               <a:graphicData uri="http://schemas.openxmlformats.org/drawingml/2006/picture">
                 <pic:pic xmlns:pic="http://schemas.openxmlformats.org/drawingml/2006/picture">
                   <pic:nvPicPr>
-                    <pic:cNvPr id="659264605" name=""/>
+                    <pic:cNvPr id="717779598" name=""/>
                     <pic:cNvPicPr/>
                   </pic:nvPicPr>
-                  <pic:blipFill>
-                    <a:blip r:embed="rId14"/>
+                  <pic:blipFill rotWithShape="1">
+                    <a:blip r:embed="rId22"/>
+                    <a:srcRect t="38114"/>
                     <a:stretch>
                       <a:fillRect/>
                     </a:stretch>
                   </pic:blipFill>
-                  <pic:spPr>
+                  <pic:spPr bwMode="auto">
                     <a:xfrm>
                       <a:off x="0" y="0"/>
-                      <a:ext cx="6301857" cy="7451137"/>
+                      <a:ext cx="5490890" cy="5498086"/>
                     </a:xfrm>
                     <a:prstGeom prst="rect">
                       <a:avLst/>
                     </a:prstGeom>
+                    <a:ln>
+                      <a:noFill/>
+                    </a:ln>
+                    <a:extLst>
+                      <a:ext uri="{53640926-AAD7-44D8-BBD7-CCE9431645EC}">
+                        <a14:shadowObscured xmlns:a14="http://schemas.microsoft.com/office/drawing/2010/main"/>
+                      </a:ext>
+                    </a:extLst>
                   </pic:spPr>
                 </pic:pic>
               </a:graphicData>
@@ -865,7 +2967,61 @@
         </w:drawing>
       </w:r>
     </w:p>
+    <w:p>
+      <w:pPr>
+        <w:rPr>
+          <w:rFonts w:asciiTheme="majorBidi" w:hAnsiTheme="majorBidi" w:cstheme="majorBidi"/>
+          <w:b/>
+          <w:bCs/>
+        </w:rPr>
+      </w:pPr>
+      <w:r>
+        <w:rPr>
+          <w:rFonts w:asciiTheme="majorBidi" w:hAnsiTheme="majorBidi" w:cstheme="majorBidi"/>
+          <w:b/>
+          <w:bCs/>
+        </w:rPr>
+        <w:t>Conclusion</w:t>
+      </w:r>
+    </w:p>
+    <w:p>
+      <w:pPr>
+        <w:rPr>
+          <w:rFonts w:asciiTheme="majorBidi" w:hAnsiTheme="majorBidi" w:cstheme="majorBidi"/>
+        </w:rPr>
+      </w:pPr>
+      <w:r>
+        <w:rPr>
+          <w:rFonts w:asciiTheme="majorBidi" w:hAnsiTheme="majorBidi" w:cstheme="majorBidi"/>
+        </w:rPr>
+        <w:t xml:space="preserve">In this experiment, a comprehensive set of data wrangling operations was successfully demonstrated on the Aadhar Enrollment dataset using the Pandas library. The dataset of 99 records and 7 columns was inspected, cleaned of missing values through mean imputation and placeholder filling, and deduplicated. Derived columns were engineered using custom functions, and the data was sorted, pivoted, and aggregated using </w:t>
+      </w:r>
+      <w:proofErr w:type="spellStart"/>
+      <w:r>
+        <w:rPr>
+          <w:rFonts w:asciiTheme="majorBidi" w:hAnsiTheme="majorBidi" w:cstheme="majorBidi"/>
+        </w:rPr>
+        <w:t>groupby</w:t>
+      </w:r>
+      <w:proofErr w:type="spellEnd"/>
+      <w:r>
+        <w:rPr>
+          <w:rFonts w:asciiTheme="majorBidi" w:hAnsiTheme="majorBidi" w:cstheme="majorBidi"/>
+        </w:rPr>
+        <w:t>() to extract meaningful summaries. File format conversion between Excel and CSV was also demonstrated. These preprocessing steps are essential in any real-world data science pipeline to ensure data quality and readiness for downstream analysis or modeling.</w:t>
+      </w:r>
+    </w:p>
+    <w:p>
+      <w:pPr>
+        <w:rPr>
+          <w:rFonts w:asciiTheme="majorBidi" w:hAnsiTheme="majorBidi" w:cstheme="majorBidi"/>
+          <w:b/>
+          <w:bCs/>
+        </w:rPr>
+      </w:pPr>
+    </w:p>
     <w:sectPr>
+      <w:headerReference w:type="default" r:id="rId23"/>
       <w:pgSz w:w="12240" w:h="15840"/>
       <w:pgMar w:top="1440" w:right="1440" w:bottom="1440" w:left="1440" w:header="720" w:footer="720" w:gutter="0"/>
       <w:cols w:space="720"/>
@@ -875,6 +3031,677 @@
 </w:document>
 </file>
 
+<file path=word/endnotes.xml><?xml version="1.0" encoding="utf-8"?>
+<w:endnotes xmlns:wpc="http://schemas.microsoft.com/office/word/2010/wordprocessingCanvas" xmlns:cx="http://schemas.microsoft.com/office/drawing/2014/chartex" xmlns:cx1="http://schemas.microsoft.com/office/drawing/2015/9/8/chartex" xmlns:cx2="http://schemas.microsoft.com/office/drawing/2015/10/21/chartex" xmlns:cx3="http://schemas.microsoft.com/office/drawing/2016/5/9/chartex" xmlns:cx4="http://schemas.microsoft.com/office/drawing/2016/5/10/chartex" xmlns:cx5="http://schemas.microsoft.com/office/drawing/2016/5/11/chartex" xmlns:cx6="http://schemas.microsoft.com/office/drawing/2016/5/12/chartex" xmlns:cx7="http://schemas.microsoft.com/office/drawing/2016/5/13/chartex" xmlns:cx8="http://schemas.microsoft.com/office/drawing/2016/5/14/chartex" xmlns:mc="http://schemas.openxmlformats.org/markup-compatibility/2006" xmlns:aink="http://schemas.microsoft.com/office/drawing/2016/ink" xmlns:am3d="http://schemas.microsoft.com/office/drawing/2017/model3d" xmlns:o="urn:schemas-microsoft-com:office:office" xmlns:oel="http://schemas.microsoft.com/office/2019/extlst" xmlns:r="http://schemas.openxmlformats.org/officeDocument/2006/relationships" xmlns:m="http://schemas.openxmlformats.org/officeDocument/2006/math" xmlns:v="urn:schemas-microsoft-com:vml" xmlns:wp14="http://schemas.microsoft.com/office/word/2010/wordprocessingDrawing" xmlns:wp="http://schemas.openxmlformats.org/drawingml/2006/wordprocessingDrawing" xmlns:w10="urn:schemas-microsoft-com:office:word" xmlns:w="http://schemas.openxmlformats.org/wordprocessingml/2006/main" xmlns:w14="http://schemas.microsoft.com/office/word/2010/wordml" xmlns:w15="http://schemas.microsoft.com/office/word/2012/wordml" xmlns:w16cex="http://schemas.microsoft.com/office/word/2018/wordml/cex" xmlns:w16cid="http://schemas.microsoft.com/office/word/2016/wordml/cid" xmlns:w16="http://schemas.microsoft.com/office/word/2018/wordml" xmlns:w16du="http://schemas.microsoft.com/office/word/2023/wordml/word16du" xmlns:w16sdtdh="http://schemas.microsoft.com/office/word/2020/wordml/sdtdatahash" xmlns:w16sdtfl="http://schemas.microsoft.com/office/word/2024/wordml/sdtformatlock" xmlns:w16se="http://schemas.microsoft.com/office/word/2015/wordml/symex" xmlns:wpg="http://schemas.microsoft.com/office/word/2010/wordprocessingGroup" xmlns:wpi="http://schemas.microsoft.com/office/word/2010/wordprocessingInk" xmlns:wne="http://schemas.microsoft.com/office/word/2006/wordml" xmlns:wps="http://schemas.microsoft.com/office/word/2010/wordprocessingShape" mc:Ignorable="w14 w15 w16se w16cid w16 w16cex w16sdtdh w16sdtfl w16du wp14">
+  <w:endnote w:type="separator" w:id="-1">
+    <w:p>
+      <w:pPr>
+        <w:spacing w:after="0" w:line="240" w:lineRule="auto"/>
+      </w:pPr>
+      <w:r>
+        <w:separator/>
+      </w:r>
+    </w:p>
+  </w:endnote>
+  <w:endnote w:type="continuationSeparator" w:id="0">
+    <w:p>
+      <w:pPr>
+        <w:spacing w:after="0" w:line="240" w:lineRule="auto"/>
+      </w:pPr>
+      <w:r>
+        <w:continuationSeparator/>
+      </w:r>
+    </w:p>
+  </w:endnote>
+</w:endnotes>
+</file>
+
+<file path=word/footnotes.xml><?xml version="1.0" encoding="utf-8"?>
+<w:footnotes xmlns:wpc="http://schemas.microsoft.com/office/word/2010/wordprocessingCanvas" xmlns:cx="http://schemas.microsoft.com/office/drawing/2014/chartex" xmlns:cx1="http://schemas.microsoft.com/office/drawing/2015/9/8/chartex" xmlns:cx2="http://schemas.microsoft.com/office/drawing/2015/10/21/chartex" xmlns:cx3="http://schemas.microsoft.com/office/drawing/2016/5/9/chartex" xmlns:cx4="http://schemas.microsoft.com/office/drawing/2016/5/10/chartex" xmlns:cx5="http://schemas.microsoft.com/office/drawing/2016/5/11/chartex" xmlns:cx6="http://schemas.microsoft.com/office/drawing/2016/5/12/chartex" xmlns:cx7="http://schemas.microsoft.com/office/drawing/2016/5/13/chartex" xmlns:cx8="http://schemas.microsoft.com/office/drawing/2016/5/14/chartex" xmlns:mc="http://schemas.openxmlformats.org/markup-compatibility/2006" xmlns:aink="http://schemas.microsoft.com/office/drawing/2016/ink" xmlns:am3d="http://schemas.microsoft.com/office/drawing/2017/model3d" xmlns:o="urn:schemas-microsoft-com:office:office" xmlns:oel="http://schemas.microsoft.com/office/2019/extlst" xmlns:r="http://schemas.openxmlformats.org/officeDocument/2006/relationships" xmlns:m="http://schemas.openxmlformats.org/officeDocument/2006/math" xmlns:v="urn:schemas-microsoft-com:vml" xmlns:wp14="http://schemas.microsoft.com/office/word/2010/wordprocessingDrawing" xmlns:wp="http://schemas.openxmlformats.org/drawingml/2006/wordprocessingDrawing" xmlns:w10="urn:schemas-microsoft-com:office:word" xmlns:w="http://schemas.openxmlformats.org/wordprocessingml/2006/main" xmlns:w14="http://schemas.microsoft.com/office/word/2010/wordml" xmlns:w15="http://schemas.microsoft.com/office/word/2012/wordml" xmlns:w16cex="http://schemas.microsoft.com/office/word/2018/wordml/cex" xmlns:w16cid="http://schemas.microsoft.com/office/word/2016/wordml/cid" xmlns:w16="http://schemas.microsoft.com/office/word/2018/wordml" xmlns:w16du="http://schemas.microsoft.com/office/word/2023/wordml/word16du" xmlns:w16sdtdh="http://schemas.microsoft.com/office/word/2020/wordml/sdtdatahash" xmlns:w16sdtfl="http://schemas.microsoft.com/office/word/2024/wordml/sdtformatlock" xmlns:w16se="http://schemas.microsoft.com/office/word/2015/wordml/symex" xmlns:wpg="http://schemas.microsoft.com/office/word/2010/wordprocessingGroup" xmlns:wpi="http://schemas.microsoft.com/office/word/2010/wordprocessingInk" xmlns:wne="http://schemas.microsoft.com/office/word/2006/wordml" xmlns:wps="http://schemas.microsoft.com/office/word/2010/wordprocessingShape" mc:Ignorable="w14 w15 w16se w16cid w16 w16cex w16sdtdh w16sdtfl w16du wp14">
+  <w:footnote w:type="separator" w:id="-1">
+    <w:p>
+      <w:pPr>
+        <w:spacing w:after="0" w:line="240" w:lineRule="auto"/>
+      </w:pPr>
+      <w:r>
+        <w:separator/>
+      </w:r>
+    </w:p>
+  </w:footnote>
+  <w:footnote w:type="continuationSeparator" w:id="0">
+    <w:p>
+      <w:pPr>
+        <w:spacing w:after="0" w:line="240" w:lineRule="auto"/>
+      </w:pPr>
+      <w:r>
+        <w:continuationSeparator/>
+      </w:r>
+    </w:p>
+  </w:footnote>
+</w:footnotes>
+</file>
+
+<file path=word/header1.xml><?xml version="1.0" encoding="utf-8"?>
+<w:hdr xmlns:wpc="http://schemas.microsoft.com/office/word/2010/wordprocessingCanvas" xmlns:cx="http://schemas.microsoft.com/office/drawing/2014/chartex" xmlns:cx1="http://schemas.microsoft.com/office/drawing/2015/9/8/chartex" xmlns:cx2="http://schemas.microsoft.com/office/drawing/2015/10/21/chartex" xmlns:cx3="http://schemas.microsoft.com/office/drawing/2016/5/9/chartex" xmlns:cx4="http://schemas.microsoft.com/office/drawing/2016/5/10/chartex" xmlns:cx5="http://schemas.microsoft.com/office/drawing/2016/5/11/chartex" xmlns:cx6="http://schemas.microsoft.com/office/drawing/2016/5/12/chartex" xmlns:cx7="http://schemas.microsoft.com/office/drawing/2016/5/13/chartex" xmlns:cx8="http://schemas.microsoft.com/office/drawing/2016/5/14/chartex" xmlns:mc="http://schemas.openxmlformats.org/markup-compatibility/2006" xmlns:aink="http://schemas.microsoft.com/office/drawing/2016/ink" xmlns:am3d="http://schemas.microsoft.com/office/drawing/2017/model3d" xmlns:o="urn:schemas-microsoft-com:office:office" xmlns:oel="http://schemas.microsoft.com/office/2019/extlst" xmlns:r="http://schemas.openxmlformats.org/officeDocument/2006/relationships" xmlns:m="http://schemas.openxmlformats.org/officeDocument/2006/math" xmlns:v="urn:schemas-microsoft-com:vml" xmlns:wp14="http://schemas.microsoft.com/office/word/2010/wordprocessingDrawing" xmlns:wp="http://schemas.openxmlformats.org/drawingml/2006/wordprocessingDrawing" xmlns:w10="urn:schemas-microsoft-com:office:word" xmlns:w="http://schemas.openxmlformats.org/wordprocessingml/2006/main" xmlns:w14="http://schemas.microsoft.com/office/word/2010/wordml" xmlns:w15="http://schemas.microsoft.com/office/word/2012/wordml" xmlns:w16cex="http://schemas.microsoft.com/office/word/2018/wordml/cex" xmlns:w16cid="http://schemas.microsoft.com/office/word/2016/wordml/cid" xmlns:w16="http://schemas.microsoft.com/office/word/2018/wordml" xmlns:w16du="http://schemas.microsoft.com/office/word/2023/wordml/word16du" xmlns:w16sdtdh="http://schemas.microsoft.com/office/word/2020/wordml/sdtdatahash" xmlns:w16sdtfl="http://schemas.microsoft.com/office/word/2024/wordml/sdtformatlock" xmlns:w16se="http://schemas.microsoft.com/office/word/2015/wordml/symex" xmlns:wpg="http://schemas.microsoft.com/office/word/2010/wordprocessingGroup" xmlns:wpi="http://schemas.microsoft.com/office/word/2010/wordprocessingInk" xmlns:wne="http://schemas.microsoft.com/office/word/2006/wordml" xmlns:wps="http://schemas.microsoft.com/office/word/2010/wordprocessingShape" mc:Ignorable="w14 w15 w16se w16cid w16 w16cex w16sdtdh w16sdtfl w16du wp14">
+  <w:p>
+    <w:pPr>
+      <w:pStyle w:val="Header"/>
+      <w:rPr>
+        <w:b/>
+      </w:rPr>
+    </w:pPr>
+    <w:r>
+      <w:rPr>
+        <w:b/>
+      </w:rPr>
+      <mc:AlternateContent>
+        <mc:Choice Requires="wps">
+          <w:drawing>
+            <wp:anchor distT="0" distB="0" distL="0" distR="0" simplePos="0" relativeHeight="251659264" behindDoc="1" locked="0" layoutInCell="1" allowOverlap="1" wp14:anchorId="62EFD9AC" wp14:editId="401F0FCD">
+              <wp:simplePos x="0" y="0"/>
+              <wp:positionH relativeFrom="page">
+                <wp:posOffset>1583055</wp:posOffset>
+              </wp:positionH>
+              <wp:positionV relativeFrom="page">
+                <wp:posOffset>109855</wp:posOffset>
+              </wp:positionV>
+              <wp:extent cx="4551680" cy="787400"/>
+              <wp:effectExtent l="0" t="0" r="0" b="0"/>
+              <wp:wrapNone/>
+              <wp:docPr id="1808986258" name="Text Box 2"/>
+              <wp:cNvGraphicFramePr>
+                <a:graphicFrameLocks xmlns:a="http://schemas.openxmlformats.org/drawingml/2006/main"/>
+              </wp:cNvGraphicFramePr>
+              <a:graphic xmlns:a="http://schemas.openxmlformats.org/drawingml/2006/main">
+                <a:graphicData uri="http://schemas.microsoft.com/office/word/2010/wordprocessingShape">
+                  <wps:wsp>
+                    <wps:cNvSpPr txBox="1">
+                      <a:spLocks/>
+                    </wps:cNvSpPr>
+                    <wps:spPr>
+                      <a:xfrm>
+                        <a:off x="0" y="0"/>
+                        <a:ext cx="4551680" cy="787400"/>
+                      </a:xfrm>
+                      <a:prstGeom prst="rect">
+                        <a:avLst/>
+                      </a:prstGeom>
+                    </wps:spPr>
+                    <wps:txbx>
+                      <w:txbxContent>
+                        <w:p>
+                          <w:pPr>
+                            <w:spacing w:line="262" w:lineRule="exact"/>
+                            <w:jc w:val="center"/>
+                            <w:rPr>
+                              <w:rFonts w:ascii="Calibri" w:hAnsi="Calibri"/>
+                              <w:b/>
+                            </w:rPr>
+                          </w:pPr>
+                          <w:r>
+                            <w:rPr>
+                              <w:rFonts w:ascii="Calibri" w:hAnsi="Calibri"/>
+                              <w:b/>
+                            </w:rPr>
+                            <w:t>The</w:t>
+                          </w:r>
+                          <w:r>
+                            <w:rPr>
+                              <w:rFonts w:ascii="Calibri" w:hAnsi="Calibri"/>
+                              <w:b/>
+                              <w:spacing w:val="-9"/>
+                            </w:rPr>
+                            <w:t xml:space="preserve"> </w:t>
+                          </w:r>
+                          <w:r>
+                            <w:rPr>
+                              <w:rFonts w:ascii="Calibri" w:hAnsi="Calibri"/>
+                              <w:b/>
+                            </w:rPr>
+                            <w:t>Bombay</w:t>
+                          </w:r>
+                          <w:r>
+                            <w:rPr>
+                              <w:rFonts w:ascii="Calibri" w:hAnsi="Calibri"/>
+                              <w:b/>
+                              <w:spacing w:val="-5"/>
+                            </w:rPr>
+                            <w:t xml:space="preserve"> </w:t>
+                          </w:r>
+                          <w:r>
+                            <w:rPr>
+                              <w:rFonts w:ascii="Calibri" w:hAnsi="Calibri"/>
+                              <w:b/>
+                            </w:rPr>
+                            <w:t>Salesian</w:t>
+                          </w:r>
+                          <w:r>
+                            <w:rPr>
+                              <w:rFonts w:ascii="Calibri" w:hAnsi="Calibri"/>
+                              <w:b/>
+                              <w:spacing w:val="-3"/>
+                            </w:rPr>
+                            <w:t xml:space="preserve"> </w:t>
+                          </w:r>
+                          <w:r>
+                            <w:rPr>
+                              <w:rFonts w:ascii="Calibri" w:hAnsi="Calibri"/>
+                              <w:b/>
+                            </w:rPr>
+                            <w:t>Society’s</w:t>
+                          </w:r>
+                          <w:r>
+                            <w:rPr>
+                              <w:rFonts w:ascii="Calibri" w:hAnsi="Calibri"/>
+                              <w:b/>
+                              <w:spacing w:val="-3"/>
+                            </w:rPr>
+                            <w:t xml:space="preserve"> </w:t>
+                          </w:r>
+                          <w:r>
+                            <w:rPr>
+                              <w:rFonts w:ascii="Calibri" w:hAnsi="Calibri"/>
+                              <w:b/>
+                            </w:rPr>
+                            <w:t>DON</w:t>
+                          </w:r>
+                          <w:r>
+                            <w:rPr>
+                              <w:rFonts w:ascii="Calibri" w:hAnsi="Calibri"/>
+                              <w:b/>
+                              <w:spacing w:val="-3"/>
+                            </w:rPr>
+                            <w:t xml:space="preserve"> </w:t>
+                          </w:r>
+                          <w:r>
+                            <w:rPr>
+                              <w:rFonts w:ascii="Calibri" w:hAnsi="Calibri"/>
+                              <w:b/>
+                            </w:rPr>
+                            <w:t>BOSCO</w:t>
+                          </w:r>
+                          <w:r>
+                            <w:rPr>
+                              <w:rFonts w:ascii="Calibri" w:hAnsi="Calibri"/>
+                              <w:b/>
+                              <w:spacing w:val="-6"/>
+                            </w:rPr>
+                            <w:t xml:space="preserve"> </w:t>
+                          </w:r>
+                          <w:r>
+                            <w:rPr>
+                              <w:rFonts w:ascii="Calibri" w:hAnsi="Calibri"/>
+                              <w:b/>
+                            </w:rPr>
+                            <w:t>INSTITUTE</w:t>
+                          </w:r>
+                          <w:r>
+                            <w:rPr>
+                              <w:rFonts w:ascii="Calibri" w:hAnsi="Calibri"/>
+                              <w:b/>
+                              <w:spacing w:val="-4"/>
+                            </w:rPr>
+                            <w:t xml:space="preserve"> </w:t>
+                          </w:r>
+                          <w:r>
+                            <w:rPr>
+                              <w:rFonts w:ascii="Calibri" w:hAnsi="Calibri"/>
+                              <w:b/>
+                            </w:rPr>
+                            <w:t>OF</w:t>
+                          </w:r>
+                          <w:r>
+                            <w:rPr>
+                              <w:rFonts w:ascii="Calibri" w:hAnsi="Calibri"/>
+                              <w:b/>
+                              <w:spacing w:val="-3"/>
+                            </w:rPr>
+                            <w:t xml:space="preserve"> </w:t>
+                          </w:r>
+                          <w:r>
+                            <w:rPr>
+                              <w:rFonts w:ascii="Calibri" w:hAnsi="Calibri"/>
+                              <w:b/>
+                              <w:spacing w:val="-2"/>
+                            </w:rPr>
+                            <w:t>TECHNOLOGY</w:t>
+                          </w:r>
+                        </w:p>
+                        <w:p>
+                          <w:pPr>
+                            <w:spacing w:line="268" w:lineRule="auto"/>
+                            <w:ind w:left="14"/>
+                            <w:jc w:val="center"/>
+                            <w:rPr>
+                              <w:rFonts w:ascii="Calibri" w:hAnsi="Times New Roman"/>
+                              <w:b/>
+                            </w:rPr>
+                          </w:pPr>
+                          <w:r>
+                            <w:rPr>
+                              <w:rFonts w:ascii="Calibri"/>
+                              <w:b/>
+                            </w:rPr>
+                            <w:t>(An</w:t>
+                          </w:r>
+                          <w:r>
+                            <w:rPr>
+                              <w:rFonts w:ascii="Calibri"/>
+                              <w:b/>
+                              <w:spacing w:val="-14"/>
+                            </w:rPr>
+                            <w:t xml:space="preserve"> </w:t>
+                          </w:r>
+                          <w:r>
+                            <w:rPr>
+                              <w:rFonts w:ascii="Calibri"/>
+                              <w:b/>
+                            </w:rPr>
+                            <w:t>Autonomous</w:t>
+                          </w:r>
+                          <w:r>
+                            <w:rPr>
+                              <w:rFonts w:ascii="Calibri"/>
+                              <w:b/>
+                              <w:spacing w:val="-14"/>
+                            </w:rPr>
+                            <w:t xml:space="preserve"> </w:t>
+                          </w:r>
+                          <w:r>
+                            <w:rPr>
+                              <w:rFonts w:ascii="Calibri"/>
+                              <w:b/>
+                            </w:rPr>
+                            <w:t>Institute</w:t>
+                          </w:r>
+                          <w:r>
+                            <w:rPr>
+                              <w:rFonts w:ascii="Calibri"/>
+                              <w:b/>
+                              <w:spacing w:val="-13"/>
+                            </w:rPr>
+                            <w:t xml:space="preserve"> </w:t>
+                          </w:r>
+                          <w:r>
+                            <w:rPr>
+                              <w:rFonts w:ascii="Calibri"/>
+                              <w:b/>
+                            </w:rPr>
+                            <w:t>affiliated</w:t>
+                          </w:r>
+                          <w:r>
+                            <w:rPr>
+                              <w:rFonts w:ascii="Calibri"/>
+                              <w:b/>
+                              <w:spacing w:val="-14"/>
+                            </w:rPr>
+                            <w:t xml:space="preserve"> </w:t>
+                          </w:r>
+                          <w:r>
+                            <w:rPr>
+                              <w:rFonts w:ascii="Calibri"/>
+                              <w:b/>
+                            </w:rPr>
+                            <w:t>to</w:t>
+                          </w:r>
+                          <w:r>
+                            <w:rPr>
+                              <w:rFonts w:ascii="Calibri"/>
+                              <w:b/>
+                              <w:spacing w:val="-13"/>
+                            </w:rPr>
+                            <w:t xml:space="preserve"> </w:t>
+                          </w:r>
+                          <w:r>
+                            <w:rPr>
+                              <w:rFonts w:ascii="Calibri"/>
+                              <w:b/>
+                            </w:rPr>
+                            <w:t>University</w:t>
+                          </w:r>
+                          <w:r>
+                            <w:rPr>
+                              <w:rFonts w:ascii="Calibri"/>
+                              <w:b/>
+                              <w:spacing w:val="-14"/>
+                            </w:rPr>
+                            <w:t xml:space="preserve"> </w:t>
+                          </w:r>
+                          <w:r>
+                            <w:rPr>
+                              <w:rFonts w:ascii="Calibri"/>
+                              <w:b/>
+                            </w:rPr>
+                            <w:t>of</w:t>
+                          </w:r>
+                          <w:r>
+                            <w:rPr>
+                              <w:rFonts w:ascii="Calibri"/>
+                              <w:b/>
+                              <w:spacing w:val="-13"/>
+                            </w:rPr>
+                            <w:t xml:space="preserve"> </w:t>
+                          </w:r>
+                          <w:r>
+                            <w:rPr>
+                              <w:rFonts w:ascii="Calibri"/>
+                              <w:b/>
+                            </w:rPr>
+                            <w:t>Mumbai) Department of Information Technology</w:t>
+                          </w:r>
+                        </w:p>
+                      </w:txbxContent>
+                    </wps:txbx>
+                    <wps:bodyPr vertOverflow="clip" horzOverflow="clip" wrap="square" lIns="0" tIns="0" rIns="0" bIns="0" rtlCol="0">
+                      <a:noAutofit/>
+                    </wps:bodyPr>
+                  </wps:wsp>
+                </a:graphicData>
+              </a:graphic>
+              <wp14:sizeRelH relativeFrom="page">
+                <wp14:pctWidth>0</wp14:pctWidth>
+              </wp14:sizeRelH>
+              <wp14:sizeRelV relativeFrom="page">
+                <wp14:pctHeight>0</wp14:pctHeight>
+              </wp14:sizeRelV>
+            </wp:anchor>
+          </w:drawing>
+        </mc:Choice>
+        <mc:Fallback>
+          <w:pict>
+            <v:shapetype w14:anchorId="62EFD9AC" id="_x0000_t202" coordsize="21600,21600" o:spt="202" path="m,l,21600r21600,l21600,xe">
+              <v:stroke joinstyle="miter"/>
+              <v:path gradientshapeok="t" o:connecttype="rect"/>
+            </v:shapetype>
+            <v:shape id="Text Box 2" o:spid="_x0000_s1026" type="#_x0000_t202" style="position:absolute;margin-left:124.65pt;margin-top:8.65pt;width:358.4pt;height:62pt;z-index:-251657216;visibility:visible;mso-wrap-style:square;mso-width-percent:0;mso-height-percent:0;mso-wrap-distance-left:0;mso-wrap-distance-top:0;mso-wrap-distance-right:0;mso-wrap-distance-bottom:0;mso-position-horizontal:absolute;mso-position-horizontal-relative:page;mso-position-vertical:absolute;mso-position-vertical-relative:page;mso-width-percent:0;mso-height-percent:0;mso-width-relative:page;mso-height-relative:page;v-text-anchor:top" o:gfxdata="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" filled="f" stroked="f">
+              <v:textbox inset="0,0,0,0">
+                <w:txbxContent>
+                  <w:p>
+                    <w:pPr>
+                      <w:spacing w:line="262" w:lineRule="exact"/>
+                      <w:jc w:val="center"/>
+                      <w:rPr>
+                        <w:rFonts w:ascii="Calibri" w:hAnsi="Calibri"/>
+                        <w:b/>
+                      </w:rPr>
+                    </w:pPr>
+                    <w:r>
+                      <w:rPr>
+                        <w:rFonts w:ascii="Calibri" w:hAnsi="Calibri"/>
+                        <w:b/>
+                      </w:rPr>
+                      <w:t>The</w:t>
+                    </w:r>
+                    <w:r>
+                      <w:rPr>
+                        <w:rFonts w:ascii="Calibri" w:hAnsi="Calibri"/>
+                        <w:b/>
+                        <w:spacing w:val="-9"/>
+                      </w:rPr>
+                      <w:t xml:space="preserve"> </w:t>
+                    </w:r>
+                    <w:r>
+                      <w:rPr>
+                        <w:rFonts w:ascii="Calibri" w:hAnsi="Calibri"/>
+                        <w:b/>
+                      </w:rPr>
+                      <w:t>Bombay</w:t>
+                    </w:r>
+                    <w:r>
+                      <w:rPr>
+                        <w:rFonts w:ascii="Calibri" w:hAnsi="Calibri"/>
+                        <w:b/>
+                        <w:spacing w:val="-5"/>
+                      </w:rPr>
+                      <w:t xml:space="preserve"> </w:t>
+                    </w:r>
+                    <w:r>
+                      <w:rPr>
+                        <w:rFonts w:ascii="Calibri" w:hAnsi="Calibri"/>
+                        <w:b/>
+                      </w:rPr>
+                      <w:t>Salesian</w:t>
+                    </w:r>
+                    <w:r>
+                      <w:rPr>
+                        <w:rFonts w:ascii="Calibri" w:hAnsi="Calibri"/>
+                        <w:b/>
+                        <w:spacing w:val="-3"/>
+                      </w:rPr>
+                      <w:t xml:space="preserve"> </w:t>
+                    </w:r>
+                    <w:r>
+                      <w:rPr>
+                        <w:rFonts w:ascii="Calibri" w:hAnsi="Calibri"/>
+                        <w:b/>
+                      </w:rPr>
+                      <w:t>Society’s</w:t>
+                    </w:r>
+                    <w:r>
+                      <w:rPr>
+                        <w:rFonts w:ascii="Calibri" w:hAnsi="Calibri"/>
+                        <w:b/>
+                        <w:spacing w:val="-3"/>
+                      </w:rPr>
+                      <w:t xml:space="preserve"> </w:t>
+                    </w:r>
+                    <w:r>
+                      <w:rPr>
+                        <w:rFonts w:ascii="Calibri" w:hAnsi="Calibri"/>
+                        <w:b/>
+                      </w:rPr>
+                      <w:t>DON</w:t>
+                    </w:r>
+                    <w:r>
+                      <w:rPr>
+                        <w:rFonts w:ascii="Calibri" w:hAnsi="Calibri"/>
+                        <w:b/>
+                        <w:spacing w:val="-3"/>
+                      </w:rPr>
+                      <w:t xml:space="preserve"> </w:t>
+                    </w:r>
+                    <w:r>
+                      <w:rPr>
+                        <w:rFonts w:ascii="Calibri" w:hAnsi="Calibri"/>
+                        <w:b/>
+                      </w:rPr>
+                      <w:t>BOSCO</w:t>
+                    </w:r>
+                    <w:r>
+                      <w:rPr>
+                        <w:rFonts w:ascii="Calibri" w:hAnsi="Calibri"/>
+                        <w:b/>
+                        <w:spacing w:val="-6"/>
+                      </w:rPr>
+                      <w:t xml:space="preserve"> </w:t>
+                    </w:r>
+                    <w:r>
+                      <w:rPr>
+                        <w:rFonts w:ascii="Calibri" w:hAnsi="Calibri"/>
+                        <w:b/>
+                      </w:rPr>
+                      <w:t>INSTITUTE</w:t>
+                    </w:r>
+                    <w:r>
+                      <w:rPr>
+                        <w:rFonts w:ascii="Calibri" w:hAnsi="Calibri"/>
+                        <w:b/>
+                        <w:spacing w:val="-4"/>
+                      </w:rPr>
+                      <w:t xml:space="preserve"> </w:t>
+                    </w:r>
+                    <w:r>
+                      <w:rPr>
+                        <w:rFonts w:ascii="Calibri" w:hAnsi="Calibri"/>
+                        <w:b/>
+                      </w:rPr>
+                      <w:t>OF</w:t>
+                    </w:r>
+                    <w:r>
+                      <w:rPr>
+                        <w:rFonts w:ascii="Calibri" w:hAnsi="Calibri"/>
+                        <w:b/>
+                        <w:spacing w:val="-3"/>
+                      </w:rPr>
+                      <w:t xml:space="preserve"> </w:t>
+                    </w:r>
+                    <w:r>
+                      <w:rPr>
+                        <w:rFonts w:ascii="Calibri" w:hAnsi="Calibri"/>
+                        <w:b/>
+                        <w:spacing w:val="-2"/>
+                      </w:rPr>
+                      <w:t>TECHNOLOGY</w:t>
+                    </w:r>
+                  </w:p>
+                  <w:p>
+                    <w:pPr>
+                      <w:spacing w:line="268" w:lineRule="auto"/>
+                      <w:ind w:left="14"/>
+                      <w:jc w:val="center"/>
+                      <w:rPr>
+                        <w:rFonts w:ascii="Calibri" w:hAnsi="Times New Roman"/>
+                        <w:b/>
+                      </w:rPr>
+                    </w:pPr>
+                    <w:r>
+                      <w:rPr>
+                        <w:rFonts w:ascii="Calibri"/>
+                        <w:b/>
+                      </w:rPr>
+                      <w:t>(An</w:t>
+                    </w:r>
+                    <w:r>
+                      <w:rPr>
+                        <w:rFonts w:ascii="Calibri"/>
+                        <w:b/>
+                        <w:spacing w:val="-14"/>
+                      </w:rPr>
+                      <w:t xml:space="preserve"> </w:t>
+                    </w:r>
+                    <w:r>
+                      <w:rPr>
+                        <w:rFonts w:ascii="Calibri"/>
+                        <w:b/>
+                      </w:rPr>
+                      <w:t>Autonomous</w:t>
+                    </w:r>
+                    <w:r>
+                      <w:rPr>
+                        <w:rFonts w:ascii="Calibri"/>
+                        <w:b/>
+                        <w:spacing w:val="-14"/>
+                      </w:rPr>
+                      <w:t xml:space="preserve"> </w:t>
+                    </w:r>
+                    <w:r>
+                      <w:rPr>
+                        <w:rFonts w:ascii="Calibri"/>
+                        <w:b/>
+                      </w:rPr>
+                      <w:t>Institute</w:t>
+                    </w:r>
+                    <w:r>
+                      <w:rPr>
+                        <w:rFonts w:ascii="Calibri"/>
+                        <w:b/>
+                        <w:spacing w:val="-13"/>
+                      </w:rPr>
+                      <w:t xml:space="preserve"> </w:t>
+                    </w:r>
+                    <w:r>
+                      <w:rPr>
+                        <w:rFonts w:ascii="Calibri"/>
+                        <w:b/>
+                      </w:rPr>
+                      <w:t>affiliated</w:t>
+                    </w:r>
+                    <w:r>
+                      <w:rPr>
+                        <w:rFonts w:ascii="Calibri"/>
+                        <w:b/>
+                        <w:spacing w:val="-14"/>
+                      </w:rPr>
+                      <w:t xml:space="preserve"> </w:t>
+                    </w:r>
+                    <w:r>
+                      <w:rPr>
+                        <w:rFonts w:ascii="Calibri"/>
+                        <w:b/>
+                      </w:rPr>
+                      <w:t>to</w:t>
+                    </w:r>
+                    <w:r>
+                      <w:rPr>
+                        <w:rFonts w:ascii="Calibri"/>
+                        <w:b/>
+                        <w:spacing w:val="-13"/>
+                      </w:rPr>
+                      <w:t xml:space="preserve"> </w:t>
+                    </w:r>
+                    <w:r>
+                      <w:rPr>
+                        <w:rFonts w:ascii="Calibri"/>
+                        <w:b/>
+                      </w:rPr>
+                      <w:t>University</w:t>
+                    </w:r>
+                    <w:r>
+                      <w:rPr>
+                        <w:rFonts w:ascii="Calibri"/>
+                        <w:b/>
+                        <w:spacing w:val="-14"/>
+                      </w:rPr>
+                      <w:t xml:space="preserve"> </w:t>
+                    </w:r>
+                    <w:r>
+                      <w:rPr>
+                        <w:rFonts w:ascii="Calibri"/>
+                        <w:b/>
+                      </w:rPr>
+                      <w:t>of</w:t>
+                    </w:r>
+                    <w:r>
+                      <w:rPr>
+                        <w:rFonts w:ascii="Calibri"/>
+                        <w:b/>
+                        <w:spacing w:val="-13"/>
+                      </w:rPr>
+                      <w:t xml:space="preserve"> </w:t>
+                    </w:r>
+                    <w:r>
+                      <w:rPr>
+                        <w:rFonts w:ascii="Calibri"/>
+                        <w:b/>
+                      </w:rPr>
+                      <w:t>Mumbai) Department of Information Technology</w:t>
+                    </w:r>
+                  </w:p>
+                </w:txbxContent>
+              </v:textbox>
+              <w10:wrap anchorx="page" anchory="page"/>
+            </v:shape>
+          </w:pict>
+        </mc:Fallback>
+      </mc:AlternateContent>
+    </w:r>
+  </w:p>
+  <w:p>
+    <w:pPr>
+      <w:pStyle w:val="Header"/>
+      <w:rPr>
+        <w:b/>
+      </w:rPr>
+    </w:pPr>
+  </w:p>
+  <w:p>
+    <w:pPr>
+      <w:pStyle w:val="Header"/>
+    </w:pPr>
+  </w:p>
+</w:hdr>
+</file>
+
 <file path=word/numbering.xml><?xml version="1.0" encoding="utf-8"?>
 <w:numbering xmlns:wpc="http://schemas.microsoft.com/office/word/2010/wordprocessingCanvas" xmlns:cx="http://schemas.microsoft.com/office/drawing/2014/chartex" xmlns:cx1="http://schemas.microsoft.com/office/drawing/2015/9/8/chartex" xmlns:cx2="http://schemas.microsoft.com/office/drawing/2015/10/21/chartex" xmlns:cx3="http://schemas.microsoft.com/office/drawing/2016/5/9/chartex" xmlns:cx4="http://schemas.microsoft.com/office/drawing/2016/5/10/chartex" xmlns:cx5="http://schemas.microsoft.com/office/drawing/2016/5/11/chartex" xmlns:cx6="http://schemas.microsoft.com/office/drawing/2016/5/12/chartex" xmlns:cx7="http://schemas.microsoft.com/office/drawing/2016/5/13/chartex" xmlns:cx8="http://schemas.microsoft.com/office/drawing/2016/5/14/chartex" xmlns:mc="http://schemas.openxmlformats.org/markup-compatibility/2006" xmlns:aink="http://schemas.microsoft.com/office/drawing/2016/ink" xmlns:am3d="http://schemas.microsoft.com/office/drawing/2017/model3d" xmlns:o="urn:schemas-microsoft-com:office:office" xmlns:oel="http://schemas.microsoft.com/office/2019/extlst" xmlns:r="http://schemas.openxmlformats.org/officeDocument/2006/relationships" xmlns:m="http://schemas.openxmlformats.org/officeDocument/2006/math" xmlns:v="urn:schemas-microsoft-com:vml" xmlns:wp14="http://schemas.microsoft.com/office/word/2010/wordprocessingDrawing" xmlns:wp="http://schemas.openxmlformats.org/drawingml/2006/wordprocessingDrawing" xmlns:w10="urn:schemas-microsoft-com:office:word" xmlns:w="http://schemas.openxmlformats.org/wordprocessingml/2006/main" xmlns:w14="http://schemas.microsoft.com/office/word/2010/wordml" xmlns:w15="http://schemas.microsoft.com/office/word/2012/wordml" xmlns:w16cex="http://schemas.microsoft.com/office/word/2018/wordml/cex" xmlns:w16cid="http://schemas.microsoft.com/office/word/2016/wordml/cid" xmlns:w16="http://schemas.microsoft.com/office/word/2018/wordml" xmlns:w16du="http://schemas.microsoft.com/office/word/2023/wordml/word16du" xmlns:w16sdtdh="http://schemas.microsoft.com/office/word/2020/wordml/sdtdatahash" xmlns:w16sdtfl="http://schemas.microsoft.com/office/word/2024/wordml/sdtformatlock" xmlns:w16se="http://schemas.microsoft.com/office/word/2015/wordml/symex" xmlns:wpg="http://schemas.microsoft.com/office/word/2010/wordprocessingGroup" xmlns:wpi="http://schemas.microsoft.com/office/word/2010/wordprocessingInk" xmlns:wne="http://schemas.microsoft.com/office/word/2006/wordml" xmlns:wps="http://schemas.microsoft.com/office/word/2010/wordprocessingShape" mc:Ignorable="w14 w15 w16se w16cid w16 w16cex w16sdtdh w16sdtfl w16du wp14">
   <w:abstractNum w:abstractNumId="0" w15:restartNumberingAfterBreak="0">
@@ -1176,6 +4003,155 @@
     </w:lvl>
   </w:abstractNum>
   <w:abstractNum w:abstractNumId="2" w15:restartNumberingAfterBreak="0">
+    <w:nsid w:val="2FA22689"/>
+    <w:multiLevelType w:val="multilevel"/>
+    <w:tmpl w:val="18DAB602"/>
+    <w:lvl w:ilvl="0">
+      <w:start w:val="1"/>
+      <w:numFmt w:val="bullet"/>
+      <w:lvlText w:val=""/>
+      <w:lvlJc w:val="left"/>
+      <w:pPr>
+        <w:tabs>
+          <w:tab w:val="num" w:pos="720"/>
+        </w:tabs>
+        <w:ind w:left="720" w:hanging="360"/>
+      </w:pPr>
+      <w:rPr>
+        <w:rFonts w:ascii="Symbol" w:hAnsi="Symbol" w:hint="default"/>
+        <w:sz w:val="20"/>
+      </w:rPr>
+    </w:lvl>
+    <w:lvl w:ilvl="1" w:tentative="1">
+      <w:start w:val="1"/>
+      <w:numFmt w:val="bullet"/>
+      <w:lvlText w:val="o"/>
+      <w:lvlJc w:val="left"/>
+      <w:pPr>
+        <w:tabs>
+          <w:tab w:val="num" w:pos="1440"/>
+        </w:tabs>
+        <w:ind w:left="1440" w:hanging="360"/>
+      </w:pPr>
+      <w:rPr>
+        <w:rFonts w:ascii="Courier New" w:hAnsi="Courier New" w:hint="default"/>
+        <w:sz w:val="20"/>
+      </w:rPr>
+    </w:lvl>
+    <w:lvl w:ilvl="2" w:tentative="1">
+      <w:start w:val="1"/>
+      <w:numFmt w:val="bullet"/>
+      <w:lvlText w:val=""/>
+      <w:lvlJc w:val="left"/>
+      <w:pPr>
+        <w:tabs>
+          <w:tab w:val="num" w:pos="2160"/>
+        </w:tabs>
+        <w:ind w:left="2160" w:hanging="360"/>
+      </w:pPr>
+      <w:rPr>
+        <w:rFonts w:ascii="Wingdings" w:hAnsi="Wingdings" w:hint="default"/>
+        <w:sz w:val="20"/>
+      </w:rPr>
+    </w:lvl>
+    <w:lvl w:ilvl="3" w:tentative="1">
+      <w:start w:val="1"/>
+      <w:numFmt w:val="bullet"/>
+      <w:lvlText w:val=""/>
+      <w:lvlJc w:val="left"/>
+      <w:pPr>
+        <w:tabs>
+          <w:tab w:val="num" w:pos="2880"/>
+        </w:tabs>
+        <w:ind w:left="2880" w:hanging="360"/>
+      </w:pPr>
+      <w:rPr>
+        <w:rFonts w:ascii="Wingdings" w:hAnsi="Wingdings" w:hint="default"/>
+        <w:sz w:val="20"/>
+      </w:rPr>
+    </w:lvl>
+    <w:lvl w:ilvl="4" w:tentative="1">
+      <w:start w:val="1"/>
+      <w:numFmt w:val="bullet"/>
+      <w:lvlText w:val=""/>
+      <w:lvlJc w:val="left"/>
+      <w:pPr>
+        <w:tabs>
+          <w:tab w:val="num" w:pos="3600"/>
+        </w:tabs>
+        <w:ind w:left="3600" w:hanging="360"/>
+      </w:pPr>
+      <w:rPr>
+        <w:rFonts w:ascii="Wingdings" w:hAnsi="Wingdings" w:hint="default"/>
+        <w:sz w:val="20"/>
+      </w:rPr>
+    </w:lvl>
+    <w:lvl w:ilvl="5" w:tentative="1">
+      <w:start w:val="1"/>
+      <w:numFmt w:val="bullet"/>
+      <w:lvlText w:val=""/>
+      <w:lvlJc w:val="left"/>
+      <w:pPr>
+        <w:tabs>
+          <w:tab w:val="num" w:pos="4320"/>
+        </w:tabs>
+        <w:ind w:left="4320" w:hanging="360"/>
+      </w:pPr>
+      <w:rPr>
+        <w:rFonts w:ascii="Wingdings" w:hAnsi="Wingdings" w:hint="default"/>
+        <w:sz w:val="20"/>
+      </w:rPr>
+    </w:lvl>
+    <w:lvl w:ilvl="6" w:tentative="1">
+      <w:start w:val="1"/>
+      <w:numFmt w:val="bullet"/>
+      <w:lvlText w:val=""/>
+      <w:lvlJc w:val="left"/>
+      <w:pPr>
+        <w:tabs>
+          <w:tab w:val="num" w:pos="5040"/>
+        </w:tabs>
+        <w:ind w:left="5040" w:hanging="360"/>
+      </w:pPr>
+      <w:rPr>
+        <w:rFonts w:ascii="Wingdings" w:hAnsi="Wingdings" w:hint="default"/>
+        <w:sz w:val="20"/>
+      </w:rPr>
+    </w:lvl>
+    <w:lvl w:ilvl="7" w:tentative="1">
+      <w:start w:val="1"/>
+      <w:numFmt w:val="bullet"/>
+      <w:lvlText w:val=""/>
+      <w:lvlJc w:val="left"/>
+      <w:pPr>
+        <w:tabs>
+          <w:tab w:val="num" w:pos="5760"/>
+        </w:tabs>
+        <w:ind w:left="5760" w:hanging="360"/>
+      </w:pPr>
+      <w:rPr>
+        <w:rFonts w:ascii="Wingdings" w:hAnsi="Wingdings" w:hint="default"/>
+        <w:sz w:val="20"/>
+      </w:rPr>
+    </w:lvl>
+    <w:lvl w:ilvl="8" w:tentative="1">
+      <w:start w:val="1"/>
+      <w:numFmt w:val="bullet"/>
+      <w:lvlText w:val=""/>
+      <w:lvlJc w:val="left"/>
+      <w:pPr>
+        <w:tabs>
+          <w:tab w:val="num" w:pos="6480"/>
+        </w:tabs>
+        <w:ind w:left="6480" w:hanging="360"/>
+      </w:pPr>
+      <w:rPr>
+        <w:rFonts w:ascii="Wingdings" w:hAnsi="Wingdings" w:hint="default"/>
+        <w:sz w:val="20"/>
+      </w:rPr>
+    </w:lvl>
+  </w:abstractNum>
+  <w:abstractNum w:abstractNumId="3" w15:restartNumberingAfterBreak="0">
     <w:nsid w:val="305156DC"/>
     <w:multiLevelType w:val="multilevel"/>
     <w:tmpl w:val="09A8B6B8"/>
@@ -1324,7 +4300,156 @@
       </w:rPr>
     </w:lvl>
   </w:abstractNum>
-  <w:abstractNum w:abstractNumId="3" w15:restartNumberingAfterBreak="0">
+  <w:abstractNum w:abstractNumId="4" w15:restartNumberingAfterBreak="0">
+    <w:nsid w:val="40890CA2"/>
+    <w:multiLevelType w:val="multilevel"/>
+    <w:tmpl w:val="95FEC4F4"/>
+    <w:lvl w:ilvl="0">
+      <w:start w:val="1"/>
+      <w:numFmt w:val="bullet"/>
+      <w:lvlText w:val=""/>
+      <w:lvlJc w:val="left"/>
+      <w:pPr>
+        <w:tabs>
+          <w:tab w:val="num" w:pos="720"/>
+        </w:tabs>
+        <w:ind w:left="720" w:hanging="360"/>
+      </w:pPr>
+      <w:rPr>
+        <w:rFonts w:ascii="Symbol" w:hAnsi="Symbol" w:hint="default"/>
+        <w:sz w:val="20"/>
+      </w:rPr>
+    </w:lvl>
+    <w:lvl w:ilvl="1" w:tentative="1">
+      <w:start w:val="1"/>
+      <w:numFmt w:val="bullet"/>
+      <w:lvlText w:val="o"/>
+      <w:lvlJc w:val="left"/>
+      <w:pPr>
+        <w:tabs>
+          <w:tab w:val="num" w:pos="1440"/>
+        </w:tabs>
+        <w:ind w:left="1440" w:hanging="360"/>
+      </w:pPr>
+      <w:rPr>
+        <w:rFonts w:ascii="Courier New" w:hAnsi="Courier New" w:hint="default"/>
+        <w:sz w:val="20"/>
+      </w:rPr>
+    </w:lvl>
+    <w:lvl w:ilvl="2" w:tentative="1">
+      <w:start w:val="1"/>
+      <w:numFmt w:val="bullet"/>
+      <w:lvlText w:val=""/>
+      <w:lvlJc w:val="left"/>
+      <w:pPr>
+        <w:tabs>
+          <w:tab w:val="num" w:pos="2160"/>
+        </w:tabs>
+        <w:ind w:left="2160" w:hanging="360"/>
+      </w:pPr>
+      <w:rPr>
+        <w:rFonts w:ascii="Wingdings" w:hAnsi="Wingdings" w:hint="default"/>
+        <w:sz w:val="20"/>
+      </w:rPr>
+    </w:lvl>
+    <w:lvl w:ilvl="3" w:tentative="1">
+      <w:start w:val="1"/>
+      <w:numFmt w:val="bullet"/>
+      <w:lvlText w:val=""/>
+      <w:lvlJc w:val="left"/>
+      <w:pPr>
+        <w:tabs>
+          <w:tab w:val="num" w:pos="2880"/>
+        </w:tabs>
+        <w:ind w:left="2880" w:hanging="360"/>
+      </w:pPr>
+      <w:rPr>
+        <w:rFonts w:ascii="Wingdings" w:hAnsi="Wingdings" w:hint="default"/>
+        <w:sz w:val="20"/>
+      </w:rPr>
+    </w:lvl>
+    <w:lvl w:ilvl="4" w:tentative="1">
+      <w:start w:val="1"/>
+      <w:numFmt w:val="bullet"/>
+      <w:lvlText w:val=""/>
+      <w:lvlJc w:val="left"/>
+      <w:pPr>
+        <w:tabs>
+          <w:tab w:val="num" w:pos="3600"/>
+        </w:tabs>
+        <w:ind w:left="3600" w:hanging="360"/>
+      </w:pPr>
+      <w:rPr>
+        <w:rFonts w:ascii="Wingdings" w:hAnsi="Wingdings" w:hint="default"/>
+        <w:sz w:val="20"/>
+      </w:rPr>
+    </w:lvl>
+    <w:lvl w:ilvl="5" w:tentative="1">
+      <w:start w:val="1"/>
+      <w:numFmt w:val="bullet"/>
+      <w:lvlText w:val=""/>
+      <w:lvlJc w:val="left"/>
+      <w:pPr>
+        <w:tabs>
+          <w:tab w:val="num" w:pos="4320"/>
+        </w:tabs>
+        <w:ind w:left="4320" w:hanging="360"/>
+      </w:pPr>
+      <w:rPr>
+        <w:rFonts w:ascii="Wingdings" w:hAnsi="Wingdings" w:hint="default"/>
+        <w:sz w:val="20"/>
+      </w:rPr>
+    </w:lvl>
+    <w:lvl w:ilvl="6" w:tentative="1">
+      <w:start w:val="1"/>
+      <w:numFmt w:val="bullet"/>
+      <w:lvlText w:val=""/>
+      <w:lvlJc w:val="left"/>
+      <w:pPr>
+        <w:tabs>
+          <w:tab w:val="num" w:pos="5040"/>
+        </w:tabs>
+        <w:ind w:left="5040" w:hanging="360"/>
+      </w:pPr>
+      <w:rPr>
+        <w:rFonts w:ascii="Wingdings" w:hAnsi="Wingdings" w:hint="default"/>
+        <w:sz w:val="20"/>
+      </w:rPr>
+    </w:lvl>
+    <w:lvl w:ilvl="7" w:tentative="1">
+      <w:start w:val="1"/>
+      <w:numFmt w:val="bullet"/>
+      <w:lvlText w:val=""/>
+      <w:lvlJc w:val="left"/>
+      <w:pPr>
+        <w:tabs>
+          <w:tab w:val="num" w:pos="5760"/>
+        </w:tabs>
+        <w:ind w:left="5760" w:hanging="360"/>
+      </w:pPr>
+      <w:rPr>
+        <w:rFonts w:ascii="Wingdings" w:hAnsi="Wingdings" w:hint="default"/>
+        <w:sz w:val="20"/>
+      </w:rPr>
+    </w:lvl>
+    <w:lvl w:ilvl="8" w:tentative="1">
+      <w:start w:val="1"/>
+      <w:numFmt w:val="bullet"/>
+      <w:lvlText w:val=""/>
+      <w:lvlJc w:val="left"/>
+      <w:pPr>
+        <w:tabs>
+          <w:tab w:val="num" w:pos="6480"/>
+        </w:tabs>
+        <w:ind w:left="6480" w:hanging="360"/>
+      </w:pPr>
+      <w:rPr>
+        <w:rFonts w:ascii="Wingdings" w:hAnsi="Wingdings" w:hint="default"/>
+        <w:sz w:val="20"/>
+      </w:rPr>
+    </w:lvl>
+  </w:abstractNum>
+  <w:abstractNum w:abstractNumId="5" w15:restartNumberingAfterBreak="0">
     <w:nsid w:val="43F021DD"/>
     <w:multiLevelType w:val="multilevel"/>
     <w:tmpl w:val="85FE0B9C"/>
@@ -1473,7 +4598,7 @@
       </w:rPr>
     </w:lvl>
   </w:abstractNum>
-  <w:abstractNum w:abstractNumId="4" w15:restartNumberingAfterBreak="0">
+  <w:abstractNum w:abstractNumId="6" w15:restartNumberingAfterBreak="0">
     <w:nsid w:val="5FA63B5B"/>
     <w:multiLevelType w:val="multilevel"/>
     <w:tmpl w:val="9F7CCA80"/>
@@ -1622,20 +4747,330 @@
       </w:rPr>
     </w:lvl>
   </w:abstractNum>
+  <w:abstractNum w:abstractNumId="7" w15:restartNumberingAfterBreak="0">
+    <w:nsid w:val="624A7E3F"/>
+    <w:multiLevelType w:val="multilevel"/>
+    <w:tmpl w:val="373C79F0"/>
+    <w:lvl w:ilvl="0">
+      <w:start w:val="1"/>
+      <w:numFmt w:val="bullet"/>
+      <w:lvlText w:val=""/>
+      <w:lvlJc w:val="left"/>
+      <w:pPr>
+        <w:tabs>
+          <w:tab w:val="num" w:pos="720"/>
+        </w:tabs>
+        <w:ind w:left="720" w:hanging="360"/>
+      </w:pPr>
+      <w:rPr>
+        <w:rFonts w:ascii="Symbol" w:hAnsi="Symbol" w:hint="default"/>
+        <w:sz w:val="20"/>
+      </w:rPr>
+    </w:lvl>
+    <w:lvl w:ilvl="1" w:tentative="1">
+      <w:start w:val="1"/>
+      <w:numFmt w:val="bullet"/>
+      <w:lvlText w:val="o"/>
+      <w:lvlJc w:val="left"/>
+      <w:pPr>
+        <w:tabs>
+          <w:tab w:val="num" w:pos="1440"/>
+        </w:tabs>
+        <w:ind w:left="1440" w:hanging="360"/>
+      </w:pPr>
+      <w:rPr>
+        <w:rFonts w:ascii="Courier New" w:hAnsi="Courier New" w:hint="default"/>
+        <w:sz w:val="20"/>
+      </w:rPr>
+    </w:lvl>
+    <w:lvl w:ilvl="2" w:tentative="1">
+      <w:start w:val="1"/>
+      <w:numFmt w:val="bullet"/>
+      <w:lvlText w:val=""/>
+      <w:lvlJc w:val="left"/>
+      <w:pPr>
+        <w:tabs>
+          <w:tab w:val="num" w:pos="2160"/>
+        </w:tabs>
+        <w:ind w:left="2160" w:hanging="360"/>
+      </w:pPr>
+      <w:rPr>
+        <w:rFonts w:ascii="Wingdings" w:hAnsi="Wingdings" w:hint="default"/>
+        <w:sz w:val="20"/>
+      </w:rPr>
+    </w:lvl>
+    <w:lvl w:ilvl="3" w:tentative="1">
+      <w:start w:val="1"/>
+      <w:numFmt w:val="bullet"/>
+      <w:lvlText w:val=""/>
+      <w:lvlJc w:val="left"/>
+      <w:pPr>
+        <w:tabs>
+          <w:tab w:val="num" w:pos="2880"/>
+        </w:tabs>
+        <w:ind w:left="2880" w:hanging="360"/>
+      </w:pPr>
+      <w:rPr>
+        <w:rFonts w:ascii="Wingdings" w:hAnsi="Wingdings" w:hint="default"/>
+        <w:sz w:val="20"/>
+      </w:rPr>
+    </w:lvl>
+    <w:lvl w:ilvl="4" w:tentative="1">
+      <w:start w:val="1"/>
+      <w:numFmt w:val="bullet"/>
+      <w:lvlText w:val=""/>
+      <w:lvlJc w:val="left"/>
+      <w:pPr>
+        <w:tabs>
+          <w:tab w:val="num" w:pos="3600"/>
+        </w:tabs>
+        <w:ind w:left="3600" w:hanging="360"/>
+      </w:pPr>
+      <w:rPr>
+        <w:rFonts w:ascii="Wingdings" w:hAnsi="Wingdings" w:hint="default"/>
+        <w:sz w:val="20"/>
+      </w:rPr>
+    </w:lvl>
+    <w:lvl w:ilvl="5" w:tentative="1">
+      <w:start w:val="1"/>
+      <w:numFmt w:val="bullet"/>
+      <w:lvlText w:val=""/>
+      <w:lvlJc w:val="left"/>
+      <w:pPr>
+        <w:tabs>
+          <w:tab w:val="num" w:pos="4320"/>
+        </w:tabs>
+        <w:ind w:left="4320" w:hanging="360"/>
+      </w:pPr>
+      <w:rPr>
+        <w:rFonts w:ascii="Wingdings" w:hAnsi="Wingdings" w:hint="default"/>
+        <w:sz w:val="20"/>
+      </w:rPr>
+    </w:lvl>
+    <w:lvl w:ilvl="6" w:tentative="1">
+      <w:start w:val="1"/>
+      <w:numFmt w:val="bullet"/>
+      <w:lvlText w:val=""/>
+      <w:lvlJc w:val="left"/>
+      <w:pPr>
+        <w:tabs>
+          <w:tab w:val="num" w:pos="5040"/>
+        </w:tabs>
+        <w:ind w:left="5040" w:hanging="360"/>
+      </w:pPr>
+      <w:rPr>
+        <w:rFonts w:ascii="Wingdings" w:hAnsi="Wingdings" w:hint="default"/>
+        <w:sz w:val="20"/>
+      </w:rPr>
+    </w:lvl>
+    <w:lvl w:ilvl="7" w:tentative="1">
+      <w:start w:val="1"/>
+      <w:numFmt w:val="bullet"/>
+      <w:lvlText w:val=""/>
+      <w:lvlJc w:val="left"/>
+      <w:pPr>
+        <w:tabs>
+          <w:tab w:val="num" w:pos="5760"/>
+        </w:tabs>
+        <w:ind w:left="5760" w:hanging="360"/>
+      </w:pPr>
+      <w:rPr>
+        <w:rFonts w:ascii="Wingdings" w:hAnsi="Wingdings" w:hint="default"/>
+        <w:sz w:val="20"/>
+      </w:rPr>
+    </w:lvl>
+    <w:lvl w:ilvl="8" w:tentative="1">
+      <w:start w:val="1"/>
+      <w:numFmt w:val="bullet"/>
+      <w:lvlText w:val=""/>
+      <w:lvlJc w:val="left"/>
+      <w:pPr>
+        <w:tabs>
+          <w:tab w:val="num" w:pos="6480"/>
+        </w:tabs>
+        <w:ind w:left="6480" w:hanging="360"/>
+      </w:pPr>
+      <w:rPr>
+        <w:rFonts w:ascii="Wingdings" w:hAnsi="Wingdings" w:hint="default"/>
+        <w:sz w:val="20"/>
+      </w:rPr>
+    </w:lvl>
+  </w:abstractNum>
+  <w:abstractNum w:abstractNumId="8" w15:restartNumberingAfterBreak="0">
+    <w:nsid w:val="6D6C0A18"/>
+    <w:multiLevelType w:val="multilevel"/>
+    <w:tmpl w:val="B71403FE"/>
+    <w:lvl w:ilvl="0">
+      <w:start w:val="1"/>
+      <w:numFmt w:val="bullet"/>
+      <w:lvlText w:val=""/>
+      <w:lvlJc w:val="left"/>
+      <w:pPr>
+        <w:tabs>
+          <w:tab w:val="num" w:pos="720"/>
+        </w:tabs>
+        <w:ind w:left="720" w:hanging="360"/>
+      </w:pPr>
+      <w:rPr>
+        <w:rFonts w:ascii="Symbol" w:hAnsi="Symbol" w:hint="default"/>
+        <w:sz w:val="20"/>
+      </w:rPr>
+    </w:lvl>
+    <w:lvl w:ilvl="1" w:tentative="1">
+      <w:start w:val="1"/>
+      <w:numFmt w:val="bullet"/>
+      <w:lvlText w:val="o"/>
+      <w:lvlJc w:val="left"/>
+      <w:pPr>
+        <w:tabs>
+          <w:tab w:val="num" w:pos="1440"/>
+        </w:tabs>
+        <w:ind w:left="1440" w:hanging="360"/>
+      </w:pPr>
+      <w:rPr>
+        <w:rFonts w:ascii="Courier New" w:hAnsi="Courier New" w:hint="default"/>
+        <w:sz w:val="20"/>
+      </w:rPr>
+    </w:lvl>
+    <w:lvl w:ilvl="2" w:tentative="1">
+      <w:start w:val="1"/>
+      <w:numFmt w:val="bullet"/>
+      <w:lvlText w:val=""/>
+      <w:lvlJc w:val="left"/>
+      <w:pPr>
+        <w:tabs>
+          <w:tab w:val="num" w:pos="2160"/>
+        </w:tabs>
+        <w:ind w:left="2160" w:hanging="360"/>
+      </w:pPr>
+      <w:rPr>
+        <w:rFonts w:ascii="Wingdings" w:hAnsi="Wingdings" w:hint="default"/>
+        <w:sz w:val="20"/>
+      </w:rPr>
+    </w:lvl>
+    <w:lvl w:ilvl="3" w:tentative="1">
+      <w:start w:val="1"/>
+      <w:numFmt w:val="bullet"/>
+      <w:lvlText w:val=""/>
+      <w:lvlJc w:val="left"/>
+      <w:pPr>
+        <w:tabs>
+          <w:tab w:val="num" w:pos="2880"/>
+        </w:tabs>
+        <w:ind w:left="2880" w:hanging="360"/>
+      </w:pPr>
+      <w:rPr>
+        <w:rFonts w:ascii="Wingdings" w:hAnsi="Wingdings" w:hint="default"/>
+        <w:sz w:val="20"/>
+      </w:rPr>
+    </w:lvl>
+    <w:lvl w:ilvl="4" w:tentative="1">
+      <w:start w:val="1"/>
+      <w:numFmt w:val="bullet"/>
+      <w:lvlText w:val=""/>
+      <w:lvlJc w:val="left"/>
+      <w:pPr>
+        <w:tabs>
+          <w:tab w:val="num" w:pos="3600"/>
+        </w:tabs>
+        <w:ind w:left="3600" w:hanging="360"/>
+      </w:pPr>
+      <w:rPr>
+        <w:rFonts w:ascii="Wingdings" w:hAnsi="Wingdings" w:hint="default"/>
+        <w:sz w:val="20"/>
+      </w:rPr>
+    </w:lvl>
+    <w:lvl w:ilvl="5" w:tentative="1">
+      <w:start w:val="1"/>
+      <w:numFmt w:val="bullet"/>
+      <w:lvlText w:val=""/>
+      <w:lvlJc w:val="left"/>
+      <w:pPr>
+        <w:tabs>
+          <w:tab w:val="num" w:pos="4320"/>
+        </w:tabs>
+        <w:ind w:left="4320" w:hanging="360"/>
+      </w:pPr>
+      <w:rPr>
+        <w:rFonts w:ascii="Wingdings" w:hAnsi="Wingdings" w:hint="default"/>
+        <w:sz w:val="20"/>
+      </w:rPr>
+    </w:lvl>
+    <w:lvl w:ilvl="6" w:tentative="1">
+      <w:start w:val="1"/>
+      <w:numFmt w:val="bullet"/>
+      <w:lvlText w:val=""/>
+      <w:lvlJc w:val="left"/>
+      <w:pPr>
+        <w:tabs>
+          <w:tab w:val="num" w:pos="5040"/>
+        </w:tabs>
+        <w:ind w:left="5040" w:hanging="360"/>
+      </w:pPr>
+      <w:rPr>
+        <w:rFonts w:ascii="Wingdings" w:hAnsi="Wingdings" w:hint="default"/>
+        <w:sz w:val="20"/>
+      </w:rPr>
+    </w:lvl>
+    <w:lvl w:ilvl="7" w:tentative="1">
+      <w:start w:val="1"/>
+      <w:numFmt w:val="bullet"/>
+      <w:lvlText w:val=""/>
+      <w:lvlJc w:val="left"/>
+      <w:pPr>
+        <w:tabs>
+          <w:tab w:val="num" w:pos="5760"/>
+        </w:tabs>
+        <w:ind w:left="5760" w:hanging="360"/>
+      </w:pPr>
+      <w:rPr>
+        <w:rFonts w:ascii="Wingdings" w:hAnsi="Wingdings" w:hint="default"/>
+        <w:sz w:val="20"/>
+      </w:rPr>
+    </w:lvl>
+    <w:lvl w:ilvl="8" w:tentative="1">
+      <w:start w:val="1"/>
+      <w:numFmt w:val="bullet"/>
+      <w:lvlText w:val=""/>
+      <w:lvlJc w:val="left"/>
+      <w:pPr>
+        <w:tabs>
+          <w:tab w:val="num" w:pos="6480"/>
+        </w:tabs>
+        <w:ind w:left="6480" w:hanging="360"/>
+      </w:pPr>
+      <w:rPr>
+        <w:rFonts w:ascii="Wingdings" w:hAnsi="Wingdings" w:hint="default"/>
+        <w:sz w:val="20"/>
+      </w:rPr>
+    </w:lvl>
+  </w:abstractNum>
   <w:num w:numId="1" w16cid:durableId="535705189">
-    <w:abstractNumId w:val="4"/>
+    <w:abstractNumId w:val="6"/>
   </w:num>
   <w:num w:numId="2" w16cid:durableId="1425224731">
     <w:abstractNumId w:val="0"/>
   </w:num>
   <w:num w:numId="3" w16cid:durableId="801382186">
-    <w:abstractNumId w:val="2"/>
+    <w:abstractNumId w:val="3"/>
   </w:num>
   <w:num w:numId="4" w16cid:durableId="1367218210">
-    <w:abstractNumId w:val="3"/>
+    <w:abstractNumId w:val="5"/>
   </w:num>
   <w:num w:numId="5" w16cid:durableId="1493332256">
     <w:abstractNumId w:val="1"/>
+  </w:num>
+  <w:num w:numId="6" w16cid:durableId="1064186083">
+    <w:abstractNumId w:val="8"/>
+  </w:num>
+  <w:num w:numId="7" w16cid:durableId="500589328">
+    <w:abstractNumId w:val="4"/>
+  </w:num>
+  <w:num w:numId="8" w16cid:durableId="156071015">
+    <w:abstractNumId w:val="2"/>
+  </w:num>
+  <w:num w:numId="9" w16cid:durableId="1141386655">
+    <w:abstractNumId w:val="7"/>
   </w:num>
 </w:numbering>
 </file>
@@ -2243,7 +5678,6 @@
   <w:style w:type="character" w:default="1" w:styleId="DefaultParagraphFont">
     <w:name w:val="Default Paragraph Font"/>
     <w:uiPriority w:val="1"/>
-    <w:semiHidden/>
     <w:unhideWhenUsed/>
   </w:style>
   <w:style w:type="table" w:default="1" w:styleId="TableNormal">
@@ -2557,6 +5991,132 @@
       <w:spacing w:val="5"/>
     </w:rPr>
   </w:style>
+  <w:style w:type="table" w:styleId="TableGridLight">
+    <w:name w:val="Grid Table Light"/>
+    <w:basedOn w:val="TableNormal"/>
+    <w:uiPriority w:val="40"/>
+    <w:rsid w:val="009A2CB2"/>
+    <w:pPr>
+      <w:spacing w:after="0" w:line="240" w:lineRule="auto"/>
+    </w:pPr>
+    <w:tblPr>
+      <w:tblBorders>
+        <w:top w:val="single" w:sz="4" w:space="0" w:color="BFBFBF" w:themeColor="background1" w:themeShade="BF"/>
+        <w:left w:val="single" w:sz="4" w:space="0" w:color="BFBFBF" w:themeColor="background1" w:themeShade="BF"/>
+        <w:bottom w:val="single" w:sz="4" w:space="0" w:color="BFBFBF" w:themeColor="background1" w:themeShade="BF"/>
+        <w:right w:val="single" w:sz="4" w:space="0" w:color="BFBFBF" w:themeColor="background1" w:themeShade="BF"/>
+        <w:insideH w:val="single" w:sz="4" w:space="0" w:color="BFBFBF" w:themeColor="background1" w:themeShade="BF"/>
+        <w:insideV w:val="single" w:sz="4" w:space="0" w:color="BFBFBF" w:themeColor="background1" w:themeShade="BF"/>
+      </w:tblBorders>
+    </w:tblPr>
+  </w:style>
+  <w:style w:type="table" w:styleId="PlainTable1">
+    <w:name w:val="Plain Table 1"/>
+    <w:basedOn w:val="TableNormal"/>
+    <w:uiPriority w:val="41"/>
+    <w:rsid w:val="009A2CB2"/>
+    <w:pPr>
+      <w:spacing w:after="0" w:line="240" w:lineRule="auto"/>
+    </w:pPr>
+    <w:tblPr>
+      <w:tblStyleRowBandSize w:val="1"/>
+      <w:tblStyleColBandSize w:val="1"/>
+      <w:tblBorders>
+        <w:top w:val="single" w:sz="4" w:space="0" w:color="BFBFBF" w:themeColor="background1" w:themeShade="BF"/>
+        <w:left w:val="single" w:sz="4" w:space="0" w:color="BFBFBF" w:themeColor="background1" w:themeShade="BF"/>
+        <w:bottom w:val="single" w:sz="4" w:space="0" w:color="BFBFBF" w:themeColor="background1" w:themeShade="BF"/>
+        <w:right w:val="single" w:sz="4" w:space="0" w:color="BFBFBF" w:themeColor="background1" w:themeShade="BF"/>
+        <w:insideH w:val="single" w:sz="4" w:space="0" w:color="BFBFBF" w:themeColor="background1" w:themeShade="BF"/>
+        <w:insideV w:val="single" w:sz="4" w:space="0" w:color="BFBFBF" w:themeColor="background1" w:themeShade="BF"/>
+      </w:tblBorders>
+    </w:tblPr>
+    <w:tblStylePr w:type="firstRow">
+      <w:rPr>
+        <w:b/>
+        <w:bCs/>
+      </w:rPr>
+    </w:tblStylePr>
+    <w:tblStylePr w:type="lastRow">
+      <w:rPr>
+        <w:b/>
+        <w:bCs/>
+      </w:rPr>
+      <w:tblPr/>
+      <w:tcPr>
+        <w:tcBorders>
+          <w:top w:val="double" w:sz="4" w:space="0" w:color="BFBFBF" w:themeColor="background1" w:themeShade="BF"/>
+        </w:tcBorders>
+      </w:tcPr>
+    </w:tblStylePr>
+    <w:tblStylePr w:type="firstCol">
+      <w:rPr>
+        <w:b/>
+        <w:bCs/>
+      </w:rPr>
+    </w:tblStylePr>
+    <w:tblStylePr w:type="lastCol">
+      <w:rPr>
+        <w:b/>
+        <w:bCs/>
+      </w:rPr>
+    </w:tblStylePr>
+    <w:tblStylePr w:type="band1Vert">
+      <w:tblPr/>
+      <w:tcPr>
+        <w:shd w:val="clear" w:color="auto" w:fill="F2F2F2" w:themeFill="background1" w:themeFillShade="F2"/>
+      </w:tcPr>
+    </w:tblStylePr>
+    <w:tblStylePr w:type="band1Horz">
+      <w:tblPr/>
+      <w:tcPr>
+        <w:shd w:val="clear" w:color="auto" w:fill="F2F2F2" w:themeFill="background1" w:themeFillShade="F2"/>
+      </w:tcPr>
+    </w:tblStylePr>
+  </w:style>
+  <w:style w:type="paragraph" w:styleId="Header">
+    <w:name w:val="header"/>
+    <w:basedOn w:val="Normal"/>
+    <w:link w:val="HeaderChar"/>
+    <w:uiPriority w:val="99"/>
+    <w:unhideWhenUsed/>
+    <w:rsid w:val="000314D5"/>
+    <w:pPr>
+      <w:tabs>
+        <w:tab w:val="center" w:pos="4680"/>
+        <w:tab w:val="right" w:pos="9360"/>
+      </w:tabs>
+      <w:spacing w:after="0" w:line="240" w:lineRule="auto"/>
+    </w:pPr>
+  </w:style>
+  <w:style w:type="character" w:customStyle="1" w:styleId="HeaderChar">
+    <w:name w:val="Header Char"/>
+    <w:basedOn w:val="DefaultParagraphFont"/>
+    <w:link w:val="Header"/>
+    <w:uiPriority w:val="99"/>
+    <w:rsid w:val="000314D5"/>
+  </w:style>
+  <w:style w:type="paragraph" w:styleId="Footer">
+    <w:name w:val="footer"/>
+    <w:basedOn w:val="Normal"/>
+    <w:link w:val="FooterChar"/>
+    <w:uiPriority w:val="99"/>
+    <w:unhideWhenUsed/>
+    <w:rsid w:val="000314D5"/>
+    <w:pPr>
+      <w:tabs>
+        <w:tab w:val="center" w:pos="4680"/>
+        <w:tab w:val="right" w:pos="9360"/>
+      </w:tabs>
+      <w:spacing w:after="0" w:line="240" w:lineRule="auto"/>
+    </w:pPr>
+  </w:style>
+  <w:style w:type="character" w:customStyle="1" w:styleId="FooterChar">
+    <w:name w:val="Footer Char"/>
+    <w:basedOn w:val="DefaultParagraphFont"/>
+    <w:link w:val="Footer"/>
+    <w:uiPriority w:val="99"/>
+    <w:rsid w:val="000314D5"/>
+  </w:style>
 </w:styles>
 </file>
 

</xml_diff>